<commit_message>
Sync course project documents and record full regression results
</commit_message>
<xml_diff>
--- a/课程注册系统工作总结.docx
+++ b/课程注册系统工作总结.docx
@@ -6,39 +6,25 @@
       <w:pPr>
         <w:pStyle w:val="aa"/>
         <w:jc w:val="center"/>
-        <w:rPr>
-          <w:lang w:eastAsia="zh-CN"/>
-        </w:rPr>
       </w:pPr>
       <w:r>
-        <w:rPr>
-          <w:lang w:eastAsia="zh-CN"/>
-        </w:rPr>
         <w:t>课程注册系统工作总结</w:t>
       </w:r>
     </w:p>
     <w:p>
-      <w:pPr>
-        <w:rPr>
-          <w:lang w:eastAsia="zh-CN"/>
-        </w:rPr>
-      </w:pPr>
       <w:r>
-        <w:rPr>
-          <w:lang w:eastAsia="zh-CN"/>
-        </w:rPr>
-        <w:t>日期：</w:t>
+        <w:t>初稿日期：</w:t>
       </w:r>
       <w:r>
-        <w:rPr>
-          <w:lang w:eastAsia="zh-CN"/>
-        </w:rPr>
         <w:t>2026-10-12</w:t>
       </w:r>
       <w:r>
-        <w:rPr>
-          <w:lang w:eastAsia="zh-CN"/>
-        </w:rPr>
+        <w:t>；当前项目同步日期：</w:t>
+      </w:r>
+      <w:r>
+        <w:t>2026-10-13</w:t>
+      </w:r>
+      <w:r>
         <w:t>。</w:t>
       </w:r>
     </w:p>
@@ -46,7 +32,6 @@
       <w:pPr>
         <w:spacing w:before="280" w:after="200"/>
       </w:pPr>
-      <w:proofErr w:type="spellStart"/>
       <w:r>
         <w:rPr>
           <w:b/>
@@ -54,7 +39,6 @@
         </w:rPr>
         <w:t>目录</w:t>
       </w:r>
-      <w:proofErr w:type="spellEnd"/>
     </w:p>
     <w:p>
       <w:pPr>
@@ -81,7 +65,7 @@
       <w:r>
         <w:fldChar w:fldCharType="separate"/>
       </w:r>
-      <w:hyperlink w:anchor="_Toc242739510" w:history="1">
+      <w:hyperlink w:anchor="_Toc242825460" w:history="1">
         <w:r>
           <w:rPr>
             <w:rStyle w:val="aff9"/>
@@ -125,7 +109,7 @@
             <w:noProof/>
             <w:webHidden/>
           </w:rPr>
-          <w:instrText>PAGEREF _Toc242739510 \h</w:instrText>
+          <w:instrText>PAGEREF _Toc242825460 \h</w:instrText>
         </w:r>
         <w:r>
           <w:rPr>
@@ -183,7 +167,7 @@
           <w14:ligatures w14:val="standardContextual"/>
         </w:rPr>
       </w:pPr>
-      <w:hyperlink w:anchor="_Toc242739511" w:history="1">
+      <w:hyperlink w:anchor="_Toc242825461" w:history="1">
         <w:r>
           <w:rPr>
             <w:rStyle w:val="aff9"/>
@@ -227,7 +211,7 @@
             <w:noProof/>
             <w:webHidden/>
           </w:rPr>
-          <w:instrText>PAGEREF _Toc242739511 \h</w:instrText>
+          <w:instrText>PAGEREF _Toc242825461 \h</w:instrText>
         </w:r>
         <w:r>
           <w:rPr>
@@ -285,7 +269,7 @@
           <w14:ligatures w14:val="standardContextual"/>
         </w:rPr>
       </w:pPr>
-      <w:hyperlink w:anchor="_Toc242739512" w:history="1">
+      <w:hyperlink w:anchor="_Toc242825462" w:history="1">
         <w:r>
           <w:rPr>
             <w:rStyle w:val="aff9"/>
@@ -329,7 +313,7 @@
             <w:noProof/>
             <w:webHidden/>
           </w:rPr>
-          <w:instrText>PAGEREF _Toc242739512 \h</w:instrText>
+          <w:instrText>PAGEREF _Toc242825462 \h</w:instrText>
         </w:r>
         <w:r>
           <w:rPr>
@@ -387,7 +371,7 @@
           <w14:ligatures w14:val="standardContextual"/>
         </w:rPr>
       </w:pPr>
-      <w:hyperlink w:anchor="_Toc242739513" w:history="1">
+      <w:hyperlink w:anchor="_Toc242825463" w:history="1">
         <w:r>
           <w:rPr>
             <w:rStyle w:val="aff9"/>
@@ -431,7 +415,7 @@
             <w:noProof/>
             <w:webHidden/>
           </w:rPr>
-          <w:instrText>PAGEREF _Toc242739513 \h</w:instrText>
+          <w:instrText>PAGEREF _Toc242825463 \h</w:instrText>
         </w:r>
         <w:r>
           <w:rPr>
@@ -489,7 +473,7 @@
           <w14:ligatures w14:val="standardContextual"/>
         </w:rPr>
       </w:pPr>
-      <w:hyperlink w:anchor="_Toc242739514" w:history="1">
+      <w:hyperlink w:anchor="_Toc242825464" w:history="1">
         <w:r>
           <w:rPr>
             <w:rStyle w:val="aff9"/>
@@ -533,7 +517,7 @@
             <w:noProof/>
             <w:webHidden/>
           </w:rPr>
-          <w:instrText>PAGEREF _Toc242739514 \h</w:instrText>
+          <w:instrText>PAGEREF _Toc242825464 \h</w:instrText>
         </w:r>
         <w:r>
           <w:rPr>
@@ -592,13 +576,27 @@
           <w14:ligatures w14:val="standardContextual"/>
         </w:rPr>
       </w:pPr>
-      <w:hyperlink w:anchor="_Toc242739515" w:history="1">
+      <w:hyperlink w:anchor="_Toc242825465" w:history="1">
         <w:r>
           <w:rPr>
             <w:rStyle w:val="aff9"/>
             <w:noProof/>
           </w:rPr>
           <w:t xml:space="preserve">5.1 </w:t>
+        </w:r>
+        <w:r>
+          <w:rPr>
+            <w:rStyle w:val="aff9"/>
+            <w:noProof/>
+          </w:rPr>
+          <w:t>成员</w:t>
+        </w:r>
+        <w:r>
+          <w:rPr>
+            <w:rStyle w:val="aff9"/>
+            <w:noProof/>
+          </w:rPr>
+          <w:t xml:space="preserve">1 </w:t>
         </w:r>
         <w:r>
           <w:rPr>
@@ -636,7 +634,7 @@
             <w:noProof/>
             <w:webHidden/>
           </w:rPr>
-          <w:instrText>PAGEREF _Toc242739515 \h</w:instrText>
+          <w:instrText>PAGEREF _Toc242825465 \h</w:instrText>
         </w:r>
         <w:r>
           <w:rPr>
@@ -695,13 +693,27 @@
           <w14:ligatures w14:val="standardContextual"/>
         </w:rPr>
       </w:pPr>
-      <w:hyperlink w:anchor="_Toc242739516" w:history="1">
+      <w:hyperlink w:anchor="_Toc242825466" w:history="1">
         <w:r>
           <w:rPr>
             <w:rStyle w:val="aff9"/>
             <w:noProof/>
           </w:rPr>
           <w:t xml:space="preserve">5.2 </w:t>
+        </w:r>
+        <w:r>
+          <w:rPr>
+            <w:rStyle w:val="aff9"/>
+            <w:noProof/>
+          </w:rPr>
+          <w:t>成员</w:t>
+        </w:r>
+        <w:r>
+          <w:rPr>
+            <w:rStyle w:val="aff9"/>
+            <w:noProof/>
+          </w:rPr>
+          <w:t xml:space="preserve">2 </w:t>
         </w:r>
         <w:r>
           <w:rPr>
@@ -739,7 +751,7 @@
             <w:noProof/>
             <w:webHidden/>
           </w:rPr>
-          <w:instrText>PAGEREF _Toc242739516 \h</w:instrText>
+          <w:instrText>PAGEREF _Toc242825466 \h</w:instrText>
         </w:r>
         <w:r>
           <w:rPr>
@@ -798,13 +810,27 @@
           <w14:ligatures w14:val="standardContextual"/>
         </w:rPr>
       </w:pPr>
-      <w:hyperlink w:anchor="_Toc242739517" w:history="1">
+      <w:hyperlink w:anchor="_Toc242825467" w:history="1">
         <w:r>
           <w:rPr>
             <w:rStyle w:val="aff9"/>
             <w:noProof/>
           </w:rPr>
           <w:t xml:space="preserve">5.3 </w:t>
+        </w:r>
+        <w:r>
+          <w:rPr>
+            <w:rStyle w:val="aff9"/>
+            <w:noProof/>
+          </w:rPr>
+          <w:t>成员</w:t>
+        </w:r>
+        <w:r>
+          <w:rPr>
+            <w:rStyle w:val="aff9"/>
+            <w:noProof/>
+          </w:rPr>
+          <w:t xml:space="preserve">3 </w:t>
         </w:r>
         <w:r>
           <w:rPr>
@@ -842,7 +868,7 @@
             <w:noProof/>
             <w:webHidden/>
           </w:rPr>
-          <w:instrText>PAGEREF _Toc242739517 \h</w:instrText>
+          <w:instrText>PAGEREF _Toc242825467 \h</w:instrText>
         </w:r>
         <w:r>
           <w:rPr>
@@ -901,13 +927,27 @@
           <w14:ligatures w14:val="standardContextual"/>
         </w:rPr>
       </w:pPr>
-      <w:hyperlink w:anchor="_Toc242739518" w:history="1">
+      <w:hyperlink w:anchor="_Toc242825468" w:history="1">
         <w:r>
           <w:rPr>
             <w:rStyle w:val="aff9"/>
             <w:noProof/>
           </w:rPr>
           <w:t xml:space="preserve">5.4 </w:t>
+        </w:r>
+        <w:r>
+          <w:rPr>
+            <w:rStyle w:val="aff9"/>
+            <w:noProof/>
+          </w:rPr>
+          <w:t>成员</w:t>
+        </w:r>
+        <w:r>
+          <w:rPr>
+            <w:rStyle w:val="aff9"/>
+            <w:noProof/>
+          </w:rPr>
+          <w:t xml:space="preserve">4 </w:t>
         </w:r>
         <w:r>
           <w:rPr>
@@ -945,7 +985,7 @@
             <w:noProof/>
             <w:webHidden/>
           </w:rPr>
-          <w:instrText>PAGEREF _Toc242739518 \h</w:instrText>
+          <w:instrText>PAGEREF _Toc242825468 \h</w:instrText>
         </w:r>
         <w:r>
           <w:rPr>
@@ -1004,7 +1044,7 @@
           <w14:ligatures w14:val="standardContextual"/>
         </w:rPr>
       </w:pPr>
-      <w:hyperlink w:anchor="_Toc242739519" w:history="1">
+      <w:hyperlink w:anchor="_Toc242825469" w:history="1">
         <w:r>
           <w:rPr>
             <w:rStyle w:val="aff9"/>
@@ -1048,7 +1088,109 @@
             <w:noProof/>
             <w:webHidden/>
           </w:rPr>
-          <w:instrText>PAGEREF _Toc242739519 \h</w:instrText>
+          <w:instrText>PAGEREF _Toc242825469 \h</w:instrText>
+        </w:r>
+        <w:r>
+          <w:rPr>
+            <w:rFonts w:hint="eastAsia"/>
+            <w:noProof/>
+            <w:webHidden/>
+          </w:rPr>
+          <w:instrText xml:space="preserve"> </w:instrText>
+        </w:r>
+        <w:r>
+          <w:rPr>
+            <w:rFonts w:hint="eastAsia"/>
+            <w:noProof/>
+            <w:webHidden/>
+          </w:rPr>
+        </w:r>
+        <w:r>
+          <w:rPr>
+            <w:rFonts w:hint="eastAsia"/>
+            <w:noProof/>
+            <w:webHidden/>
+          </w:rPr>
+          <w:fldChar w:fldCharType="separate"/>
+        </w:r>
+        <w:r>
+          <w:rPr>
+            <w:noProof/>
+            <w:webHidden/>
+          </w:rPr>
+          <w:t>5</w:t>
+        </w:r>
+        <w:r>
+          <w:rPr>
+            <w:rFonts w:hint="eastAsia"/>
+            <w:noProof/>
+            <w:webHidden/>
+          </w:rPr>
+          <w:fldChar w:fldCharType="end"/>
+        </w:r>
+      </w:hyperlink>
+    </w:p>
+    <w:p>
+      <w:pPr>
+        <w:pStyle w:val="TOC1"/>
+        <w:tabs>
+          <w:tab w:val="right" w:leader="dot" w:pos="9628"/>
+        </w:tabs>
+        <w:rPr>
+          <w:rFonts w:asciiTheme="minorHAnsi" w:eastAsiaTheme="minorEastAsia" w:hAnsiTheme="minorHAnsi"/>
+          <w:noProof/>
+          <w:color w:val="auto"/>
+          <w:kern w:val="2"/>
+          <w:szCs w:val="24"/>
+          <w:lang w:eastAsia="zh-CN"/>
+          <w14:ligatures w14:val="standardContextual"/>
+        </w:rPr>
+      </w:pPr>
+      <w:hyperlink w:anchor="_Toc242825470" w:history="1">
+        <w:r>
+          <w:rPr>
+            <w:rStyle w:val="aff9"/>
+            <w:noProof/>
+          </w:rPr>
+          <w:t xml:space="preserve">6 </w:t>
+        </w:r>
+        <w:r>
+          <w:rPr>
+            <w:rStyle w:val="aff9"/>
+            <w:noProof/>
+          </w:rPr>
+          <w:t>当前版本补充</w:t>
+        </w:r>
+        <w:r>
+          <w:rPr>
+            <w:rFonts w:hint="eastAsia"/>
+            <w:noProof/>
+            <w:webHidden/>
+          </w:rPr>
+          <w:tab/>
+        </w:r>
+        <w:r>
+          <w:rPr>
+            <w:rFonts w:hint="eastAsia"/>
+            <w:noProof/>
+            <w:webHidden/>
+          </w:rPr>
+          <w:fldChar w:fldCharType="begin"/>
+        </w:r>
+        <w:r>
+          <w:rPr>
+            <w:rFonts w:hint="eastAsia"/>
+            <w:noProof/>
+            <w:webHidden/>
+          </w:rPr>
+          <w:instrText xml:space="preserve"> </w:instrText>
+        </w:r>
+        <w:r>
+          <w:rPr>
+            <w:noProof/>
+            <w:webHidden/>
+          </w:rPr>
+          <w:instrText>PAGEREF _Toc242825470 \h</w:instrText>
         </w:r>
         <w:r>
           <w:rPr>
@@ -1103,135 +1245,71 @@
     <w:p>
       <w:pPr>
         <w:pStyle w:val="1"/>
-        <w:rPr>
-          <w:lang w:eastAsia="zh-CN"/>
-        </w:rPr>
       </w:pPr>
       <w:bookmarkStart w:id="0" w:name="h_2d27fac8cbdecbcea690"/>
-      <w:bookmarkStart w:id="1" w:name="_Toc242739510"/>
+      <w:bookmarkStart w:id="1" w:name="_Toc242825460"/>
       <w:r>
-        <w:rPr>
-          <w:lang w:eastAsia="zh-CN"/>
-        </w:rPr>
         <w:lastRenderedPageBreak/>
         <w:t xml:space="preserve">1 </w:t>
       </w:r>
       <w:r>
-        <w:rPr>
-          <w:lang w:eastAsia="zh-CN"/>
-        </w:rPr>
         <w:t>项目完成情况</w:t>
       </w:r>
       <w:bookmarkEnd w:id="0"/>
       <w:bookmarkEnd w:id="1"/>
     </w:p>
     <w:p>
-      <w:pPr>
-        <w:rPr>
-          <w:lang w:eastAsia="zh-CN"/>
-        </w:rPr>
-      </w:pPr>
       <w:r>
-        <w:rPr>
-          <w:lang w:eastAsia="zh-CN"/>
-        </w:rPr>
         <w:t>本项目使用</w:t>
       </w:r>
       <w:r>
-        <w:rPr>
-          <w:lang w:eastAsia="zh-CN"/>
-        </w:rPr>
         <w:t>PHP</w:t>
       </w:r>
       <w:r>
-        <w:rPr>
-          <w:lang w:eastAsia="zh-CN"/>
-        </w:rPr>
         <w:t>和</w:t>
       </w:r>
       <w:r>
-        <w:rPr>
-          <w:lang w:eastAsia="zh-CN"/>
-        </w:rPr>
         <w:t>MySQL</w:t>
       </w:r>
       <w:r>
-        <w:rPr>
-          <w:lang w:eastAsia="zh-CN"/>
-        </w:rPr>
         <w:t>实现课程注册系统，围绕学生选课、教师授课和教务管理三个方面展开。学生可以查询课程，提交</w:t>
       </w:r>
       <w:r>
-        <w:rPr>
-          <w:lang w:eastAsia="zh-CN"/>
-        </w:rPr>
-        <w:t>4</w:t>
+        <w:t>0–4</w:t>
       </w:r>
       <w:r>
-        <w:rPr>
-          <w:lang w:eastAsia="zh-CN"/>
-        </w:rPr>
         <w:t>个首选和</w:t>
       </w:r>
       <w:r>
-        <w:rPr>
-          <w:lang w:eastAsia="zh-CN"/>
-        </w:rPr>
-        <w:t>2</w:t>
+        <w:t>0–2</w:t>
       </w:r>
       <w:r>
-        <w:rPr>
-          <w:lang w:eastAsia="zh-CN"/>
-        </w:rPr>
-        <w:t>个备选，保存草稿、退课，并查看课表和成绩；教师可以认领教学班、查看学生名单和维护成绩；教务员可以维护人员资料、管理任教资格，并在选课截止后执行关课。</w:t>
+        <w:t>个备选，保存草稿、退课，并查看课表和成绩；教师可以认领教学班、查看学生名单和维护成绩；教务员可以维护人员资料、管理任教资格，并在无有效学生选课会话时执行关课。</w:t>
       </w:r>
     </w:p>
     <w:p>
-      <w:pPr>
-        <w:rPr>
-          <w:lang w:eastAsia="zh-CN"/>
-        </w:rPr>
-      </w:pPr>
       <w:r>
-        <w:rPr>
-          <w:lang w:eastAsia="zh-CN"/>
-        </w:rPr>
         <w:t>系统通过数据库保存账号、选课、任教和成绩等记录，使不同角色能够查询到一致的业务结果。除主要功能外，还提供了演示数据、模拟计费和只读课程目录。配置和启动方法见</w:t>
       </w:r>
       <w:hyperlink r:id="rId8">
         <w:r>
-          <w:rPr>
-            <w:lang w:eastAsia="zh-CN"/>
-          </w:rPr>
           <w:t>README</w:t>
         </w:r>
       </w:hyperlink>
       <w:r>
-        <w:rPr>
-          <w:lang w:eastAsia="zh-CN"/>
-        </w:rPr>
         <w:t>。</w:t>
       </w:r>
     </w:p>
     <w:p>
       <w:pPr>
         <w:pStyle w:val="1"/>
-        <w:rPr>
-          <w:lang w:eastAsia="zh-CN"/>
-        </w:rPr>
       </w:pPr>
       <w:bookmarkStart w:id="2" w:name="h_8d71bb3dd4cecc93ea1c"/>
-      <w:bookmarkStart w:id="3" w:name="_Toc242739511"/>
+      <w:bookmarkStart w:id="3" w:name="_Toc242825461"/>
       <w:r>
-        <w:rPr>
-          <w:lang w:eastAsia="zh-CN"/>
-        </w:rPr>
         <w:t xml:space="preserve">2 </w:t>
       </w:r>
       <w:r>
-        <w:rPr>
-          <w:lang w:eastAsia="zh-CN"/>
-        </w:rPr>
         <w:t>主要问题及解决方法</w:t>
       </w:r>
       <w:bookmarkEnd w:id="2"/>
@@ -1240,14 +1318,8 @@
     <w:p>
       <w:pPr>
         <w:keepNext/>
-        <w:rPr>
-          <w:lang w:eastAsia="zh-CN"/>
-        </w:rPr>
       </w:pPr>
       <w:r>
-        <w:rPr>
-          <w:lang w:eastAsia="zh-CN"/>
-        </w:rPr>
         <w:t>选课和关课涉及多个数据表，仅修改页面显示无法保证结果正确。开发中重点处理了名额分配、备选补位和数据关联问题。</w:t>
       </w:r>
     </w:p>
@@ -1294,14 +1366,12 @@
               <w:keepNext/>
               <w:jc w:val="center"/>
             </w:pPr>
-            <w:proofErr w:type="spellStart"/>
             <w:r>
               <w:rPr>
                 <w:b/>
               </w:rPr>
               <w:t>问题</w:t>
             </w:r>
-            <w:proofErr w:type="spellEnd"/>
           </w:p>
         </w:tc>
         <w:tc>
@@ -1315,14 +1385,12 @@
               <w:pStyle w:val="TableText"/>
               <w:keepNext/>
             </w:pPr>
-            <w:proofErr w:type="spellStart"/>
             <w:r>
               <w:rPr>
                 <w:b/>
               </w:rPr>
               <w:t>解决方法</w:t>
             </w:r>
-            <w:proofErr w:type="spellEnd"/>
           </w:p>
         </w:tc>
       </w:tr>
@@ -1339,14 +1407,8 @@
           <w:p>
             <w:pPr>
               <w:pStyle w:val="TableText"/>
-              <w:rPr>
-                <w:lang w:eastAsia="zh-CN"/>
-              </w:rPr>
             </w:pPr>
             <w:r>
-              <w:rPr>
-                <w:lang w:eastAsia="zh-CN"/>
-              </w:rPr>
               <w:t>多名学生同时选择最后一个名额，可能造成人数超限</w:t>
             </w:r>
           </w:p>
@@ -1359,14 +1421,8 @@
           <w:p>
             <w:pPr>
               <w:pStyle w:val="TableText"/>
-              <w:rPr>
-                <w:lang w:eastAsia="zh-CN"/>
-              </w:rPr>
             </w:pPr>
             <w:r>
-              <w:rPr>
-                <w:lang w:eastAsia="zh-CN"/>
-              </w:rPr>
               <w:t>保存前锁定教学班并读取最新人数，名额不足时拒绝整个方案</w:t>
             </w:r>
           </w:p>
@@ -1385,14 +1441,8 @@
           <w:p>
             <w:pPr>
               <w:pStyle w:val="TableText"/>
-              <w:rPr>
-                <w:lang w:eastAsia="zh-CN"/>
-              </w:rPr>
             </w:pPr>
             <w:r>
-              <w:rPr>
-                <w:lang w:eastAsia="zh-CN"/>
-              </w:rPr>
               <w:t>学生退课后出现空缺，关课时未补齐</w:t>
             </w:r>
           </w:p>
@@ -1405,14 +1455,8 @@
           <w:p>
             <w:pPr>
               <w:pStyle w:val="TableText"/>
-              <w:rPr>
-                <w:lang w:eastAsia="zh-CN"/>
-              </w:rPr>
             </w:pPr>
             <w:r>
-              <w:rPr>
-                <w:lang w:eastAsia="zh-CN"/>
-              </w:rPr>
               <w:t>根据学生保存的方案和备选顺序检查空缺，尝试安排可用教学班</w:t>
             </w:r>
           </w:p>
@@ -1431,26 +1475,14 @@
           <w:p>
             <w:pPr>
               <w:pStyle w:val="TableText"/>
-              <w:rPr>
-                <w:lang w:eastAsia="zh-CN"/>
-              </w:rPr>
             </w:pPr>
             <w:r>
-              <w:rPr>
-                <w:lang w:eastAsia="zh-CN"/>
-              </w:rPr>
               <w:t>不足</w:t>
             </w:r>
             <w:r>
-              <w:rPr>
-                <w:lang w:eastAsia="zh-CN"/>
-              </w:rPr>
               <w:t>3</w:t>
             </w:r>
             <w:r>
-              <w:rPr>
-                <w:lang w:eastAsia="zh-CN"/>
-              </w:rPr>
               <w:t>人的教学班在补位前被停开</w:t>
             </w:r>
           </w:p>
@@ -1463,14 +1495,8 @@
           <w:p>
             <w:pPr>
               <w:pStyle w:val="TableText"/>
-              <w:rPr>
-                <w:lang w:eastAsia="zh-CN"/>
-              </w:rPr>
             </w:pPr>
             <w:r>
-              <w:rPr>
-                <w:lang w:eastAsia="zh-CN"/>
-              </w:rPr>
               <w:t>先尝试补位，再判断是否达到最低开班人数</w:t>
             </w:r>
           </w:p>
@@ -1489,14 +1515,8 @@
           <w:p>
             <w:pPr>
               <w:pStyle w:val="TableText"/>
-              <w:rPr>
-                <w:lang w:eastAsia="zh-CN"/>
-              </w:rPr>
             </w:pPr>
             <w:r>
-              <w:rPr>
-                <w:lang w:eastAsia="zh-CN"/>
-              </w:rPr>
               <w:t>无上课时间的教学班无法检查任教冲突</w:t>
             </w:r>
           </w:p>
@@ -1509,14 +1529,8 @@
           <w:p>
             <w:pPr>
               <w:pStyle w:val="TableText"/>
-              <w:rPr>
-                <w:lang w:eastAsia="zh-CN"/>
-              </w:rPr>
             </w:pPr>
             <w:r>
-              <w:rPr>
-                <w:lang w:eastAsia="zh-CN"/>
-              </w:rPr>
               <w:t>拒绝认领，并提示课程时间缺失</w:t>
             </w:r>
           </w:p>
@@ -1535,14 +1549,8 @@
           <w:p>
             <w:pPr>
               <w:pStyle w:val="TableText"/>
-              <w:rPr>
-                <w:lang w:eastAsia="zh-CN"/>
-              </w:rPr>
             </w:pPr>
             <w:r>
-              <w:rPr>
-                <w:lang w:eastAsia="zh-CN"/>
-              </w:rPr>
               <w:t>同一份人员资料被多次编辑，旧页面可能覆盖新内容</w:t>
             </w:r>
           </w:p>
@@ -1555,14 +1563,8 @@
           <w:p>
             <w:pPr>
               <w:pStyle w:val="TableText"/>
-              <w:rPr>
-                <w:lang w:eastAsia="zh-CN"/>
-              </w:rPr>
             </w:pPr>
             <w:r>
-              <w:rPr>
-                <w:lang w:eastAsia="zh-CN"/>
-              </w:rPr>
               <w:t>保存时比较资料版本，版本不一致则提示重新打开</w:t>
             </w:r>
           </w:p>
@@ -1581,14 +1583,8 @@
           <w:p>
             <w:pPr>
               <w:pStyle w:val="TableText"/>
-              <w:rPr>
-                <w:lang w:eastAsia="zh-CN"/>
-              </w:rPr>
             </w:pPr>
             <w:r>
-              <w:rPr>
-                <w:lang w:eastAsia="zh-CN"/>
-              </w:rPr>
               <w:t>删除人员可能破坏已有选课或任教关系</w:t>
             </w:r>
           </w:p>
@@ -1601,14 +1597,8 @@
           <w:p>
             <w:pPr>
               <w:pStyle w:val="TableText"/>
-              <w:rPr>
-                <w:lang w:eastAsia="zh-CN"/>
-              </w:rPr>
             </w:pPr>
             <w:r>
-              <w:rPr>
-                <w:lang w:eastAsia="zh-CN"/>
-              </w:rPr>
               <w:t>有业务关联时拒绝删除，需要限制登录时使用停用功能</w:t>
             </w:r>
           </w:p>
@@ -1618,308 +1608,186 @@
     <w:p>
       <w:pPr>
         <w:spacing w:after="60" w:line="40" w:lineRule="exact"/>
-        <w:rPr>
-          <w:lang w:eastAsia="zh-CN"/>
-        </w:rPr>
       </w:pPr>
     </w:p>
     <w:p>
-      <w:pPr>
-        <w:rPr>
-          <w:lang w:eastAsia="zh-CN"/>
-        </w:rPr>
-      </w:pPr>
       <w:r>
-        <w:rPr>
-          <w:lang w:eastAsia="zh-CN"/>
-        </w:rPr>
         <w:t>修改后分别检查正常操作和原有出错场景，并比较操作前后的数据库记录。问题处理和复测结果见</w:t>
       </w:r>
+      <w:hyperlink r:id="rId9">
+        <w:r>
+          <w:t>测试报告</w:t>
+        </w:r>
+      </w:hyperlink>
       <w:r>
-        <w:fldChar w:fldCharType="begin"/>
-      </w:r>
-      <w:r>
-        <w:rPr>
-          <w:lang w:eastAsia="zh-CN"/>
-        </w:rPr>
-        <w:instrText>HYPERLINK "</w:instrText>
-      </w:r>
-      <w:r>
-        <w:rPr>
-          <w:lang w:eastAsia="zh-CN"/>
-        </w:rPr>
-        <w:instrText>课程注册系统测试报告</w:instrText>
-      </w:r>
-      <w:r>
-        <w:rPr>
-          <w:lang w:eastAsia="zh-CN"/>
-        </w:rPr>
-        <w:instrText>.docx" \h</w:instrText>
-      </w:r>
-      <w:r>
-        <w:fldChar w:fldCharType="separate"/>
-      </w:r>
-      <w:r>
-        <w:rPr>
-          <w:lang w:eastAsia="zh-CN"/>
-        </w:rPr>
-        <w:t>测试报告</w:t>
-      </w:r>
-      <w:r>
-        <w:fldChar w:fldCharType="end"/>
-      </w:r>
-      <w:r>
-        <w:rPr>
-          <w:lang w:eastAsia="zh-CN"/>
-        </w:rPr>
         <w:t>。</w:t>
       </w:r>
     </w:p>
     <w:p>
       <w:pPr>
         <w:pStyle w:val="1"/>
-        <w:rPr>
-          <w:lang w:eastAsia="zh-CN"/>
-        </w:rPr>
       </w:pPr>
       <w:bookmarkStart w:id="4" w:name="h_4ad32647cdfabbff5030"/>
-      <w:bookmarkStart w:id="5" w:name="_Toc242739512"/>
+      <w:bookmarkStart w:id="5" w:name="_Toc242825462"/>
       <w:r>
-        <w:rPr>
-          <w:lang w:eastAsia="zh-CN"/>
-        </w:rPr>
         <w:t xml:space="preserve">3 </w:t>
       </w:r>
       <w:r>
-        <w:rPr>
-          <w:lang w:eastAsia="zh-CN"/>
-        </w:rPr>
         <w:t>测试结果与开发体会</w:t>
       </w:r>
       <w:bookmarkEnd w:id="4"/>
       <w:bookmarkEnd w:id="5"/>
     </w:p>
     <w:p>
-      <w:pPr>
-        <w:rPr>
-          <w:lang w:eastAsia="zh-CN"/>
-        </w:rPr>
-      </w:pPr>
       <w:r>
-        <w:rPr>
-          <w:lang w:eastAsia="zh-CN"/>
-        </w:rPr>
-        <w:t>自动回归共完成</w:t>
+        <w:t>2026</w:t>
       </w:r>
       <w:r>
-        <w:rPr>
-          <w:lang w:eastAsia="zh-CN"/>
-        </w:rPr>
+        <w:t>年</w:t>
+      </w:r>
+      <w:r>
+        <w:t>10</w:t>
+      </w:r>
+      <w:r>
+        <w:t>月</w:t>
+      </w:r>
+      <w:r>
+        <w:t>12</w:t>
+      </w:r>
+      <w:r>
+        <w:t>日历史回归完成</w:t>
+      </w:r>
+      <w:r>
         <w:t>29</w:t>
       </w:r>
       <w:r>
-        <w:rPr>
-          <w:lang w:eastAsia="zh-CN"/>
-        </w:rPr>
         <w:t>个阶段、</w:t>
       </w:r>
       <w:r>
-        <w:rPr>
-          <w:lang w:eastAsia="zh-CN"/>
-        </w:rPr>
         <w:t>847</w:t>
       </w:r>
       <w:r>
-        <w:rPr>
-          <w:lang w:eastAsia="zh-CN"/>
-        </w:rPr>
-        <w:t>条检查，结果全部通过。检查覆盖登录权限、课程查询、选退课、任教、成绩、人员管理、关课和数据库异常等场景。最后一个名额的竞争完成</w:t>
+        <w:t>条检查；</w:t>
       </w:r>
       <w:r>
-        <w:rPr>
-          <w:lang w:eastAsia="zh-CN"/>
-        </w:rPr>
-        <w:t>1</w:t>
+        <w:t>10</w:t>
       </w:r>
       <w:r>
-        <w:rPr>
-          <w:lang w:eastAsia="zh-CN"/>
-        </w:rPr>
+        <w:t>月</w:t>
+      </w:r>
+      <w:r>
+        <w:t>13</w:t>
+      </w:r>
+      <w:r>
+        <w:t>日业务版本完整回归完成</w:t>
+      </w:r>
+      <w:r>
+        <w:t>37</w:t>
+      </w:r>
+      <w:r>
+        <w:t>个阶段、</w:t>
+      </w:r>
+      <w:r>
+        <w:t>1037</w:t>
+      </w:r>
+      <w:r>
+        <w:t>项检查，全部通过。页面精简后另完成语法及</w:t>
+      </w:r>
+      <w:r>
+        <w:t>21</w:t>
+      </w:r>
+      <w:r>
+        <w:t>项前端检查，未重复完整回归。检查覆盖登录权限、课程查询、选退课、任教、成绩、人员管理、关课和数据库异常等场景。最新回归中最后一个名额的竞争完成</w:t>
+      </w:r>
+      <w:r>
+        <w:t>5</w:t>
+      </w:r>
+      <w:r>
         <w:t>轮验证，未出现超额分配。</w:t>
       </w:r>
     </w:p>
     <w:p>
-      <w:pPr>
-        <w:rPr>
-          <w:lang w:eastAsia="zh-CN"/>
-        </w:rPr>
-      </w:pPr>
       <w:r>
-        <w:rPr>
-          <w:lang w:eastAsia="zh-CN"/>
-        </w:rPr>
         <w:t>业务规则需要在页面、服务端和数据库之间保持一致。例如，页面可以提前提示重复课程，但提交时仍需重新检查数量、先修条件和剩余名额；选课和关课包含多项写入，应使用事务保证全部成功或全部撤销。</w:t>
       </w:r>
     </w:p>
     <w:p>
-      <w:pPr>
-        <w:rPr>
-          <w:lang w:eastAsia="zh-CN"/>
-        </w:rPr>
-      </w:pPr>
       <w:r>
-        <w:rPr>
-          <w:lang w:eastAsia="zh-CN"/>
-        </w:rPr>
         <w:t>选课页面通过定时查询更新名额，所选首选班满额时提示调整，并保留正在填写的内容。刷新只提供操作提示，正式提交仍由服务端检查最新人数。</w:t>
       </w:r>
     </w:p>
     <w:p>
-      <w:pPr>
-        <w:rPr>
-          <w:lang w:eastAsia="zh-CN"/>
-        </w:rPr>
-      </w:pPr>
       <w:r>
-        <w:rPr>
-          <w:lang w:eastAsia="zh-CN"/>
-        </w:rPr>
+        <w:lastRenderedPageBreak/>
         <w:t>测试不仅要检查操作能否成功，还要确认失败后数据没有发生部分变化。重复提交、取消操作、并发选课和数据库断连等场景，有助于发现正常演示中不容易暴露的问题。</w:t>
       </w:r>
     </w:p>
     <w:p>
-      <w:pPr>
-        <w:rPr>
-          <w:lang w:eastAsia="zh-CN"/>
-        </w:rPr>
-      </w:pPr>
       <w:r>
-        <w:rPr>
-          <w:lang w:eastAsia="zh-CN"/>
-        </w:rPr>
-        <w:lastRenderedPageBreak/>
-        <w:t>文档应准确说明规则的边界。例如，首选占用名额而备选不占用，截止时刻仍允许选课，关课只能在截止后进行。需求、设计和测试对这些条件采用相同表述，便于理解和维护。用例图概括三种角色的操作目标，用例说明记录正常与异常流程，设计图说明数据关系和处理顺序，再通过编号关联到具体测试场景。</w:t>
+        <w:t>文档应准确说明规则的边界。例如，首选占用名额而备选不占用，截止时刻仍允许选课，教务关课依据有效学生会话，不必等待截止；学生退出后才可关闭。需求、设计和测试对这些条件采用相同表述，便于理解和维护。用例图概括三种角色的操作目标，用例说明记录正常与异常流程，设计图说明数据关系和处理顺序，再通过编号关联到具体测试场景。</w:t>
       </w:r>
     </w:p>
     <w:p>
       <w:pPr>
         <w:pStyle w:val="1"/>
-        <w:rPr>
-          <w:lang w:eastAsia="zh-CN"/>
-        </w:rPr>
       </w:pPr>
       <w:bookmarkStart w:id="6" w:name="h_db612fb661ac9609d2ab"/>
-      <w:bookmarkStart w:id="7" w:name="_Toc242739513"/>
+      <w:bookmarkStart w:id="7" w:name="_Toc242825463"/>
       <w:r>
-        <w:rPr>
-          <w:lang w:eastAsia="zh-CN"/>
-        </w:rPr>
         <w:t xml:space="preserve">4 </w:t>
       </w:r>
       <w:r>
-        <w:rPr>
-          <w:lang w:eastAsia="zh-CN"/>
-        </w:rPr>
         <w:t>总结与改进方向</w:t>
       </w:r>
       <w:bookmarkEnd w:id="6"/>
       <w:bookmarkEnd w:id="7"/>
     </w:p>
     <w:p>
-      <w:pPr>
-        <w:rPr>
-          <w:lang w:eastAsia="zh-CN"/>
-        </w:rPr>
-      </w:pPr>
       <w:r>
-        <w:rPr>
-          <w:lang w:eastAsia="zh-CN"/>
-        </w:rPr>
         <w:t>当前版本按课程项目范围完成主要业务，计费使用模拟发送，课程目录使用本地数据库或</w:t>
       </w:r>
       <w:r>
-        <w:rPr>
-          <w:lang w:eastAsia="zh-CN"/>
-        </w:rPr>
         <w:t>JSON</w:t>
       </w:r>
       <w:r>
-        <w:rPr>
-          <w:lang w:eastAsia="zh-CN"/>
-        </w:rPr>
         <w:t>快照。后续整理重点是核对运行说明、文档中的规则与实际操作结果，并保持</w:t>
       </w:r>
       <w:r>
-        <w:rPr>
-          <w:lang w:eastAsia="zh-CN"/>
-        </w:rPr>
         <w:t>Markdown</w:t>
       </w:r>
       <w:r>
-        <w:rPr>
-          <w:lang w:eastAsia="zh-CN"/>
-        </w:rPr>
         <w:t>和</w:t>
       </w:r>
       <w:r>
-        <w:rPr>
-          <w:lang w:eastAsia="zh-CN"/>
-        </w:rPr>
         <w:t>Word</w:t>
       </w:r>
       <w:r>
-        <w:rPr>
-          <w:lang w:eastAsia="zh-CN"/>
-        </w:rPr>
         <w:t>版本一致。</w:t>
       </w:r>
     </w:p>
     <w:p>
-      <w:pPr>
-        <w:rPr>
-          <w:lang w:eastAsia="zh-CN"/>
-        </w:rPr>
-      </w:pPr>
       <w:r>
-        <w:rPr>
-          <w:lang w:eastAsia="zh-CN"/>
-        </w:rPr>
         <w:t>页面布局、键盘操作、时间边界和新电脑运行按测试计划检查并记录。成员信息、分工和个人工作记录集中在下节，具体开发安排见</w:t>
       </w:r>
-      <w:hyperlink r:id="rId9">
+      <w:hyperlink r:id="rId10">
         <w:r>
-          <w:rPr>
-            <w:lang w:eastAsia="zh-CN"/>
-          </w:rPr>
           <w:t>开发计划</w:t>
         </w:r>
       </w:hyperlink>
       <w:r>
-        <w:rPr>
-          <w:lang w:eastAsia="zh-CN"/>
-        </w:rPr>
         <w:t>。</w:t>
       </w:r>
     </w:p>
     <w:p>
       <w:pPr>
         <w:pStyle w:val="1"/>
-        <w:rPr>
-          <w:lang w:eastAsia="zh-CN"/>
-        </w:rPr>
       </w:pPr>
       <w:bookmarkStart w:id="8" w:name="h_f18102740983e1bd8b16"/>
-      <w:bookmarkStart w:id="9" w:name="_Toc242739514"/>
+      <w:bookmarkStart w:id="9" w:name="_Toc242825464"/>
       <w:r>
-        <w:rPr>
-          <w:lang w:eastAsia="zh-CN"/>
-        </w:rPr>
         <w:t xml:space="preserve">5 </w:t>
       </w:r>
       <w:r>
-        <w:rPr>
-          <w:lang w:eastAsia="zh-CN"/>
-        </w:rPr>
         <w:t>成员分工与个人工作记录</w:t>
       </w:r>
       <w:bookmarkEnd w:id="8"/>
@@ -1928,78 +1796,46 @@
     <w:p>
       <w:pPr>
         <w:keepNext/>
-        <w:rPr>
-          <w:lang w:eastAsia="zh-CN"/>
-        </w:rPr>
       </w:pPr>
       <w:r>
-        <w:rPr>
-          <w:lang w:eastAsia="zh-CN"/>
-        </w:rPr>
         <w:t>暂用成员</w:t>
       </w:r>
       <w:r>
-        <w:rPr>
-          <w:lang w:eastAsia="zh-CN"/>
-        </w:rPr>
         <w:t>1—</w:t>
       </w:r>
       <w:r>
-        <w:rPr>
-          <w:lang w:eastAsia="zh-CN"/>
-        </w:rPr>
         <w:t>成员</w:t>
       </w:r>
       <w:r>
-        <w:rPr>
-          <w:lang w:eastAsia="zh-CN"/>
-        </w:rPr>
         <w:t>4</w:t>
       </w:r>
       <w:r>
-        <w:rPr>
-          <w:lang w:eastAsia="zh-CN"/>
-        </w:rPr>
         <w:t>表示小组成员。下表按约定分工归纳工作范围，各节结合现有实现列出模块内容、问题处理及验证依据。测试执行人和完成时间以实际记录为准，成员基本信息和贡献比例统一记录在第</w:t>
       </w:r>
       <w:r>
-        <w:rPr>
-          <w:lang w:eastAsia="zh-CN"/>
-        </w:rPr>
         <w:t>5.5</w:t>
       </w:r>
       <w:r>
-        <w:rPr>
-          <w:lang w:eastAsia="zh-CN"/>
-        </w:rPr>
         <w:t>节。以下程序路径以</w:t>
       </w:r>
       <w:r>
         <w:rPr>
           <w:rFonts w:ascii="Consolas" w:hAnsi="Consolas"/>
           <w:sz w:val="18"/>
-          <w:lang w:eastAsia="zh-CN"/>
         </w:rPr>
         <w:t>Page/</w:t>
       </w:r>
       <w:r>
-        <w:rPr>
-          <w:lang w:eastAsia="zh-CN"/>
-        </w:rPr>
         <w:t>为起点，测试路径以</w:t>
       </w:r>
       <w:r>
         <w:rPr>
           <w:rFonts w:ascii="Consolas" w:hAnsi="Consolas"/>
           <w:sz w:val="18"/>
-          <w:lang w:eastAsia="zh-CN"/>
         </w:rPr>
         <w:t>tests/</w:t>
       </w:r>
       <w:r>
-        <w:rPr>
-          <w:lang w:eastAsia="zh-CN"/>
-        </w:rPr>
         <w:t>为起点。</w:t>
       </w:r>
     </w:p>
@@ -2047,14 +1883,12 @@
               <w:keepNext/>
               <w:jc w:val="center"/>
             </w:pPr>
-            <w:proofErr w:type="spellStart"/>
             <w:r>
               <w:rPr>
                 <w:b/>
               </w:rPr>
               <w:t>成员</w:t>
             </w:r>
-            <w:proofErr w:type="spellEnd"/>
           </w:p>
         </w:tc>
         <w:tc>
@@ -2068,14 +1902,12 @@
               <w:pStyle w:val="TableText"/>
               <w:keepNext/>
             </w:pPr>
-            <w:proofErr w:type="spellStart"/>
             <w:r>
               <w:rPr>
                 <w:b/>
               </w:rPr>
               <w:t>负责模块</w:t>
             </w:r>
-            <w:proofErr w:type="spellEnd"/>
           </w:p>
         </w:tc>
         <w:tc>
@@ -2089,14 +1921,12 @@
               <w:pStyle w:val="TableText"/>
               <w:keepNext/>
             </w:pPr>
-            <w:proofErr w:type="spellStart"/>
             <w:r>
               <w:rPr>
                 <w:b/>
               </w:rPr>
               <w:t>工作范围</w:t>
             </w:r>
-            <w:proofErr w:type="spellEnd"/>
           </w:p>
         </w:tc>
       </w:tr>
@@ -2132,11 +1962,9 @@
             <w:pPr>
               <w:pStyle w:val="TableText"/>
             </w:pPr>
-            <w:proofErr w:type="spellStart"/>
             <w:r>
               <w:t>学生</w:t>
             </w:r>
-            <w:proofErr w:type="spellEnd"/>
           </w:p>
         </w:tc>
         <w:tc>
@@ -2147,14 +1975,8 @@
           <w:p>
             <w:pPr>
               <w:pStyle w:val="TableText"/>
-              <w:rPr>
-                <w:lang w:eastAsia="zh-CN"/>
-              </w:rPr>
             </w:pPr>
             <w:r>
-              <w:rPr>
-                <w:lang w:eastAsia="zh-CN"/>
-              </w:rPr>
               <w:t>选课、退课、课表、成绩查询、草稿和整份删除；完成学生端测试</w:t>
             </w:r>
           </w:p>
@@ -2192,11 +2014,9 @@
             <w:pPr>
               <w:pStyle w:val="TableText"/>
             </w:pPr>
-            <w:proofErr w:type="spellStart"/>
             <w:r>
               <w:t>教师</w:t>
             </w:r>
-            <w:proofErr w:type="spellEnd"/>
           </w:p>
         </w:tc>
         <w:tc>
@@ -2207,14 +2027,8 @@
           <w:p>
             <w:pPr>
               <w:pStyle w:val="TableText"/>
-              <w:rPr>
-                <w:lang w:eastAsia="zh-CN"/>
-              </w:rPr>
             </w:pPr>
             <w:r>
-              <w:rPr>
-                <w:lang w:eastAsia="zh-CN"/>
-              </w:rPr>
               <w:t>教学班认领、取消认领、学生名单和成绩录入；完成教师端测试</w:t>
             </w:r>
           </w:p>
@@ -2252,11 +2066,9 @@
             <w:pPr>
               <w:pStyle w:val="TableText"/>
             </w:pPr>
-            <w:proofErr w:type="spellStart"/>
             <w:r>
               <w:t>教务员</w:t>
             </w:r>
-            <w:proofErr w:type="spellEnd"/>
           </w:p>
         </w:tc>
         <w:tc>
@@ -2267,14 +2079,8 @@
           <w:p>
             <w:pPr>
               <w:pStyle w:val="TableText"/>
-              <w:rPr>
-                <w:lang w:eastAsia="zh-CN"/>
-              </w:rPr>
             </w:pPr>
             <w:r>
-              <w:rPr>
-                <w:lang w:eastAsia="zh-CN"/>
-              </w:rPr>
               <w:t>关闭选课、停开和备选补位，人员资料、任教资格及模拟计费；完成管理端测试与结果核对</w:t>
             </w:r>
           </w:p>
@@ -2312,11 +2118,9 @@
             <w:pPr>
               <w:pStyle w:val="TableText"/>
             </w:pPr>
-            <w:proofErr w:type="spellStart"/>
             <w:r>
               <w:t>登录与首页</w:t>
             </w:r>
-            <w:proofErr w:type="spellEnd"/>
           </w:p>
         </w:tc>
         <w:tc>
@@ -2327,14 +2131,8 @@
           <w:p>
             <w:pPr>
               <w:pStyle w:val="TableText"/>
-              <w:rPr>
-                <w:lang w:eastAsia="zh-CN"/>
-              </w:rPr>
             </w:pPr>
             <w:r>
-              <w:rPr>
-                <w:lang w:eastAsia="zh-CN"/>
-              </w:rPr>
               <w:t>登录退出、首页、课程查询与详情、共用样式和只读目录；整理数据库样例与启动说明</w:t>
             </w:r>
           </w:p>
@@ -2344,9 +2142,6 @@
     <w:p>
       <w:pPr>
         <w:spacing w:after="60" w:line="40" w:lineRule="exact"/>
-        <w:rPr>
-          <w:lang w:eastAsia="zh-CN"/>
-        </w:rPr>
       </w:pPr>
     </w:p>
     <w:p>
@@ -2354,17 +2149,21 @@
         <w:pStyle w:val="21"/>
       </w:pPr>
       <w:bookmarkStart w:id="10" w:name="h_45b8718b9801aed05a7d"/>
-      <w:bookmarkStart w:id="11" w:name="_Toc242739515"/>
+      <w:bookmarkStart w:id="11" w:name="_Toc242825465"/>
       <w:r>
         <w:t xml:space="preserve">5.1 </w:t>
       </w:r>
-      <w:proofErr w:type="spellStart"/>
+      <w:r>
+        <w:t>成员</w:t>
+      </w:r>
+      <w:r>
+        <w:t xml:space="preserve">1 </w:t>
+      </w:r>
       <w:r>
         <w:t>学生模块</w:t>
       </w:r>
       <w:bookmarkEnd w:id="10"/>
       <w:bookmarkEnd w:id="11"/>
-      <w:proofErr w:type="spellEnd"/>
     </w:p>
     <w:tbl>
       <w:tblPr>
@@ -2409,14 +2208,12 @@
               <w:keepNext/>
               <w:jc w:val="center"/>
             </w:pPr>
-            <w:proofErr w:type="spellStart"/>
             <w:r>
               <w:rPr>
                 <w:b/>
               </w:rPr>
               <w:t>工作记录</w:t>
             </w:r>
-            <w:proofErr w:type="spellEnd"/>
           </w:p>
         </w:tc>
         <w:tc>
@@ -2430,14 +2227,12 @@
               <w:pStyle w:val="TableText"/>
               <w:keepNext/>
             </w:pPr>
-            <w:proofErr w:type="spellStart"/>
             <w:r>
               <w:rPr>
                 <w:b/>
               </w:rPr>
               <w:t>内容</w:t>
             </w:r>
-            <w:proofErr w:type="spellEnd"/>
           </w:p>
         </w:tc>
       </w:tr>
@@ -2457,11 +2252,9 @@
               <w:keepNext/>
               <w:jc w:val="center"/>
             </w:pPr>
-            <w:proofErr w:type="spellStart"/>
             <w:r>
               <w:t>模块实现</w:t>
             </w:r>
-            <w:proofErr w:type="spellEnd"/>
           </w:p>
         </w:tc>
         <w:tc>
@@ -2546,11 +2339,9 @@
               <w:keepNext/>
               <w:jc w:val="center"/>
             </w:pPr>
-            <w:proofErr w:type="spellStart"/>
             <w:r>
               <w:t>问题处理</w:t>
             </w:r>
-            <w:proofErr w:type="spellEnd"/>
           </w:p>
         </w:tc>
         <w:tc>
@@ -2562,38 +2353,20 @@
             <w:pPr>
               <w:pStyle w:val="TableText"/>
               <w:keepNext/>
-              <w:rPr>
-                <w:lang w:eastAsia="zh-CN"/>
-              </w:rPr>
             </w:pPr>
             <w:r>
-              <w:rPr>
-                <w:lang w:eastAsia="zh-CN"/>
-              </w:rPr>
               <w:t>正式提交在事务内重新检查名额，扣除本人已有占座，失败时保留原方案；名额刷新只用于页面提示。退课后空缺与关课补位共同核对，关联</w:t>
             </w:r>
             <w:r>
-              <w:rPr>
-                <w:lang w:eastAsia="zh-CN"/>
-              </w:rPr>
               <w:t>D01</w:t>
             </w:r>
             <w:r>
-              <w:rPr>
-                <w:lang w:eastAsia="zh-CN"/>
-              </w:rPr>
               <w:t>、</w:t>
             </w:r>
             <w:r>
-              <w:rPr>
-                <w:lang w:eastAsia="zh-CN"/>
-              </w:rPr>
               <w:t>D02</w:t>
             </w:r>
             <w:r>
-              <w:rPr>
-                <w:lang w:eastAsia="zh-CN"/>
-              </w:rPr>
               <w:t>。</w:t>
             </w:r>
           </w:p>
@@ -2615,11 +2388,9 @@
               <w:keepNext/>
               <w:jc w:val="center"/>
             </w:pPr>
-            <w:proofErr w:type="spellStart"/>
             <w:r>
               <w:t>验证依据与协作</w:t>
             </w:r>
-            <w:proofErr w:type="spellEnd"/>
           </w:p>
         </w:tc>
         <w:tc>
@@ -2699,22 +2470,9 @@
             <w:pPr>
               <w:pStyle w:val="TableText"/>
               <w:jc w:val="center"/>
-              <w:rPr>
-                <w:rFonts w:hint="eastAsia"/>
-                <w:lang w:eastAsia="zh-CN"/>
-              </w:rPr>
             </w:pPr>
-            <w:proofErr w:type="spellStart"/>
-            <w:r>
-              <w:t>个人</w:t>
-            </w:r>
-            <w:proofErr w:type="spellEnd"/>
-            <w:r>
-              <w:rPr>
-                <w:rFonts w:hint="eastAsia"/>
-                <w:lang w:eastAsia="zh-CN"/>
-              </w:rPr>
-              <w:t>体会</w:t>
+            <w:r>
+              <w:t>个人补充</w:t>
             </w:r>
           </w:p>
         </w:tc>
@@ -2726,39 +2484,21 @@
           <w:p>
             <w:pPr>
               <w:pStyle w:val="TableText"/>
-              <w:rPr>
-                <w:lang w:eastAsia="zh-CN"/>
-              </w:rPr>
             </w:pPr>
             <w:r>
-              <w:rPr>
-                <w:lang w:eastAsia="zh-CN"/>
-              </w:rPr>
-              <w:t>通过学生模块的开发，我熟悉了</w:t>
-            </w:r>
-            <w:r>
-              <w:rPr>
-                <w:lang w:eastAsia="zh-CN"/>
-              </w:rPr>
-              <w:t>PHP</w:t>
-            </w:r>
-            <w:r>
-              <w:rPr>
-                <w:lang w:eastAsia="zh-CN"/>
-              </w:rPr>
-              <w:t>与</w:t>
-            </w:r>
-            <w:r>
-              <w:rPr>
-                <w:lang w:eastAsia="zh-CN"/>
-              </w:rPr>
-              <w:t>MySQL</w:t>
-            </w:r>
-            <w:r>
-              <w:rPr>
-                <w:lang w:eastAsia="zh-CN"/>
-              </w:rPr>
-              <w:t>的协作，掌握了选课、退课及信息查询等功能的实现方法。处理名额校验和提交失败等问题，让我认识到业务规则与数据一致性的重要性。测试和联调也提升了我的问题排查与团队协作能力，今后会更加重视边界情况和用户体验。</w:t>
+              <w:t>完成日期：</w:t>
+            </w:r>
+            <w:r>
+              <w:t>________</w:t>
+            </w:r>
+            <w:r>
+              <w:t>；个人体会：</w:t>
+            </w:r>
+            <w:r>
+              <w:t>________</w:t>
+            </w:r>
+            <w:r>
+              <w:t>。</w:t>
             </w:r>
           </w:p>
         </w:tc>
@@ -2767,9 +2507,6 @@
     <w:p>
       <w:pPr>
         <w:spacing w:after="60" w:line="40" w:lineRule="exact"/>
-        <w:rPr>
-          <w:lang w:eastAsia="zh-CN"/>
-        </w:rPr>
       </w:pPr>
     </w:p>
     <w:p>
@@ -2777,10 +2514,16 @@
         <w:pStyle w:val="21"/>
       </w:pPr>
       <w:bookmarkStart w:id="12" w:name="h_863a6d4b43e5d58fcb42"/>
-      <w:bookmarkStart w:id="13" w:name="_Toc242739516"/>
+      <w:bookmarkStart w:id="13" w:name="_Toc242825466"/>
       <w:r>
         <w:lastRenderedPageBreak/>
-        <w:t>5.2</w:t>
+        <w:t xml:space="preserve">5.2 </w:t>
+      </w:r>
+      <w:r>
+        <w:t>成员</w:t>
+      </w:r>
+      <w:r>
+        <w:t xml:space="preserve">2 </w:t>
       </w:r>
       <w:r>
         <w:t>教师模块</w:t>
@@ -2831,14 +2574,12 @@
               <w:keepNext/>
               <w:jc w:val="center"/>
             </w:pPr>
-            <w:proofErr w:type="spellStart"/>
             <w:r>
               <w:rPr>
                 <w:b/>
               </w:rPr>
               <w:t>工作记录</w:t>
             </w:r>
-            <w:proofErr w:type="spellEnd"/>
           </w:p>
         </w:tc>
         <w:tc>
@@ -2852,14 +2593,12 @@
               <w:pStyle w:val="TableText"/>
               <w:keepNext/>
             </w:pPr>
-            <w:proofErr w:type="spellStart"/>
             <w:r>
               <w:rPr>
                 <w:b/>
               </w:rPr>
               <w:t>内容</w:t>
             </w:r>
-            <w:proofErr w:type="spellEnd"/>
           </w:p>
         </w:tc>
       </w:tr>
@@ -2879,11 +2618,9 @@
               <w:keepNext/>
               <w:jc w:val="center"/>
             </w:pPr>
-            <w:proofErr w:type="spellStart"/>
             <w:r>
               <w:t>模块实现</w:t>
             </w:r>
-            <w:proofErr w:type="spellEnd"/>
           </w:p>
         </w:tc>
         <w:tc>
@@ -2968,11 +2705,9 @@
               <w:keepNext/>
               <w:jc w:val="center"/>
             </w:pPr>
-            <w:proofErr w:type="spellStart"/>
             <w:r>
               <w:t>问题处理</w:t>
             </w:r>
-            <w:proofErr w:type="spellEnd"/>
           </w:p>
         </w:tc>
         <w:tc>
@@ -2984,26 +2719,14 @@
             <w:pPr>
               <w:pStyle w:val="TableText"/>
               <w:keepNext/>
-              <w:rPr>
-                <w:lang w:eastAsia="zh-CN"/>
-              </w:rPr>
             </w:pPr>
             <w:r>
-              <w:rPr>
-                <w:lang w:eastAsia="zh-CN"/>
-              </w:rPr>
               <w:t>认领前核对资格、已有任教和全部上课时段；缺少时间时拒绝认领，关联</w:t>
             </w:r>
             <w:r>
-              <w:rPr>
-                <w:lang w:eastAsia="zh-CN"/>
-              </w:rPr>
               <w:t>D03</w:t>
             </w:r>
             <w:r>
-              <w:rPr>
-                <w:lang w:eastAsia="zh-CN"/>
-              </w:rPr>
               <w:t>。取消仅限本人主动认领，成绩维护检查本人任教范围及学期状态。</w:t>
             </w:r>
           </w:p>
@@ -3025,11 +2748,9 @@
               <w:keepNext/>
               <w:jc w:val="center"/>
             </w:pPr>
-            <w:proofErr w:type="spellStart"/>
             <w:r>
               <w:t>验证依据与协作</w:t>
             </w:r>
-            <w:proofErr w:type="spellEnd"/>
           </w:p>
         </w:tc>
         <w:tc>
@@ -3115,22 +2836,9 @@
             <w:pPr>
               <w:pStyle w:val="TableText"/>
               <w:jc w:val="center"/>
-              <w:rPr>
-                <w:rFonts w:hint="eastAsia"/>
-                <w:lang w:eastAsia="zh-CN"/>
-              </w:rPr>
             </w:pPr>
-            <w:proofErr w:type="spellStart"/>
-            <w:r>
-              <w:t>个人</w:t>
-            </w:r>
-            <w:proofErr w:type="spellEnd"/>
-            <w:r>
-              <w:rPr>
-                <w:rFonts w:hint="eastAsia"/>
-                <w:lang w:eastAsia="zh-CN"/>
-              </w:rPr>
-              <w:t>体会</w:t>
+            <w:r>
+              <w:t>个人补充</w:t>
             </w:r>
           </w:p>
         </w:tc>
@@ -3142,15 +2850,21 @@
           <w:p>
             <w:pPr>
               <w:pStyle w:val="TableText"/>
-              <w:rPr>
-                <w:lang w:eastAsia="zh-CN"/>
-              </w:rPr>
             </w:pPr>
             <w:r>
-              <w:rPr>
-                <w:lang w:eastAsia="zh-CN"/>
-              </w:rPr>
-              <w:t>通过教学班认领和成绩管理功能的开发，我加深了对权限控制与业务规则的理解，体会到输入校验和模块联调的重要性。</w:t>
+              <w:t>完成日期：</w:t>
+            </w:r>
+            <w:r>
+              <w:t>________</w:t>
+            </w:r>
+            <w:r>
+              <w:t>；个人体会：</w:t>
+            </w:r>
+            <w:r>
+              <w:t>________</w:t>
+            </w:r>
+            <w:r>
+              <w:t>。</w:t>
             </w:r>
           </w:p>
         </w:tc>
@@ -3159,9 +2873,6 @@
     <w:p>
       <w:pPr>
         <w:spacing w:after="60" w:line="40" w:lineRule="exact"/>
-        <w:rPr>
-          <w:lang w:eastAsia="zh-CN"/>
-        </w:rPr>
       </w:pPr>
     </w:p>
     <w:p>
@@ -3169,17 +2880,21 @@
         <w:pStyle w:val="21"/>
       </w:pPr>
       <w:bookmarkStart w:id="14" w:name="h_9eb9cfd86d6fade58376"/>
-      <w:bookmarkStart w:id="15" w:name="_Toc242739517"/>
+      <w:bookmarkStart w:id="15" w:name="_Toc242825467"/>
       <w:r>
         <w:t xml:space="preserve">5.3 </w:t>
       </w:r>
-      <w:proofErr w:type="spellStart"/>
+      <w:r>
+        <w:t>成员</w:t>
+      </w:r>
+      <w:r>
+        <w:t xml:space="preserve">3 </w:t>
+      </w:r>
       <w:r>
         <w:t>教务员模块</w:t>
       </w:r>
       <w:bookmarkEnd w:id="14"/>
       <w:bookmarkEnd w:id="15"/>
-      <w:proofErr w:type="spellEnd"/>
     </w:p>
     <w:tbl>
       <w:tblPr>
@@ -3224,14 +2939,12 @@
               <w:keepNext/>
               <w:jc w:val="center"/>
             </w:pPr>
-            <w:proofErr w:type="spellStart"/>
             <w:r>
               <w:rPr>
                 <w:b/>
               </w:rPr>
               <w:t>工作记录</w:t>
             </w:r>
-            <w:proofErr w:type="spellEnd"/>
           </w:p>
         </w:tc>
         <w:tc>
@@ -3245,14 +2958,12 @@
               <w:pStyle w:val="TableText"/>
               <w:keepNext/>
             </w:pPr>
-            <w:proofErr w:type="spellStart"/>
             <w:r>
               <w:rPr>
                 <w:b/>
               </w:rPr>
               <w:t>内容</w:t>
             </w:r>
-            <w:proofErr w:type="spellEnd"/>
           </w:p>
         </w:tc>
       </w:tr>
@@ -3272,11 +2983,9 @@
               <w:keepNext/>
               <w:jc w:val="center"/>
             </w:pPr>
-            <w:proofErr w:type="spellStart"/>
             <w:r>
               <w:t>模块实现</w:t>
             </w:r>
-            <w:proofErr w:type="spellEnd"/>
           </w:p>
         </w:tc>
         <w:tc>
@@ -3348,11 +3057,9 @@
               <w:keepNext/>
               <w:jc w:val="center"/>
             </w:pPr>
-            <w:proofErr w:type="spellStart"/>
             <w:r>
               <w:t>问题处理</w:t>
             </w:r>
-            <w:proofErr w:type="spellEnd"/>
           </w:p>
         </w:tc>
         <w:tc>
@@ -3364,74 +3071,38 @@
             <w:pPr>
               <w:pStyle w:val="TableText"/>
               <w:keepNext/>
-              <w:rPr>
-                <w:lang w:eastAsia="zh-CN"/>
-              </w:rPr>
             </w:pPr>
             <w:r>
-              <w:rPr>
-                <w:lang w:eastAsia="zh-CN"/>
-              </w:rPr>
               <w:t>关课先补位再判断最低人数，失败时撤销整次修改，关联</w:t>
             </w:r>
             <w:r>
-              <w:rPr>
-                <w:lang w:eastAsia="zh-CN"/>
-              </w:rPr>
               <w:t>D01</w:t>
             </w:r>
             <w:r>
-              <w:rPr>
-                <w:lang w:eastAsia="zh-CN"/>
-              </w:rPr>
               <w:t>、</w:t>
             </w:r>
             <w:r>
-              <w:rPr>
-                <w:lang w:eastAsia="zh-CN"/>
-              </w:rPr>
               <w:t>D02</w:t>
             </w:r>
             <w:r>
-              <w:rPr>
-                <w:lang w:eastAsia="zh-CN"/>
-              </w:rPr>
               <w:t>。人员有关联记录时拒绝删除，资料编辑比较版本；账号停用和密码重置与成员</w:t>
             </w:r>
             <w:r>
-              <w:rPr>
-                <w:lang w:eastAsia="zh-CN"/>
-              </w:rPr>
               <w:t>4</w:t>
             </w:r>
             <w:r>
-              <w:rPr>
-                <w:lang w:eastAsia="zh-CN"/>
-              </w:rPr>
               <w:t>共同核对，关联</w:t>
             </w:r>
             <w:r>
-              <w:rPr>
-                <w:lang w:eastAsia="zh-CN"/>
-              </w:rPr>
               <w:t>D04</w:t>
             </w:r>
             <w:r>
-              <w:rPr>
-                <w:lang w:eastAsia="zh-CN"/>
-              </w:rPr>
               <w:t>、</w:t>
             </w:r>
             <w:r>
-              <w:rPr>
-                <w:lang w:eastAsia="zh-CN"/>
-              </w:rPr>
               <w:t>D05</w:t>
             </w:r>
             <w:r>
-              <w:rPr>
-                <w:lang w:eastAsia="zh-CN"/>
-              </w:rPr>
               <w:t>。</w:t>
             </w:r>
           </w:p>
@@ -3453,11 +3124,9 @@
               <w:keepNext/>
               <w:jc w:val="center"/>
             </w:pPr>
-            <w:proofErr w:type="spellStart"/>
             <w:r>
               <w:t>验证依据与协作</w:t>
             </w:r>
-            <w:proofErr w:type="spellEnd"/>
           </w:p>
         </w:tc>
         <w:tc>
@@ -3535,22 +3204,9 @@
             <w:pPr>
               <w:pStyle w:val="TableText"/>
               <w:jc w:val="center"/>
-              <w:rPr>
-                <w:rFonts w:hint="eastAsia"/>
-                <w:lang w:eastAsia="zh-CN"/>
-              </w:rPr>
             </w:pPr>
-            <w:proofErr w:type="spellStart"/>
-            <w:r>
-              <w:t>个人</w:t>
-            </w:r>
-            <w:proofErr w:type="spellEnd"/>
-            <w:r>
-              <w:rPr>
-                <w:rFonts w:hint="eastAsia"/>
-                <w:lang w:eastAsia="zh-CN"/>
-              </w:rPr>
-              <w:t>体会</w:t>
+            <w:r>
+              <w:t>个人补充</w:t>
             </w:r>
           </w:p>
         </w:tc>
@@ -3562,16 +3218,21 @@
           <w:p>
             <w:pPr>
               <w:pStyle w:val="TableText"/>
-              <w:rPr>
-                <w:rFonts w:hint="eastAsia"/>
-                <w:lang w:eastAsia="zh-CN"/>
-              </w:rPr>
             </w:pPr>
             <w:r>
-              <w:rPr>
-                <w:lang w:eastAsia="zh-CN"/>
-              </w:rPr>
-              <w:t>通过关课、备选补位和人员管理功能的开发，我认识到业务流程顺序对结果的影响，也加深了对数据库事务和关联数据维护的理解。</w:t>
+              <w:t>完成日期：</w:t>
+            </w:r>
+            <w:r>
+              <w:t>________</w:t>
+            </w:r>
+            <w:r>
+              <w:t>；个人体会：</w:t>
+            </w:r>
+            <w:r>
+              <w:t>________</w:t>
+            </w:r>
+            <w:r>
+              <w:t>。</w:t>
             </w:r>
           </w:p>
         </w:tc>
@@ -3580,9 +3241,6 @@
     <w:p>
       <w:pPr>
         <w:spacing w:after="60" w:line="40" w:lineRule="exact"/>
-        <w:rPr>
-          <w:lang w:eastAsia="zh-CN"/>
-        </w:rPr>
       </w:pPr>
     </w:p>
     <w:p>
@@ -3590,17 +3248,21 @@
         <w:pStyle w:val="21"/>
       </w:pPr>
       <w:bookmarkStart w:id="16" w:name="h_c713756adb79d08b5080"/>
-      <w:bookmarkStart w:id="17" w:name="_Toc242739518"/>
+      <w:bookmarkStart w:id="17" w:name="_Toc242825468"/>
       <w:r>
         <w:t xml:space="preserve">5.4 </w:t>
       </w:r>
-      <w:proofErr w:type="spellStart"/>
+      <w:r>
+        <w:t>成员</w:t>
+      </w:r>
+      <w:r>
+        <w:t xml:space="preserve">4 </w:t>
+      </w:r>
       <w:r>
         <w:t>登录与首页模块</w:t>
       </w:r>
       <w:bookmarkEnd w:id="16"/>
       <w:bookmarkEnd w:id="17"/>
-      <w:proofErr w:type="spellEnd"/>
     </w:p>
     <w:tbl>
       <w:tblPr>
@@ -3645,14 +3307,12 @@
               <w:keepNext/>
               <w:jc w:val="center"/>
             </w:pPr>
-            <w:proofErr w:type="spellStart"/>
             <w:r>
               <w:rPr>
                 <w:b/>
               </w:rPr>
               <w:t>工作记录</w:t>
             </w:r>
-            <w:proofErr w:type="spellEnd"/>
           </w:p>
         </w:tc>
         <w:tc>
@@ -3666,14 +3326,12 @@
               <w:pStyle w:val="TableText"/>
               <w:keepNext/>
             </w:pPr>
-            <w:proofErr w:type="spellStart"/>
             <w:r>
               <w:rPr>
                 <w:b/>
               </w:rPr>
               <w:t>内容</w:t>
             </w:r>
-            <w:proofErr w:type="spellEnd"/>
           </w:p>
         </w:tc>
       </w:tr>
@@ -3693,11 +3351,9 @@
               <w:keepNext/>
               <w:jc w:val="center"/>
             </w:pPr>
-            <w:proofErr w:type="spellStart"/>
             <w:r>
               <w:t>模块实现</w:t>
             </w:r>
-            <w:proofErr w:type="spellEnd"/>
           </w:p>
         </w:tc>
         <w:tc>
@@ -3805,11 +3461,9 @@
               <w:keepNext/>
               <w:jc w:val="center"/>
             </w:pPr>
-            <w:proofErr w:type="spellStart"/>
             <w:r>
               <w:t>问题处理</w:t>
             </w:r>
-            <w:proofErr w:type="spellEnd"/>
           </w:p>
         </w:tc>
         <w:tc>
@@ -3821,50 +3475,26 @@
             <w:pPr>
               <w:pStyle w:val="TableText"/>
               <w:keepNext/>
-              <w:rPr>
-                <w:lang w:eastAsia="zh-CN"/>
-              </w:rPr>
             </w:pPr>
             <w:r>
-              <w:rPr>
-                <w:lang w:eastAsia="zh-CN"/>
-              </w:rPr>
               <w:t>登录兼容已有明文与哈希密码，新增和重置密码保存哈希，关联</w:t>
             </w:r>
             <w:r>
-              <w:rPr>
-                <w:lang w:eastAsia="zh-CN"/>
-              </w:rPr>
               <w:t>D05</w:t>
             </w:r>
             <w:r>
-              <w:rPr>
-                <w:lang w:eastAsia="zh-CN"/>
-              </w:rPr>
               <w:t>。配置按强制演示、环境变量及本机配置的规则读取，保留密码字符串</w:t>
             </w:r>
             <w:r>
-              <w:rPr>
-                <w:lang w:eastAsia="zh-CN"/>
-              </w:rPr>
               <w:t>0</w:t>
             </w:r>
             <w:r>
-              <w:rPr>
-                <w:lang w:eastAsia="zh-CN"/>
-              </w:rPr>
               <w:t>，关联</w:t>
             </w:r>
             <w:r>
-              <w:rPr>
-                <w:lang w:eastAsia="zh-CN"/>
-              </w:rPr>
               <w:t>D06</w:t>
             </w:r>
             <w:r>
-              <w:rPr>
-                <w:lang w:eastAsia="zh-CN"/>
-              </w:rPr>
               <w:t>。</w:t>
             </w:r>
           </w:p>
@@ -3886,11 +3516,9 @@
               <w:keepNext/>
               <w:jc w:val="center"/>
             </w:pPr>
-            <w:proofErr w:type="spellStart"/>
             <w:r>
               <w:t>验证依据与协作</w:t>
             </w:r>
-            <w:proofErr w:type="spellEnd"/>
           </w:p>
         </w:tc>
         <w:tc>
@@ -3902,9 +3530,6 @@
             <w:pPr>
               <w:pStyle w:val="TableText"/>
               <w:keepNext/>
-              <w:rPr>
-                <w:lang w:eastAsia="zh-CN"/>
-              </w:rPr>
             </w:pPr>
             <w:r>
               <w:t>T01—T03</w:t>
@@ -3948,13 +3573,7 @@
               <w:t>config_rules.php</w:t>
             </w:r>
             <w:r>
-              <w:t>检查密码与配置。</w:t>
-            </w:r>
-            <w:r>
-              <w:rPr>
-                <w:lang w:eastAsia="zh-CN"/>
-              </w:rPr>
-              <w:t>数据库样例由各模块确认后汇总，公共页面按测试计划核对。</w:t>
+              <w:t>检查密码与配置。数据库样例由各模块确认后汇总，公共页面按测试计划核对。</w:t>
             </w:r>
           </w:p>
         </w:tc>
@@ -3973,22 +3592,9 @@
             <w:pPr>
               <w:pStyle w:val="TableText"/>
               <w:jc w:val="center"/>
-              <w:rPr>
-                <w:rFonts w:hint="eastAsia"/>
-                <w:lang w:eastAsia="zh-CN"/>
-              </w:rPr>
             </w:pPr>
-            <w:proofErr w:type="spellStart"/>
-            <w:r>
-              <w:t>个人</w:t>
-            </w:r>
-            <w:proofErr w:type="spellEnd"/>
-            <w:r>
-              <w:rPr>
-                <w:rFonts w:hint="eastAsia"/>
-                <w:lang w:eastAsia="zh-CN"/>
-              </w:rPr>
-              <w:t>体会</w:t>
+            <w:r>
+              <w:t>个人补充</w:t>
             </w:r>
           </w:p>
         </w:tc>
@@ -4000,15 +3606,21 @@
           <w:p>
             <w:pPr>
               <w:pStyle w:val="TableText"/>
-              <w:rPr>
-                <w:lang w:eastAsia="zh-CN"/>
-              </w:rPr>
             </w:pPr>
             <w:r>
-              <w:rPr>
-                <w:lang w:eastAsia="zh-CN"/>
-              </w:rPr>
-              <w:t>通过登录验证、课程查询和公共页面的开发，我熟悉了身份认证与页面交互，认识到账号安全、清晰提示和统一界面对用户体验的重要性。</w:t>
+              <w:t>完成日期：</w:t>
+            </w:r>
+            <w:r>
+              <w:t>________</w:t>
+            </w:r>
+            <w:r>
+              <w:t>；个人体会：</w:t>
+            </w:r>
+            <w:r>
+              <w:t>________</w:t>
+            </w:r>
+            <w:r>
+              <w:t>。</w:t>
             </w:r>
           </w:p>
         </w:tc>
@@ -4017,31 +3629,19 @@
     <w:p>
       <w:pPr>
         <w:spacing w:after="60" w:line="40" w:lineRule="exact"/>
-        <w:rPr>
-          <w:lang w:eastAsia="zh-CN"/>
-        </w:rPr>
       </w:pPr>
     </w:p>
     <w:p>
       <w:pPr>
         <w:pStyle w:val="21"/>
-        <w:rPr>
-          <w:lang w:eastAsia="zh-CN"/>
-        </w:rPr>
       </w:pPr>
       <w:bookmarkStart w:id="18" w:name="h_cc9f4a77e1876c69ca0c"/>
-      <w:bookmarkStart w:id="19" w:name="_Toc242739519"/>
+      <w:bookmarkStart w:id="19" w:name="_Toc242825469"/>
       <w:r>
-        <w:rPr>
-          <w:lang w:eastAsia="zh-CN"/>
-        </w:rPr>
         <w:lastRenderedPageBreak/>
         <w:t xml:space="preserve">5.5 </w:t>
       </w:r>
       <w:r>
-        <w:rPr>
-          <w:lang w:eastAsia="zh-CN"/>
-        </w:rPr>
         <w:t>基本信息与贡献记录</w:t>
       </w:r>
       <w:bookmarkEnd w:id="18"/>
@@ -4050,42 +3650,9 @@
     <w:p>
       <w:pPr>
         <w:keepNext/>
-        <w:rPr>
-          <w:rFonts w:hint="eastAsia"/>
-          <w:lang w:eastAsia="zh-CN"/>
-        </w:rPr>
       </w:pPr>
       <w:r>
-        <w:rPr>
-          <w:lang w:eastAsia="zh-CN"/>
-        </w:rPr>
-        <w:t>组号：</w:t>
-      </w:r>
-      <w:r>
-        <w:rPr>
-          <w:rFonts w:hint="eastAsia"/>
-          <w:lang w:eastAsia="zh-CN"/>
-        </w:rPr>
-        <w:t>14</w:t>
-      </w:r>
-      <w:r>
-        <w:rPr>
-          <w:lang w:eastAsia="zh-CN"/>
-        </w:rPr>
-        <w:t>。组长：</w:t>
-      </w:r>
-      <w:r>
-        <w:rPr>
-          <w:rFonts w:hint="eastAsia"/>
-          <w:lang w:eastAsia="zh-CN"/>
-        </w:rPr>
-        <w:t>姚席诚</w:t>
-      </w:r>
-      <w:r>
-        <w:rPr>
-          <w:lang w:eastAsia="zh-CN"/>
-        </w:rPr>
-        <w:t>。</w:t>
+        <w:t>组号：待填。组长：待填。实际开发起止日期：待填。</w:t>
       </w:r>
     </w:p>
     <w:tbl>
@@ -4114,6 +3681,7 @@
         <w:gridCol w:w="1735"/>
         <w:gridCol w:w="1735"/>
         <w:gridCol w:w="2120"/>
+        <w:gridCol w:w="2699"/>
       </w:tblGrid>
       <w:tr>
         <w:trPr>
@@ -4133,14 +3701,12 @@
               <w:keepNext/>
               <w:jc w:val="center"/>
             </w:pPr>
-            <w:proofErr w:type="spellStart"/>
             <w:r>
               <w:rPr>
                 <w:b/>
               </w:rPr>
               <w:t>成员</w:t>
             </w:r>
-            <w:proofErr w:type="spellEnd"/>
           </w:p>
         </w:tc>
         <w:tc>
@@ -4155,14 +3721,12 @@
               <w:keepNext/>
               <w:jc w:val="center"/>
             </w:pPr>
-            <w:proofErr w:type="spellStart"/>
             <w:r>
               <w:rPr>
                 <w:b/>
               </w:rPr>
               <w:t>姓名</w:t>
             </w:r>
-            <w:proofErr w:type="spellEnd"/>
           </w:p>
         </w:tc>
         <w:tc>
@@ -4177,14 +3741,12 @@
               <w:keepNext/>
               <w:jc w:val="center"/>
             </w:pPr>
-            <w:proofErr w:type="spellStart"/>
             <w:r>
               <w:rPr>
                 <w:b/>
               </w:rPr>
               <w:t>学号</w:t>
             </w:r>
-            <w:proofErr w:type="spellEnd"/>
           </w:p>
         </w:tc>
         <w:tc>
@@ -4199,14 +3761,32 @@
               <w:keepNext/>
               <w:jc w:val="center"/>
             </w:pPr>
-            <w:proofErr w:type="spellStart"/>
             <w:r>
               <w:rPr>
                 <w:b/>
               </w:rPr>
               <w:t>贡献比例</w:t>
             </w:r>
-            <w:proofErr w:type="spellEnd"/>
+          </w:p>
+        </w:tc>
+        <w:tc>
+          <w:tcPr>
+            <w:tcW w:w="2699" w:type="dxa"/>
+            <w:shd w:val="clear" w:color="auto" w:fill="E6EEF5"/>
+            <w:vAlign w:val="center"/>
+          </w:tcPr>
+          <w:p>
+            <w:pPr>
+              <w:pStyle w:val="TableText"/>
+              <w:keepNext/>
+              <w:jc w:val="center"/>
+            </w:pPr>
+            <w:r>
+              <w:rPr>
+                <w:b/>
+              </w:rPr>
+              <w:t>签名</w:t>
+            </w:r>
           </w:p>
         </w:tc>
       </w:tr>
@@ -4244,17 +3824,9 @@
               <w:pStyle w:val="TableText"/>
               <w:keepNext/>
               <w:jc w:val="center"/>
-              <w:rPr>
-                <w:rFonts w:hint="eastAsia"/>
-                <w:lang w:eastAsia="zh-CN"/>
-              </w:rPr>
             </w:pPr>
             <w:r>
-              <w:rPr>
-                <w:rFonts w:hint="eastAsia"/>
-                <w:lang w:eastAsia="zh-CN"/>
-              </w:rPr>
-              <w:t>姚席诚</w:t>
+              <w:t>待填</w:t>
             </w:r>
           </w:p>
         </w:tc>
@@ -4268,17 +3840,9 @@
               <w:pStyle w:val="TableText"/>
               <w:keepNext/>
               <w:jc w:val="center"/>
-              <w:rPr>
-                <w:rFonts w:hint="eastAsia"/>
-                <w:lang w:eastAsia="zh-CN"/>
-              </w:rPr>
             </w:pPr>
             <w:r>
-              <w:rPr>
-                <w:rFonts w:hint="eastAsia"/>
-                <w:lang w:eastAsia="zh-CN"/>
-              </w:rPr>
-              <w:t>21230925</w:t>
+              <w:t>待填</w:t>
             </w:r>
           </w:p>
         </w:tc>
@@ -4292,17 +3856,25 @@
               <w:pStyle w:val="TableText"/>
               <w:keepNext/>
               <w:jc w:val="center"/>
-              <w:rPr>
-                <w:rFonts w:hint="eastAsia"/>
-                <w:lang w:eastAsia="zh-CN"/>
-              </w:rPr>
             </w:pPr>
             <w:r>
-              <w:rPr>
-                <w:rFonts w:hint="eastAsia"/>
-                <w:lang w:eastAsia="zh-CN"/>
-              </w:rPr>
-              <w:t>25%</w:t>
+              <w:t>待填</w:t>
+            </w:r>
+          </w:p>
+        </w:tc>
+        <w:tc>
+          <w:tcPr>
+            <w:tcW w:w="2699" w:type="dxa"/>
+            <w:vAlign w:val="center"/>
+          </w:tcPr>
+          <w:p>
+            <w:pPr>
+              <w:pStyle w:val="TableText"/>
+              <w:keepNext/>
+              <w:jc w:val="center"/>
+            </w:pPr>
+            <w:r>
+              <w:t>待填</w:t>
             </w:r>
           </w:p>
         </w:tc>
@@ -4342,11 +3914,9 @@
               <w:keepNext/>
               <w:jc w:val="center"/>
             </w:pPr>
-            <w:proofErr w:type="spellStart"/>
-            <w:r>
-              <w:t>徐康原</w:t>
-            </w:r>
-            <w:proofErr w:type="spellEnd"/>
+            <w:r>
+              <w:t>待填</w:t>
+            </w:r>
           </w:p>
         </w:tc>
         <w:tc>
@@ -4361,7 +3931,7 @@
               <w:jc w:val="center"/>
             </w:pPr>
             <w:r>
-              <w:t>21230927</w:t>
+              <w:t>待填</w:t>
             </w:r>
           </w:p>
         </w:tc>
@@ -4375,17 +3945,25 @@
               <w:pStyle w:val="TableText"/>
               <w:keepNext/>
               <w:jc w:val="center"/>
-              <w:rPr>
-                <w:rFonts w:hint="eastAsia"/>
-                <w:lang w:eastAsia="zh-CN"/>
-              </w:rPr>
             </w:pPr>
             <w:r>
-              <w:rPr>
-                <w:rFonts w:hint="eastAsia"/>
-                <w:lang w:eastAsia="zh-CN"/>
-              </w:rPr>
-              <w:t>25%</w:t>
+              <w:t>待填</w:t>
+            </w:r>
+          </w:p>
+        </w:tc>
+        <w:tc>
+          <w:tcPr>
+            <w:tcW w:w="2699" w:type="dxa"/>
+            <w:vAlign w:val="center"/>
+          </w:tcPr>
+          <w:p>
+            <w:pPr>
+              <w:pStyle w:val="TableText"/>
+              <w:keepNext/>
+              <w:jc w:val="center"/>
+            </w:pPr>
+            <w:r>
+              <w:t>待填</w:t>
             </w:r>
           </w:p>
         </w:tc>
@@ -4425,11 +4003,9 @@
               <w:keepNext/>
               <w:jc w:val="center"/>
             </w:pPr>
-            <w:proofErr w:type="spellStart"/>
-            <w:r>
-              <w:t>李文龙</w:t>
-            </w:r>
-            <w:proofErr w:type="spellEnd"/>
+            <w:r>
+              <w:t>待填</w:t>
+            </w:r>
           </w:p>
         </w:tc>
         <w:tc>
@@ -4444,7 +4020,7 @@
               <w:jc w:val="center"/>
             </w:pPr>
             <w:r>
-              <w:t>25220709</w:t>
+              <w:t>待填</w:t>
             </w:r>
           </w:p>
         </w:tc>
@@ -4458,17 +4034,25 @@
               <w:pStyle w:val="TableText"/>
               <w:keepNext/>
               <w:jc w:val="center"/>
-              <w:rPr>
-                <w:rFonts w:hint="eastAsia"/>
-                <w:lang w:eastAsia="zh-CN"/>
-              </w:rPr>
             </w:pPr>
             <w:r>
-              <w:rPr>
-                <w:rFonts w:hint="eastAsia"/>
-                <w:lang w:eastAsia="zh-CN"/>
-              </w:rPr>
-              <w:t>25%</w:t>
+              <w:t>待填</w:t>
+            </w:r>
+          </w:p>
+        </w:tc>
+        <w:tc>
+          <w:tcPr>
+            <w:tcW w:w="2699" w:type="dxa"/>
+            <w:vAlign w:val="center"/>
+          </w:tcPr>
+          <w:p>
+            <w:pPr>
+              <w:pStyle w:val="TableText"/>
+              <w:keepNext/>
+              <w:jc w:val="center"/>
+            </w:pPr>
+            <w:r>
+              <w:t>待填</w:t>
             </w:r>
           </w:p>
         </w:tc>
@@ -4506,11 +4090,9 @@
               <w:pStyle w:val="TableText"/>
               <w:jc w:val="center"/>
             </w:pPr>
-            <w:proofErr w:type="spellStart"/>
-            <w:r>
-              <w:t>赵科锦</w:t>
-            </w:r>
-            <w:proofErr w:type="spellEnd"/>
+            <w:r>
+              <w:t>待填</w:t>
+            </w:r>
           </w:p>
         </w:tc>
         <w:tc>
@@ -4524,7 +4106,7 @@
               <w:jc w:val="center"/>
             </w:pPr>
             <w:r>
-              <w:t>24230724</w:t>
+              <w:t>待填</w:t>
             </w:r>
           </w:p>
         </w:tc>
@@ -4537,17 +4119,24 @@
             <w:pPr>
               <w:pStyle w:val="TableText"/>
               <w:jc w:val="center"/>
-              <w:rPr>
-                <w:rFonts w:hint="eastAsia"/>
-                <w:lang w:eastAsia="zh-CN"/>
-              </w:rPr>
             </w:pPr>
             <w:r>
-              <w:rPr>
-                <w:rFonts w:hint="eastAsia"/>
-                <w:lang w:eastAsia="zh-CN"/>
-              </w:rPr>
-              <w:t>25%</w:t>
+              <w:t>待填</w:t>
+            </w:r>
+          </w:p>
+        </w:tc>
+        <w:tc>
+          <w:tcPr>
+            <w:tcW w:w="2699" w:type="dxa"/>
+            <w:vAlign w:val="center"/>
+          </w:tcPr>
+          <w:p>
+            <w:pPr>
+              <w:pStyle w:val="TableText"/>
+              <w:jc w:val="center"/>
+            </w:pPr>
+            <w:r>
+              <w:t>待填</w:t>
             </w:r>
           </w:p>
         </w:tc>
@@ -4559,14 +4148,165 @@
       </w:pPr>
     </w:p>
     <w:p>
+      <w:r>
+        <w:t>贡献比例由小组根据实际工作量确认，合计</w:t>
+      </w:r>
+      <w:r>
+        <w:t>100%</w:t>
+      </w:r>
+      <w:r>
+        <w:t>，由组长汇总。其他正式文档引用本表；各次测试的执行日期仍保留在测试记录中。</w:t>
+      </w:r>
+    </w:p>
+    <w:p>
       <w:pPr>
+        <w:pStyle w:val="1"/>
+      </w:pPr>
+      <w:bookmarkStart w:id="20" w:name="h_40ea459707d3329c5dcb"/>
+      <w:bookmarkStart w:id="21" w:name="_Toc242825470"/>
+      <w:r>
+        <w:t xml:space="preserve">6 </w:t>
+      </w:r>
+      <w:r>
+        <w:t>当前版本补充</w:t>
+      </w:r>
+      <w:bookmarkEnd w:id="20"/>
+      <w:bookmarkEnd w:id="21"/>
+    </w:p>
+    <w:p>
+      <w:r>
+        <w:t>数量规则改为最多</w:t>
+      </w:r>
+      <w:r>
+        <w:t>4</w:t>
+      </w:r>
+      <w:r>
+        <w:t>个首选和</w:t>
+      </w:r>
+      <w:r>
+        <w:t>2</w:t>
+      </w:r>
+      <w:r>
+        <w:t>个备选，未填满也可提交；关课根据全部首选空位尝试备选递补，最多注册</w:t>
+      </w:r>
+      <w:r>
+        <w:t>4</w:t>
+      </w:r>
+      <w:r>
+        <w:t>门。重新开启使用关闭前快照恢复，已有成绩时拒绝。页面删除重复说明并将结果明细折叠，便于课程演示。</w:t>
+      </w:r>
+    </w:p>
+    <w:p>
+      <w:r>
+        <w:t>原站出现选课会话不可用时，日志确认缺少</w:t>
+      </w:r>
+      <w:r>
         <w:rPr>
-          <w:lang w:eastAsia="zh-CN"/>
+          <w:rFonts w:ascii="Consolas" w:hAnsi="Consolas"/>
+          <w:sz w:val="18"/>
         </w:rPr>
-      </w:pPr>
+        <w:t>selection_sessions</w:t>
+      </w:r>
+      <w:r>
+        <w:t>表。补建后会话登记、刷新及退出清理通过，随后</w:t>
+      </w:r>
+      <w:r>
+        <w:t>9</w:t>
+      </w:r>
+      <w:r>
+        <w:t>个升级脚本全部执行成功。该问题说明代码拉取与数据库升级需要分别验证。</w:t>
+      </w:r>
+    </w:p>
+    <w:p>
+      <w:r>
+        <w:t>2026</w:t>
+      </w:r>
+      <w:r>
+        <w:t>年</w:t>
+      </w:r>
+      <w:r>
+        <w:t>10</w:t>
+      </w:r>
+      <w:r>
+        <w:t>月</w:t>
+      </w:r>
+      <w:r>
+        <w:t>13</w:t>
+      </w:r>
+      <w:r>
+        <w:t>日业务版本在独立临时</w:t>
+      </w:r>
+      <w:r>
+        <w:t>MySQL</w:t>
+      </w:r>
+      <w:r>
+        <w:t>中完成</w:t>
+      </w:r>
+      <w:r>
+        <w:t>37</w:t>
+      </w:r>
+      <w:r>
+        <w:t>个阶段、</w:t>
+      </w:r>
+      <w:r>
+        <w:t>1037</w:t>
+      </w:r>
+      <w:r>
+        <w:t>项自动检查，全部通过，其中最后一席竞争执行</w:t>
+      </w:r>
+      <w:r>
+        <w:t>5</w:t>
+      </w:r>
+      <w:r>
+        <w:t>轮。随后提交</w:t>
+      </w:r>
+      <w:r>
+        <w:t>e2b9006</w:t>
+      </w:r>
+      <w:r>
+        <w:t>精简页面文字及折叠明细，</w:t>
+      </w:r>
+      <w:r>
+        <w:t>9</w:t>
+      </w:r>
+      <w:r>
+        <w:t>个修改</w:t>
+      </w:r>
+      <w:r>
+        <w:t>PHP</w:t>
+      </w:r>
+      <w:r>
+        <w:t>文件语法检查、</w:t>
+      </w:r>
+      <w:r>
+        <w:t>21</w:t>
+      </w:r>
+      <w:r>
+        <w:t>项前端检查及</w:t>
+      </w:r>
+      <w:r>
+        <w:t>Git</w:t>
+      </w:r>
+      <w:r>
+        <w:t>空白检查通过；页面精简后未重新运行完整回归。原数据库的</w:t>
+      </w:r>
+      <w:r>
+        <w:t>9</w:t>
+      </w:r>
+      <w:r>
+        <w:t>个升级脚本执行成功，会话登记、刷新和清理验证通过。浏览器人工操作、键盘和窄屏视觉验收尚未完成。完整记录见</w:t>
+      </w:r>
+      <w:hyperlink r:id="rId11">
+        <w:r>
+          <w:t>本次自动检查记录</w:t>
+        </w:r>
+      </w:hyperlink>
+      <w:r>
+        <w:t>。</w:t>
+      </w:r>
     </w:p>
     <w:sectPr>
-      <w:footerReference w:type="default" r:id="rId10"/>
+      <w:footerReference w:type="default" r:id="rId12"/>
       <w:pgSz w:w="11906" w:h="16838"/>
       <w:pgMar w:top="1134" w:right="1134" w:bottom="1134" w:left="1134" w:header="720" w:footer="510" w:gutter="0"/>
       <w:cols w:space="720"/>
@@ -4840,31 +4580,31 @@
       </w:rPr>
     </w:lvl>
   </w:abstractNum>
-  <w:num w:numId="1" w16cid:durableId="988826399">
+  <w:num w:numId="1" w16cid:durableId="335618868">
     <w:abstractNumId w:val="8"/>
   </w:num>
-  <w:num w:numId="2" w16cid:durableId="554312652">
+  <w:num w:numId="2" w16cid:durableId="1509053865">
     <w:abstractNumId w:val="6"/>
   </w:num>
-  <w:num w:numId="3" w16cid:durableId="392585556">
+  <w:num w:numId="3" w16cid:durableId="1464496984">
     <w:abstractNumId w:val="5"/>
   </w:num>
-  <w:num w:numId="4" w16cid:durableId="1638027940">
+  <w:num w:numId="4" w16cid:durableId="2062053219">
     <w:abstractNumId w:val="4"/>
   </w:num>
-  <w:num w:numId="5" w16cid:durableId="221452246">
+  <w:num w:numId="5" w16cid:durableId="16466334">
     <w:abstractNumId w:val="7"/>
   </w:num>
-  <w:num w:numId="6" w16cid:durableId="880481503">
+  <w:num w:numId="6" w16cid:durableId="1478566503">
     <w:abstractNumId w:val="3"/>
   </w:num>
-  <w:num w:numId="7" w16cid:durableId="1816798995">
+  <w:num w:numId="7" w16cid:durableId="2006778389">
     <w:abstractNumId w:val="2"/>
   </w:num>
-  <w:num w:numId="8" w16cid:durableId="1285961004">
+  <w:num w:numId="8" w16cid:durableId="322971408">
     <w:abstractNumId w:val="1"/>
   </w:num>
-  <w:num w:numId="9" w16cid:durableId="1271350057">
+  <w:num w:numId="9" w16cid:durableId="1959406081">
     <w:abstractNumId w:val="0"/>
   </w:num>
 </w:numbering>
@@ -5478,6 +5218,7 @@
   <w:style w:type="character" w:default="1" w:styleId="a2">
     <w:name w:val="Default Paragraph Font"/>
     <w:uiPriority w:val="1"/>
+    <w:semiHidden/>
     <w:unhideWhenUsed/>
   </w:style>
   <w:style w:type="table" w:default="1" w:styleId="a3">
@@ -16297,7 +16038,7 @@
     <w:autoRedefine/>
     <w:uiPriority w:val="39"/>
     <w:unhideWhenUsed/>
-    <w:rsid w:val="00BF6A63"/>
+    <w:rsid w:val="00893C2C"/>
   </w:style>
   <w:style w:type="paragraph" w:styleId="TOC2">
     <w:name w:val="toc 2"/>
@@ -16306,7 +16047,7 @@
     <w:autoRedefine/>
     <w:uiPriority w:val="39"/>
     <w:unhideWhenUsed/>
-    <w:rsid w:val="00BF6A63"/>
+    <w:rsid w:val="00893C2C"/>
     <w:pPr>
       <w:ind w:leftChars="200" w:left="420"/>
     </w:pPr>
@@ -16316,7 +16057,7 @@
     <w:basedOn w:val="a2"/>
     <w:uiPriority w:val="99"/>
     <w:unhideWhenUsed/>
-    <w:rsid w:val="00BF6A63"/>
+    <w:rsid w:val="00893C2C"/>
     <w:rPr>
       <w:color w:val="0000FF" w:themeColor="hyperlink"/>
       <w:u w:val="single"/>

</xml_diff>

<commit_message>
Sync project documents with current fixes and 1067 passing checks
</commit_message>
<xml_diff>
--- a/课程注册系统工作总结.docx
+++ b/课程注册系统工作总结.docx
@@ -22,7 +22,7 @@
         <w:t>；当前项目同步日期：</w:t>
       </w:r>
       <w:r>
-        <w:t>2026-10-13</w:t>
+        <w:t>2026-10-14</w:t>
       </w:r>
       <w:r>
         <w:t>。</w:t>
@@ -47,13 +47,8 @@
           <w:tab w:val="right" w:leader="dot" w:pos="9628"/>
         </w:tabs>
         <w:rPr>
-          <w:rFonts w:asciiTheme="minorHAnsi" w:eastAsiaTheme="minorEastAsia" w:hAnsiTheme="minorHAnsi"/>
+          <w:rFonts w:hint="eastAsia"/>
           <w:noProof/>
-          <w:color w:val="auto"/>
-          <w:kern w:val="2"/>
-          <w:szCs w:val="24"/>
-          <w:lang w:eastAsia="zh-CN"/>
-          <w14:ligatures w14:val="standardContextual"/>
         </w:rPr>
       </w:pPr>
       <w:r>
@@ -65,7 +60,7 @@
       <w:r>
         <w:fldChar w:fldCharType="separate"/>
       </w:r>
-      <w:hyperlink w:anchor="_Toc242825460" w:history="1">
+      <w:hyperlink w:anchor="_Toc242861772" w:history="1">
         <w:r>
           <w:rPr>
             <w:rStyle w:val="aff9"/>
@@ -109,7 +104,7 @@
             <w:noProof/>
             <w:webHidden/>
           </w:rPr>
-          <w:instrText>PAGEREF _Toc242825460 \h</w:instrText>
+          <w:instrText>PAGEREF _Toc242861772 \h</w:instrText>
         </w:r>
         <w:r>
           <w:rPr>
@@ -158,16 +153,11 @@
           <w:tab w:val="right" w:leader="dot" w:pos="9628"/>
         </w:tabs>
         <w:rPr>
-          <w:rFonts w:asciiTheme="minorHAnsi" w:eastAsiaTheme="minorEastAsia" w:hAnsiTheme="minorHAnsi"/>
+          <w:rFonts w:hint="eastAsia"/>
           <w:noProof/>
-          <w:color w:val="auto"/>
-          <w:kern w:val="2"/>
-          <w:szCs w:val="24"/>
-          <w:lang w:eastAsia="zh-CN"/>
-          <w14:ligatures w14:val="standardContextual"/>
         </w:rPr>
       </w:pPr>
-      <w:hyperlink w:anchor="_Toc242825461" w:history="1">
+      <w:hyperlink w:anchor="_Toc242861773" w:history="1">
         <w:r>
           <w:rPr>
             <w:rStyle w:val="aff9"/>
@@ -211,7 +201,7 @@
             <w:noProof/>
             <w:webHidden/>
           </w:rPr>
-          <w:instrText>PAGEREF _Toc242825461 \h</w:instrText>
+          <w:instrText>PAGEREF _Toc242861773 \h</w:instrText>
         </w:r>
         <w:r>
           <w:rPr>
@@ -260,16 +250,11 @@
           <w:tab w:val="right" w:leader="dot" w:pos="9628"/>
         </w:tabs>
         <w:rPr>
-          <w:rFonts w:asciiTheme="minorHAnsi" w:eastAsiaTheme="minorEastAsia" w:hAnsiTheme="minorHAnsi"/>
+          <w:rFonts w:hint="eastAsia"/>
           <w:noProof/>
-          <w:color w:val="auto"/>
-          <w:kern w:val="2"/>
-          <w:szCs w:val="24"/>
-          <w:lang w:eastAsia="zh-CN"/>
-          <w14:ligatures w14:val="standardContextual"/>
         </w:rPr>
       </w:pPr>
-      <w:hyperlink w:anchor="_Toc242825462" w:history="1">
+      <w:hyperlink w:anchor="_Toc242861774" w:history="1">
         <w:r>
           <w:rPr>
             <w:rStyle w:val="aff9"/>
@@ -313,7 +298,7 @@
             <w:noProof/>
             <w:webHidden/>
           </w:rPr>
-          <w:instrText>PAGEREF _Toc242825462 \h</w:instrText>
+          <w:instrText>PAGEREF _Toc242861774 \h</w:instrText>
         </w:r>
         <w:r>
           <w:rPr>
@@ -362,16 +347,11 @@
           <w:tab w:val="right" w:leader="dot" w:pos="9628"/>
         </w:tabs>
         <w:rPr>
-          <w:rFonts w:asciiTheme="minorHAnsi" w:eastAsiaTheme="minorEastAsia" w:hAnsiTheme="minorHAnsi"/>
+          <w:rFonts w:hint="eastAsia"/>
           <w:noProof/>
-          <w:color w:val="auto"/>
-          <w:kern w:val="2"/>
-          <w:szCs w:val="24"/>
-          <w:lang w:eastAsia="zh-CN"/>
-          <w14:ligatures w14:val="standardContextual"/>
         </w:rPr>
       </w:pPr>
-      <w:hyperlink w:anchor="_Toc242825463" w:history="1">
+      <w:hyperlink w:anchor="_Toc242861775" w:history="1">
         <w:r>
           <w:rPr>
             <w:rStyle w:val="aff9"/>
@@ -415,7 +395,7 @@
             <w:noProof/>
             <w:webHidden/>
           </w:rPr>
-          <w:instrText>PAGEREF _Toc242825463 \h</w:instrText>
+          <w:instrText>PAGEREF _Toc242861775 \h</w:instrText>
         </w:r>
         <w:r>
           <w:rPr>
@@ -464,16 +444,11 @@
           <w:tab w:val="right" w:leader="dot" w:pos="9628"/>
         </w:tabs>
         <w:rPr>
-          <w:rFonts w:asciiTheme="minorHAnsi" w:eastAsiaTheme="minorEastAsia" w:hAnsiTheme="minorHAnsi"/>
+          <w:rFonts w:hint="eastAsia"/>
           <w:noProof/>
-          <w:color w:val="auto"/>
-          <w:kern w:val="2"/>
-          <w:szCs w:val="24"/>
-          <w:lang w:eastAsia="zh-CN"/>
-          <w14:ligatures w14:val="standardContextual"/>
         </w:rPr>
       </w:pPr>
-      <w:hyperlink w:anchor="_Toc242825464" w:history="1">
+      <w:hyperlink w:anchor="_Toc242861776" w:history="1">
         <w:r>
           <w:rPr>
             <w:rStyle w:val="aff9"/>
@@ -517,7 +492,7 @@
             <w:noProof/>
             <w:webHidden/>
           </w:rPr>
-          <w:instrText>PAGEREF _Toc242825464 \h</w:instrText>
+          <w:instrText>PAGEREF _Toc242861776 \h</w:instrText>
         </w:r>
         <w:r>
           <w:rPr>
@@ -567,16 +542,11 @@
         </w:tabs>
         <w:ind w:left="440"/>
         <w:rPr>
-          <w:rFonts w:asciiTheme="minorHAnsi" w:eastAsiaTheme="minorEastAsia" w:hAnsiTheme="minorHAnsi"/>
+          <w:rFonts w:hint="eastAsia"/>
           <w:noProof/>
-          <w:color w:val="auto"/>
-          <w:kern w:val="2"/>
-          <w:szCs w:val="24"/>
-          <w:lang w:eastAsia="zh-CN"/>
-          <w14:ligatures w14:val="standardContextual"/>
         </w:rPr>
       </w:pPr>
-      <w:hyperlink w:anchor="_Toc242825465" w:history="1">
+      <w:hyperlink w:anchor="_Toc242861777" w:history="1">
         <w:r>
           <w:rPr>
             <w:rStyle w:val="aff9"/>
@@ -634,7 +604,7 @@
             <w:noProof/>
             <w:webHidden/>
           </w:rPr>
-          <w:instrText>PAGEREF _Toc242825465 \h</w:instrText>
+          <w:instrText>PAGEREF _Toc242861777 \h</w:instrText>
         </w:r>
         <w:r>
           <w:rPr>
@@ -684,16 +654,11 @@
         </w:tabs>
         <w:ind w:left="440"/>
         <w:rPr>
-          <w:rFonts w:asciiTheme="minorHAnsi" w:eastAsiaTheme="minorEastAsia" w:hAnsiTheme="minorHAnsi"/>
+          <w:rFonts w:hint="eastAsia"/>
           <w:noProof/>
-          <w:color w:val="auto"/>
-          <w:kern w:val="2"/>
-          <w:szCs w:val="24"/>
-          <w:lang w:eastAsia="zh-CN"/>
-          <w14:ligatures w14:val="standardContextual"/>
         </w:rPr>
       </w:pPr>
-      <w:hyperlink w:anchor="_Toc242825466" w:history="1">
+      <w:hyperlink w:anchor="_Toc242861778" w:history="1">
         <w:r>
           <w:rPr>
             <w:rStyle w:val="aff9"/>
@@ -751,7 +716,7 @@
             <w:noProof/>
             <w:webHidden/>
           </w:rPr>
-          <w:instrText>PAGEREF _Toc242825466 \h</w:instrText>
+          <w:instrText>PAGEREF _Toc242861778 \h</w:instrText>
         </w:r>
         <w:r>
           <w:rPr>
@@ -801,16 +766,11 @@
         </w:tabs>
         <w:ind w:left="440"/>
         <w:rPr>
-          <w:rFonts w:asciiTheme="minorHAnsi" w:eastAsiaTheme="minorEastAsia" w:hAnsiTheme="minorHAnsi"/>
+          <w:rFonts w:hint="eastAsia"/>
           <w:noProof/>
-          <w:color w:val="auto"/>
-          <w:kern w:val="2"/>
-          <w:szCs w:val="24"/>
-          <w:lang w:eastAsia="zh-CN"/>
-          <w14:ligatures w14:val="standardContextual"/>
         </w:rPr>
       </w:pPr>
-      <w:hyperlink w:anchor="_Toc242825467" w:history="1">
+      <w:hyperlink w:anchor="_Toc242861779" w:history="1">
         <w:r>
           <w:rPr>
             <w:rStyle w:val="aff9"/>
@@ -868,7 +828,7 @@
             <w:noProof/>
             <w:webHidden/>
           </w:rPr>
-          <w:instrText>PAGEREF _Toc242825467 \h</w:instrText>
+          <w:instrText>PAGEREF _Toc242861779 \h</w:instrText>
         </w:r>
         <w:r>
           <w:rPr>
@@ -918,16 +878,11 @@
         </w:tabs>
         <w:ind w:left="440"/>
         <w:rPr>
-          <w:rFonts w:asciiTheme="minorHAnsi" w:eastAsiaTheme="minorEastAsia" w:hAnsiTheme="minorHAnsi"/>
+          <w:rFonts w:hint="eastAsia"/>
           <w:noProof/>
-          <w:color w:val="auto"/>
-          <w:kern w:val="2"/>
-          <w:szCs w:val="24"/>
-          <w:lang w:eastAsia="zh-CN"/>
-          <w14:ligatures w14:val="standardContextual"/>
         </w:rPr>
       </w:pPr>
-      <w:hyperlink w:anchor="_Toc242825468" w:history="1">
+      <w:hyperlink w:anchor="_Toc242861780" w:history="1">
         <w:r>
           <w:rPr>
             <w:rStyle w:val="aff9"/>
@@ -985,7 +940,7 @@
             <w:noProof/>
             <w:webHidden/>
           </w:rPr>
-          <w:instrText>PAGEREF _Toc242825468 \h</w:instrText>
+          <w:instrText>PAGEREF _Toc242861780 \h</w:instrText>
         </w:r>
         <w:r>
           <w:rPr>
@@ -1035,16 +990,11 @@
         </w:tabs>
         <w:ind w:left="440"/>
         <w:rPr>
-          <w:rFonts w:asciiTheme="minorHAnsi" w:eastAsiaTheme="minorEastAsia" w:hAnsiTheme="minorHAnsi"/>
+          <w:rFonts w:hint="eastAsia"/>
           <w:noProof/>
-          <w:color w:val="auto"/>
-          <w:kern w:val="2"/>
-          <w:szCs w:val="24"/>
-          <w:lang w:eastAsia="zh-CN"/>
-          <w14:ligatures w14:val="standardContextual"/>
         </w:rPr>
       </w:pPr>
-      <w:hyperlink w:anchor="_Toc242825469" w:history="1">
+      <w:hyperlink w:anchor="_Toc242861781" w:history="1">
         <w:r>
           <w:rPr>
             <w:rStyle w:val="aff9"/>
@@ -1088,7 +1038,7 @@
             <w:noProof/>
             <w:webHidden/>
           </w:rPr>
-          <w:instrText>PAGEREF _Toc242825469 \h</w:instrText>
+          <w:instrText>PAGEREF _Toc242861781 \h</w:instrText>
         </w:r>
         <w:r>
           <w:rPr>
@@ -1137,16 +1087,11 @@
           <w:tab w:val="right" w:leader="dot" w:pos="9628"/>
         </w:tabs>
         <w:rPr>
-          <w:rFonts w:asciiTheme="minorHAnsi" w:eastAsiaTheme="minorEastAsia" w:hAnsiTheme="minorHAnsi"/>
+          <w:rFonts w:hint="eastAsia"/>
           <w:noProof/>
-          <w:color w:val="auto"/>
-          <w:kern w:val="2"/>
-          <w:szCs w:val="24"/>
-          <w:lang w:eastAsia="zh-CN"/>
-          <w14:ligatures w14:val="standardContextual"/>
         </w:rPr>
       </w:pPr>
-      <w:hyperlink w:anchor="_Toc242825470" w:history="1">
+      <w:hyperlink w:anchor="_Toc242861782" w:history="1">
         <w:r>
           <w:rPr>
             <w:rStyle w:val="aff9"/>
@@ -1190,7 +1135,7 @@
             <w:noProof/>
             <w:webHidden/>
           </w:rPr>
-          <w:instrText>PAGEREF _Toc242825470 \h</w:instrText>
+          <w:instrText>PAGEREF _Toc242861782 \h</w:instrText>
         </w:r>
         <w:r>
           <w:rPr>
@@ -1247,7 +1192,7 @@
         <w:pStyle w:val="1"/>
       </w:pPr>
       <w:bookmarkStart w:id="0" w:name="h_2d27fac8cbdecbcea690"/>
-      <w:bookmarkStart w:id="1" w:name="_Toc242825460"/>
+      <w:bookmarkStart w:id="1" w:name="_Toc242861772"/>
       <w:r>
         <w:lastRenderedPageBreak/>
         <w:t xml:space="preserve">1 </w:t>
@@ -1305,7 +1250,7 @@
         <w:pStyle w:val="1"/>
       </w:pPr>
       <w:bookmarkStart w:id="2" w:name="h_8d71bb3dd4cecc93ea1c"/>
-      <w:bookmarkStart w:id="3" w:name="_Toc242825461"/>
+      <w:bookmarkStart w:id="3" w:name="_Toc242861773"/>
       <w:r>
         <w:t xml:space="preserve">2 </w:t>
       </w:r>
@@ -1612,12 +1557,49 @@
     </w:p>
     <w:p>
       <w:r>
+        <w:t>本轮补充修复了先修课同名误匹配、原注册课程重复校验和秒级时间冲突漏判。课程身份改按代码判断，原有注册与新增注册分别处理，数据库时间保留秒数参与比较。完整回归中曾出现连接端口耗尽导致课表</w:t>
+      </w:r>
+      <w:r>
+        <w:t>HTTP 500</w:t>
+      </w:r>
+      <w:r>
+        <w:t>，随后将网页请求内的</w:t>
+      </w:r>
+      <w:r>
+        <w:t>PDO</w:t>
+      </w:r>
+      <w:r>
+        <w:t>连接复用；</w:t>
+      </w:r>
+      <w:r>
+        <w:t>7</w:t>
+      </w:r>
+      <w:r>
+        <w:t>类网页请求每次仅建立</w:t>
+      </w:r>
+      <w:r>
+        <w:t>1</w:t>
+      </w:r>
+      <w:r>
+        <w:t>条连接，</w:t>
+      </w:r>
+      <w:r>
+        <w:t>CLI</w:t>
+      </w:r>
+      <w:r>
+        <w:t>独立连接仍正常。</w:t>
+      </w:r>
+    </w:p>
+    <w:p>
+      <w:proofErr w:type="spellStart"/>
+      <w:r>
         <w:t>修改后分别检查正常操作和原有出错场景，并比较操作前后的数据库记录。问题处理和复测结果见</w:t>
       </w:r>
       <w:hyperlink r:id="rId9">
         <w:r>
           <w:t>测试报告</w:t>
         </w:r>
+        <w:proofErr w:type="spellEnd"/>
       </w:hyperlink>
       <w:r>
         <w:t>。</w:t>
@@ -1628,7 +1610,7 @@
         <w:pStyle w:val="1"/>
       </w:pPr>
       <w:bookmarkStart w:id="4" w:name="h_4ad32647cdfabbff5030"/>
-      <w:bookmarkStart w:id="5" w:name="_Toc242825462"/>
+      <w:bookmarkStart w:id="5" w:name="_Toc242861774"/>
       <w:r>
         <w:t xml:space="preserve">3 </w:t>
       </w:r>
@@ -1667,7 +1649,7 @@
         <w:t>847</w:t>
       </w:r>
       <w:r>
-        <w:t>条检查；</w:t>
+        <w:t>条检查，</w:t>
       </w:r>
       <w:r>
         <w:t>10</w:t>
@@ -1679,7 +1661,7 @@
         <w:t>13</w:t>
       </w:r>
       <w:r>
-        <w:t>日业务版本完整回归完成</w:t>
+        <w:t>日前一轮业务回归完成</w:t>
       </w:r>
       <w:r>
         <w:t>37</w:t>
@@ -1691,23 +1673,40 @@
         <w:t>1037</w:t>
       </w:r>
       <w:r>
-        <w:t>项检查，全部通过。页面精简后另完成语法及</w:t>
-      </w:r>
-      <w:r>
-        <w:t>21</w:t>
-      </w:r>
-      <w:r>
-        <w:t>项前端检查，未重复完整回归。检查覆盖登录权限、课程查询、选退课、任教、成绩、人员管理、关课和数据库异常等场景。最新回归中最后一个名额的竞争完成</w:t>
+        <w:t>项检查。当前提交</w:t>
+      </w:r>
+      <w:r>
+        <w:rPr>
+          <w:rFonts w:ascii="Consolas" w:hAnsi="Consolas"/>
+          <w:sz w:val="18"/>
+        </w:rPr>
+        <w:t>73b5336</w:t>
+      </w:r>
+      <w:r>
+        <w:t>的完整回归完成</w:t>
+      </w:r>
+      <w:r>
+        <w:t>39</w:t>
+      </w:r>
+      <w:r>
+        <w:t>个阶段、</w:t>
+      </w:r>
+      <w:r>
+        <w:t>1067</w:t>
+      </w:r>
+      <w:r>
+        <w:t>项检查，全部通过，覆盖页面精简后的流程和本轮修复。检查包括登录权限、课程查询、选退课、任教、成绩、人员管理、关课和数据库异常，最后一个名额竞争完成</w:t>
       </w:r>
       <w:r>
         <w:t>5</w:t>
       </w:r>
       <w:r>
-        <w:t>轮验证，未出现超额分配。</w:t>
+        <w:t>轮，未出现超额分配。历史各轮结果分别记录，不累加为当前检查数量。</w:t>
       </w:r>
     </w:p>
     <w:p>
       <w:r>
+        <w:lastRenderedPageBreak/>
         <w:t>业务规则需要在页面、服务端和数据库之间保持一致。例如，页面可以提前提示重复课程，但提交时仍需重新检查数量、先修条件和剩余名额；选课和关课包含多项写入，应使用事务保证全部成功或全部撤销。</w:t>
       </w:r>
     </w:p>
@@ -1718,7 +1717,6 @@
     </w:p>
     <w:p>
       <w:r>
-        <w:lastRenderedPageBreak/>
         <w:t>测试不仅要检查操作能否成功，还要确认失败后数据没有发生部分变化。重复提交、取消操作、并发选课和数据库断连等场景，有助于发现正常演示中不容易暴露的问题。</w:t>
       </w:r>
     </w:p>
@@ -1732,7 +1730,7 @@
         <w:pStyle w:val="1"/>
       </w:pPr>
       <w:bookmarkStart w:id="6" w:name="h_db612fb661ac9609d2ab"/>
-      <w:bookmarkStart w:id="7" w:name="_Toc242825463"/>
+      <w:bookmarkStart w:id="7" w:name="_Toc242861775"/>
       <w:r>
         <w:t xml:space="preserve">4 </w:t>
       </w:r>
@@ -1766,6 +1764,7 @@
       </w:r>
     </w:p>
     <w:p>
+      <w:proofErr w:type="spellStart"/>
       <w:r>
         <w:t>页面布局、键盘操作、时间边界和新电脑运行按测试计划检查并记录。成员信息、分工和个人工作记录集中在下节，具体开发安排见</w:t>
       </w:r>
@@ -1773,6 +1772,7 @@
         <w:r>
           <w:t>开发计划</w:t>
         </w:r>
+        <w:proofErr w:type="spellEnd"/>
       </w:hyperlink>
       <w:r>
         <w:t>。</w:t>
@@ -1783,7 +1783,7 @@
         <w:pStyle w:val="1"/>
       </w:pPr>
       <w:bookmarkStart w:id="8" w:name="h_f18102740983e1bd8b16"/>
-      <w:bookmarkStart w:id="9" w:name="_Toc242825464"/>
+      <w:bookmarkStart w:id="9" w:name="_Toc242861776"/>
       <w:r>
         <w:t xml:space="preserve">5 </w:t>
       </w:r>
@@ -2149,7 +2149,7 @@
         <w:pStyle w:val="21"/>
       </w:pPr>
       <w:bookmarkStart w:id="10" w:name="h_45b8718b9801aed05a7d"/>
-      <w:bookmarkStart w:id="11" w:name="_Toc242825465"/>
+      <w:bookmarkStart w:id="11" w:name="_Toc242861777"/>
       <w:r>
         <w:t xml:space="preserve">5.1 </w:t>
       </w:r>
@@ -2249,7 +2249,6 @@
           <w:p>
             <w:pPr>
               <w:pStyle w:val="TableText"/>
-              <w:keepNext/>
               <w:jc w:val="center"/>
             </w:pPr>
             <w:r>
@@ -2265,7 +2264,6 @@
           <w:p>
             <w:pPr>
               <w:pStyle w:val="TableText"/>
-              <w:keepNext/>
             </w:pPr>
             <w:r>
               <w:t>选课、退课及课表由</w:t>
@@ -2319,139 +2317,6 @@
             </w:r>
             <w:r>
               <w:t>查询成绩。</w:t>
-            </w:r>
-          </w:p>
-        </w:tc>
-      </w:tr>
-      <w:tr>
-        <w:trPr>
-          <w:cantSplit/>
-          <w:jc w:val="center"/>
-        </w:trPr>
-        <w:tc>
-          <w:tcPr>
-            <w:tcW w:w="2699" w:type="dxa"/>
-            <w:vAlign w:val="center"/>
-          </w:tcPr>
-          <w:p>
-            <w:pPr>
-              <w:pStyle w:val="TableText"/>
-              <w:keepNext/>
-              <w:jc w:val="center"/>
-            </w:pPr>
-            <w:r>
-              <w:t>问题处理</w:t>
-            </w:r>
-          </w:p>
-        </w:tc>
-        <w:tc>
-          <w:tcPr>
-            <w:tcW w:w="6939" w:type="dxa"/>
-            <w:vAlign w:val="center"/>
-          </w:tcPr>
-          <w:p>
-            <w:pPr>
-              <w:pStyle w:val="TableText"/>
-              <w:keepNext/>
-            </w:pPr>
-            <w:r>
-              <w:t>正式提交在事务内重新检查名额，扣除本人已有占座，失败时保留原方案；名额刷新只用于页面提示。退课后空缺与关课补位共同核对，关联</w:t>
-            </w:r>
-            <w:r>
-              <w:t>D01</w:t>
-            </w:r>
-            <w:r>
-              <w:t>、</w:t>
-            </w:r>
-            <w:r>
-              <w:t>D02</w:t>
-            </w:r>
-            <w:r>
-              <w:t>。</w:t>
-            </w:r>
-          </w:p>
-        </w:tc>
-      </w:tr>
-      <w:tr>
-        <w:trPr>
-          <w:cantSplit/>
-          <w:jc w:val="center"/>
-        </w:trPr>
-        <w:tc>
-          <w:tcPr>
-            <w:tcW w:w="2699" w:type="dxa"/>
-            <w:vAlign w:val="center"/>
-          </w:tcPr>
-          <w:p>
-            <w:pPr>
-              <w:pStyle w:val="TableText"/>
-              <w:keepNext/>
-              <w:jc w:val="center"/>
-            </w:pPr>
-            <w:r>
-              <w:t>验证依据与协作</w:t>
-            </w:r>
-          </w:p>
-        </w:tc>
-        <w:tc>
-          <w:tcPr>
-            <w:tcW w:w="6939" w:type="dxa"/>
-            <w:vAlign w:val="center"/>
-          </w:tcPr>
-          <w:p>
-            <w:pPr>
-              <w:pStyle w:val="TableText"/>
-              <w:keepNext/>
-            </w:pPr>
-            <w:r>
-              <w:t>T04—T07</w:t>
-            </w:r>
-            <w:r>
-              <w:t>、</w:t>
-            </w:r>
-            <w:r>
-              <w:t>T16</w:t>
-            </w:r>
-            <w:r>
-              <w:t>、</w:t>
-            </w:r>
-            <w:r>
-              <w:t>T17</w:t>
-            </w:r>
-            <w:r>
-              <w:t>覆盖选课与草稿等场景；</w:t>
-            </w:r>
-            <w:r>
-              <w:rPr>
-                <w:rFonts w:ascii="Consolas" w:hAnsi="Consolas"/>
-                <w:sz w:val="18"/>
-              </w:rPr>
-              <w:t>http_db_registration.ps1</w:t>
-            </w:r>
-            <w:r>
-              <w:t>检查学生页面，</w:t>
-            </w:r>
-            <w:r>
-              <w:rPr>
-                <w:rFonts w:ascii="Consolas" w:hAnsi="Consolas"/>
-                <w:sz w:val="18"/>
-              </w:rPr>
-              <w:t>selection_ui.test.cjs</w:t>
-            </w:r>
-            <w:r>
-              <w:t>检查选课提示。成绩和关课结果分别与成员</w:t>
-            </w:r>
-            <w:r>
-              <w:t>2</w:t>
-            </w:r>
-            <w:r>
-              <w:t>、成员</w:t>
-            </w:r>
-            <w:r>
-              <w:t>3</w:t>
-            </w:r>
-            <w:r>
-              <w:t>联调。</w:t>
             </w:r>
           </w:p>
         </w:tc>
@@ -2472,6 +2337,136 @@
               <w:jc w:val="center"/>
             </w:pPr>
             <w:r>
+              <w:lastRenderedPageBreak/>
+              <w:t>问题处理</w:t>
+            </w:r>
+          </w:p>
+        </w:tc>
+        <w:tc>
+          <w:tcPr>
+            <w:tcW w:w="6939" w:type="dxa"/>
+            <w:vAlign w:val="center"/>
+          </w:tcPr>
+          <w:p>
+            <w:pPr>
+              <w:pStyle w:val="TableText"/>
+            </w:pPr>
+            <w:r>
+              <w:t>正式提交在事务内重新检查名额，扣除本人已有占座，失败时保留原方案；名额刷新只用于页面提示。退课后空缺与关课补位共同核对，关联</w:t>
+            </w:r>
+            <w:r>
+              <w:t>D01</w:t>
+            </w:r>
+            <w:r>
+              <w:t>、</w:t>
+            </w:r>
+            <w:r>
+              <w:t>D02</w:t>
+            </w:r>
+            <w:r>
+              <w:t>。</w:t>
+            </w:r>
+          </w:p>
+        </w:tc>
+      </w:tr>
+      <w:tr>
+        <w:trPr>
+          <w:cantSplit/>
+          <w:jc w:val="center"/>
+        </w:trPr>
+        <w:tc>
+          <w:tcPr>
+            <w:tcW w:w="2699" w:type="dxa"/>
+            <w:vAlign w:val="center"/>
+          </w:tcPr>
+          <w:p>
+            <w:pPr>
+              <w:pStyle w:val="TableText"/>
+              <w:jc w:val="center"/>
+            </w:pPr>
+            <w:r>
+              <w:t>验证依据与协作</w:t>
+            </w:r>
+          </w:p>
+        </w:tc>
+        <w:tc>
+          <w:tcPr>
+            <w:tcW w:w="6939" w:type="dxa"/>
+            <w:vAlign w:val="center"/>
+          </w:tcPr>
+          <w:p>
+            <w:pPr>
+              <w:pStyle w:val="TableText"/>
+            </w:pPr>
+            <w:r>
+              <w:t>T04—T07</w:t>
+            </w:r>
+            <w:r>
+              <w:t>、</w:t>
+            </w:r>
+            <w:r>
+              <w:t>T16</w:t>
+            </w:r>
+            <w:r>
+              <w:t>、</w:t>
+            </w:r>
+            <w:r>
+              <w:t>T17</w:t>
+            </w:r>
+            <w:r>
+              <w:t>覆盖选课与草稿等场景；</w:t>
+            </w:r>
+            <w:r>
+              <w:rPr>
+                <w:rFonts w:ascii="Consolas" w:hAnsi="Consolas"/>
+                <w:sz w:val="18"/>
+              </w:rPr>
+              <w:t>http_db_registration.ps1</w:t>
+            </w:r>
+            <w:r>
+              <w:t>检查学生页面，</w:t>
+            </w:r>
+            <w:r>
+              <w:rPr>
+                <w:rFonts w:ascii="Consolas" w:hAnsi="Consolas"/>
+                <w:sz w:val="18"/>
+              </w:rPr>
+              <w:t>selection_ui.test.cjs</w:t>
+            </w:r>
+            <w:r>
+              <w:t>检查选课提示。成绩和关课结果分别与成员</w:t>
+            </w:r>
+            <w:r>
+              <w:t>2</w:t>
+            </w:r>
+            <w:r>
+              <w:t>、成员</w:t>
+            </w:r>
+            <w:r>
+              <w:t>3</w:t>
+            </w:r>
+            <w:r>
+              <w:t>联调。</w:t>
+            </w:r>
+          </w:p>
+        </w:tc>
+      </w:tr>
+      <w:tr>
+        <w:trPr>
+          <w:cantSplit/>
+          <w:jc w:val="center"/>
+        </w:trPr>
+        <w:tc>
+          <w:tcPr>
+            <w:tcW w:w="2699" w:type="dxa"/>
+            <w:vAlign w:val="center"/>
+          </w:tcPr>
+          <w:p>
+            <w:pPr>
+              <w:pStyle w:val="TableText"/>
+              <w:jc w:val="center"/>
+            </w:pPr>
+            <w:r>
               <w:t>个人补充</w:t>
             </w:r>
           </w:p>
@@ -2514,9 +2509,8 @@
         <w:pStyle w:val="21"/>
       </w:pPr>
       <w:bookmarkStart w:id="12" w:name="h_863a6d4b43e5d58fcb42"/>
-      <w:bookmarkStart w:id="13" w:name="_Toc242825466"/>
-      <w:r>
-        <w:lastRenderedPageBreak/>
+      <w:bookmarkStart w:id="13" w:name="_Toc242861778"/>
+      <w:r>
         <w:t xml:space="preserve">5.2 </w:t>
       </w:r>
       <w:r>
@@ -2615,7 +2609,6 @@
           <w:p>
             <w:pPr>
               <w:pStyle w:val="TableText"/>
-              <w:keepNext/>
               <w:jc w:val="center"/>
             </w:pPr>
             <w:r>
@@ -2631,7 +2624,6 @@
           <w:p>
             <w:pPr>
               <w:pStyle w:val="TableText"/>
-              <w:keepNext/>
             </w:pPr>
             <w:r>
               <w:t>任教由</w:t>
@@ -2685,139 +2677,6 @@
             </w:r>
             <w:r>
               <w:t>处理成绩保存、更正与清空。</w:t>
-            </w:r>
-          </w:p>
-        </w:tc>
-      </w:tr>
-      <w:tr>
-        <w:trPr>
-          <w:cantSplit/>
-          <w:jc w:val="center"/>
-        </w:trPr>
-        <w:tc>
-          <w:tcPr>
-            <w:tcW w:w="2699" w:type="dxa"/>
-            <w:vAlign w:val="center"/>
-          </w:tcPr>
-          <w:p>
-            <w:pPr>
-              <w:pStyle w:val="TableText"/>
-              <w:keepNext/>
-              <w:jc w:val="center"/>
-            </w:pPr>
-            <w:r>
-              <w:t>问题处理</w:t>
-            </w:r>
-          </w:p>
-        </w:tc>
-        <w:tc>
-          <w:tcPr>
-            <w:tcW w:w="6939" w:type="dxa"/>
-            <w:vAlign w:val="center"/>
-          </w:tcPr>
-          <w:p>
-            <w:pPr>
-              <w:pStyle w:val="TableText"/>
-              <w:keepNext/>
-            </w:pPr>
-            <w:r>
-              <w:t>认领前核对资格、已有任教和全部上课时段；缺少时间时拒绝认领，关联</w:t>
-            </w:r>
-            <w:r>
-              <w:t>D03</w:t>
-            </w:r>
-            <w:r>
-              <w:t>。取消仅限本人主动认领，成绩维护检查本人任教范围及学期状态。</w:t>
-            </w:r>
-          </w:p>
-        </w:tc>
-      </w:tr>
-      <w:tr>
-        <w:trPr>
-          <w:cantSplit/>
-          <w:jc w:val="center"/>
-        </w:trPr>
-        <w:tc>
-          <w:tcPr>
-            <w:tcW w:w="2699" w:type="dxa"/>
-            <w:vAlign w:val="center"/>
-          </w:tcPr>
-          <w:p>
-            <w:pPr>
-              <w:pStyle w:val="TableText"/>
-              <w:keepNext/>
-              <w:jc w:val="center"/>
-            </w:pPr>
-            <w:r>
-              <w:t>验证依据与协作</w:t>
-            </w:r>
-          </w:p>
-        </w:tc>
-        <w:tc>
-          <w:tcPr>
-            <w:tcW w:w="6939" w:type="dxa"/>
-            <w:vAlign w:val="center"/>
-          </w:tcPr>
-          <w:p>
-            <w:pPr>
-              <w:pStyle w:val="TableText"/>
-              <w:keepNext/>
-            </w:pPr>
-            <w:r>
-              <w:t>T08</w:t>
-            </w:r>
-            <w:r>
-              <w:t>、</w:t>
-            </w:r>
-            <w:r>
-              <w:t>T09</w:t>
-            </w:r>
-            <w:r>
-              <w:t>、</w:t>
-            </w:r>
-            <w:r>
-              <w:t>T18</w:t>
-            </w:r>
-            <w:r>
-              <w:t>、</w:t>
-            </w:r>
-            <w:r>
-              <w:t>T19</w:t>
-            </w:r>
-            <w:r>
-              <w:t>覆盖任教、成绩、名单和资格；</w:t>
-            </w:r>
-            <w:r>
-              <w:rPr>
-                <w:rFonts w:ascii="Consolas" w:hAnsi="Consolas"/>
-                <w:sz w:val="18"/>
-              </w:rPr>
-              <w:t>http_db_teacher.ps1</w:t>
-            </w:r>
-            <w:r>
-              <w:t>、</w:t>
-            </w:r>
-            <w:r>
-              <w:rPr>
-                <w:rFonts w:ascii="Consolas" w:hAnsi="Consolas"/>
-                <w:sz w:val="18"/>
-              </w:rPr>
-              <w:t>http_db_grades.ps1</w:t>
-            </w:r>
-            <w:r>
-              <w:t>检查页面流程。与成员</w:t>
-            </w:r>
-            <w:r>
-              <w:t>3</w:t>
-            </w:r>
-            <w:r>
-              <w:t>核对资格，与成员</w:t>
-            </w:r>
-            <w:r>
-              <w:t>1</w:t>
-            </w:r>
-            <w:r>
-              <w:t>核对成绩显示。</w:t>
             </w:r>
           </w:p>
         </w:tc>
@@ -2838,6 +2697,135 @@
               <w:jc w:val="center"/>
             </w:pPr>
             <w:r>
+              <w:t>问题处理</w:t>
+            </w:r>
+          </w:p>
+        </w:tc>
+        <w:tc>
+          <w:tcPr>
+            <w:tcW w:w="6939" w:type="dxa"/>
+            <w:vAlign w:val="center"/>
+          </w:tcPr>
+          <w:p>
+            <w:pPr>
+              <w:pStyle w:val="TableText"/>
+            </w:pPr>
+            <w:r>
+              <w:t>认领前核对资格、已有任教和全部上课时段；缺少时间时拒绝认领，关联</w:t>
+            </w:r>
+            <w:r>
+              <w:t>D03</w:t>
+            </w:r>
+            <w:r>
+              <w:t>。取消仅限本人主动认领，成绩维护检查本人任教范围及学期状态。</w:t>
+            </w:r>
+          </w:p>
+        </w:tc>
+      </w:tr>
+      <w:tr>
+        <w:trPr>
+          <w:cantSplit/>
+          <w:jc w:val="center"/>
+        </w:trPr>
+        <w:tc>
+          <w:tcPr>
+            <w:tcW w:w="2699" w:type="dxa"/>
+            <w:vAlign w:val="center"/>
+          </w:tcPr>
+          <w:p>
+            <w:pPr>
+              <w:pStyle w:val="TableText"/>
+              <w:jc w:val="center"/>
+            </w:pPr>
+            <w:r>
+              <w:t>验证依据与协作</w:t>
+            </w:r>
+          </w:p>
+        </w:tc>
+        <w:tc>
+          <w:tcPr>
+            <w:tcW w:w="6939" w:type="dxa"/>
+            <w:vAlign w:val="center"/>
+          </w:tcPr>
+          <w:p>
+            <w:pPr>
+              <w:pStyle w:val="TableText"/>
+            </w:pPr>
+            <w:r>
+              <w:t>T08</w:t>
+            </w:r>
+            <w:r>
+              <w:t>、</w:t>
+            </w:r>
+            <w:r>
+              <w:t>T09</w:t>
+            </w:r>
+            <w:r>
+              <w:t>、</w:t>
+            </w:r>
+            <w:r>
+              <w:t>T18</w:t>
+            </w:r>
+            <w:r>
+              <w:t>、</w:t>
+            </w:r>
+            <w:r>
+              <w:t>T19</w:t>
+            </w:r>
+            <w:r>
+              <w:t>覆盖任教、成绩、名单和资格；</w:t>
+            </w:r>
+            <w:r>
+              <w:rPr>
+                <w:rFonts w:ascii="Consolas" w:hAnsi="Consolas"/>
+                <w:sz w:val="18"/>
+              </w:rPr>
+              <w:t>http_db_teacher.ps1</w:t>
+            </w:r>
+            <w:r>
+              <w:t>、</w:t>
+            </w:r>
+            <w:r>
+              <w:rPr>
+                <w:rFonts w:ascii="Consolas" w:hAnsi="Consolas"/>
+                <w:sz w:val="18"/>
+              </w:rPr>
+              <w:t>http_db_grades.ps1</w:t>
+            </w:r>
+            <w:r>
+              <w:t>检查页面流程。与成员</w:t>
+            </w:r>
+            <w:r>
+              <w:t>3</w:t>
+            </w:r>
+            <w:r>
+              <w:t>核对资格，与成员</w:t>
+            </w:r>
+            <w:r>
+              <w:t>1</w:t>
+            </w:r>
+            <w:r>
+              <w:t>核对成绩显示。</w:t>
+            </w:r>
+          </w:p>
+        </w:tc>
+      </w:tr>
+      <w:tr>
+        <w:trPr>
+          <w:cantSplit/>
+          <w:jc w:val="center"/>
+        </w:trPr>
+        <w:tc>
+          <w:tcPr>
+            <w:tcW w:w="2699" w:type="dxa"/>
+            <w:vAlign w:val="center"/>
+          </w:tcPr>
+          <w:p>
+            <w:pPr>
+              <w:pStyle w:val="TableText"/>
+              <w:jc w:val="center"/>
+            </w:pPr>
+            <w:r>
               <w:t>个人补充</w:t>
             </w:r>
           </w:p>
@@ -2880,7 +2868,7 @@
         <w:pStyle w:val="21"/>
       </w:pPr>
       <w:bookmarkStart w:id="14" w:name="h_9eb9cfd86d6fade58376"/>
-      <w:bookmarkStart w:id="15" w:name="_Toc242825467"/>
+      <w:bookmarkStart w:id="15" w:name="_Toc242861779"/>
       <w:r>
         <w:t xml:space="preserve">5.3 </w:t>
       </w:r>
@@ -2980,7 +2968,6 @@
           <w:p>
             <w:pPr>
               <w:pStyle w:val="TableText"/>
-              <w:keepNext/>
               <w:jc w:val="center"/>
             </w:pPr>
             <w:r>
@@ -2996,7 +2983,6 @@
           <w:p>
             <w:pPr>
               <w:pStyle w:val="TableText"/>
-              <w:keepNext/>
             </w:pPr>
             <w:r>
               <w:rPr>
@@ -3037,155 +3023,6 @@
             </w:r>
             <w:r>
               <w:t>提供资格管理和模拟计费操作。</w:t>
-            </w:r>
-          </w:p>
-        </w:tc>
-      </w:tr>
-      <w:tr>
-        <w:trPr>
-          <w:cantSplit/>
-          <w:jc w:val="center"/>
-        </w:trPr>
-        <w:tc>
-          <w:tcPr>
-            <w:tcW w:w="2699" w:type="dxa"/>
-            <w:vAlign w:val="center"/>
-          </w:tcPr>
-          <w:p>
-            <w:pPr>
-              <w:pStyle w:val="TableText"/>
-              <w:keepNext/>
-              <w:jc w:val="center"/>
-            </w:pPr>
-            <w:r>
-              <w:t>问题处理</w:t>
-            </w:r>
-          </w:p>
-        </w:tc>
-        <w:tc>
-          <w:tcPr>
-            <w:tcW w:w="6939" w:type="dxa"/>
-            <w:vAlign w:val="center"/>
-          </w:tcPr>
-          <w:p>
-            <w:pPr>
-              <w:pStyle w:val="TableText"/>
-              <w:keepNext/>
-            </w:pPr>
-            <w:r>
-              <w:t>关课先补位再判断最低人数，失败时撤销整次修改，关联</w:t>
-            </w:r>
-            <w:r>
-              <w:t>D01</w:t>
-            </w:r>
-            <w:r>
-              <w:t>、</w:t>
-            </w:r>
-            <w:r>
-              <w:t>D02</w:t>
-            </w:r>
-            <w:r>
-              <w:t>。人员有关联记录时拒绝删除，资料编辑比较版本；账号停用和密码重置与成员</w:t>
-            </w:r>
-            <w:r>
-              <w:t>4</w:t>
-            </w:r>
-            <w:r>
-              <w:t>共同核对，关联</w:t>
-            </w:r>
-            <w:r>
-              <w:t>D04</w:t>
-            </w:r>
-            <w:r>
-              <w:t>、</w:t>
-            </w:r>
-            <w:r>
-              <w:t>D05</w:t>
-            </w:r>
-            <w:r>
-              <w:t>。</w:t>
-            </w:r>
-          </w:p>
-        </w:tc>
-      </w:tr>
-      <w:tr>
-        <w:trPr>
-          <w:cantSplit/>
-          <w:jc w:val="center"/>
-        </w:trPr>
-        <w:tc>
-          <w:tcPr>
-            <w:tcW w:w="2699" w:type="dxa"/>
-            <w:vAlign w:val="center"/>
-          </w:tcPr>
-          <w:p>
-            <w:pPr>
-              <w:pStyle w:val="TableText"/>
-              <w:keepNext/>
-              <w:jc w:val="center"/>
-            </w:pPr>
-            <w:r>
-              <w:t>验证依据与协作</w:t>
-            </w:r>
-          </w:p>
-        </w:tc>
-        <w:tc>
-          <w:tcPr>
-            <w:tcW w:w="6939" w:type="dxa"/>
-            <w:vAlign w:val="center"/>
-          </w:tcPr>
-          <w:p>
-            <w:pPr>
-              <w:pStyle w:val="TableText"/>
-              <w:keepNext/>
-            </w:pPr>
-            <w:r>
-              <w:t>T10—T12</w:t>
-            </w:r>
-            <w:r>
-              <w:t>、</w:t>
-            </w:r>
-            <w:r>
-              <w:t>T19</w:t>
-            </w:r>
-            <w:r>
-              <w:t>、</w:t>
-            </w:r>
-            <w:r>
-              <w:t>T20</w:t>
-            </w:r>
-            <w:r>
-              <w:t>覆盖人员、关课、资格及计费；</w:t>
-            </w:r>
-            <w:r>
-              <w:rPr>
-                <w:rFonts w:ascii="Consolas" w:hAnsi="Consolas"/>
-                <w:sz w:val="18"/>
-              </w:rPr>
-              <w:t>http_db_people.ps1</w:t>
-            </w:r>
-            <w:r>
-              <w:t>、</w:t>
-            </w:r>
-            <w:r>
-              <w:rPr>
-                <w:rFonts w:ascii="Consolas" w:hAnsi="Consolas"/>
-                <w:sz w:val="18"/>
-              </w:rPr>
-              <w:t>http_db_closure.ps1</w:t>
-            </w:r>
-            <w:r>
-              <w:t>检查页面流程，</w:t>
-            </w:r>
-            <w:r>
-              <w:rPr>
-                <w:rFonts w:ascii="Consolas" w:hAnsi="Consolas"/>
-                <w:sz w:val="18"/>
-              </w:rPr>
-              <w:t>db_extreme.php</w:t>
-            </w:r>
-            <w:r>
-              <w:t>检查关课与回滚场景。</w:t>
             </w:r>
           </w:p>
         </w:tc>
@@ -3206,6 +3043,151 @@
               <w:jc w:val="center"/>
             </w:pPr>
             <w:r>
+              <w:t>问题处理</w:t>
+            </w:r>
+          </w:p>
+        </w:tc>
+        <w:tc>
+          <w:tcPr>
+            <w:tcW w:w="6939" w:type="dxa"/>
+            <w:vAlign w:val="center"/>
+          </w:tcPr>
+          <w:p>
+            <w:pPr>
+              <w:pStyle w:val="TableText"/>
+            </w:pPr>
+            <w:r>
+              <w:t>关课先补位再判断最低人数，失败时撤销整次修改，关联</w:t>
+            </w:r>
+            <w:r>
+              <w:t>D01</w:t>
+            </w:r>
+            <w:r>
+              <w:t>、</w:t>
+            </w:r>
+            <w:r>
+              <w:t>D02</w:t>
+            </w:r>
+            <w:r>
+              <w:t>。人员有关联记录时拒绝删除，资料编辑比较版本；账号停用和密码重置与成员</w:t>
+            </w:r>
+            <w:r>
+              <w:t>4</w:t>
+            </w:r>
+            <w:r>
+              <w:t>共同核对，关联</w:t>
+            </w:r>
+            <w:r>
+              <w:t>D04</w:t>
+            </w:r>
+            <w:r>
+              <w:t>、</w:t>
+            </w:r>
+            <w:r>
+              <w:t>D05</w:t>
+            </w:r>
+            <w:r>
+              <w:t>。</w:t>
+            </w:r>
+          </w:p>
+        </w:tc>
+      </w:tr>
+      <w:tr>
+        <w:trPr>
+          <w:cantSplit/>
+          <w:jc w:val="center"/>
+        </w:trPr>
+        <w:tc>
+          <w:tcPr>
+            <w:tcW w:w="2699" w:type="dxa"/>
+            <w:vAlign w:val="center"/>
+          </w:tcPr>
+          <w:p>
+            <w:pPr>
+              <w:pStyle w:val="TableText"/>
+              <w:jc w:val="center"/>
+            </w:pPr>
+            <w:r>
+              <w:t>验证依据与协作</w:t>
+            </w:r>
+          </w:p>
+        </w:tc>
+        <w:tc>
+          <w:tcPr>
+            <w:tcW w:w="6939" w:type="dxa"/>
+            <w:vAlign w:val="center"/>
+          </w:tcPr>
+          <w:p>
+            <w:pPr>
+              <w:pStyle w:val="TableText"/>
+            </w:pPr>
+            <w:r>
+              <w:t>T10—T12</w:t>
+            </w:r>
+            <w:r>
+              <w:t>、</w:t>
+            </w:r>
+            <w:r>
+              <w:t>T19</w:t>
+            </w:r>
+            <w:r>
+              <w:t>、</w:t>
+            </w:r>
+            <w:r>
+              <w:t>T20</w:t>
+            </w:r>
+            <w:r>
+              <w:t>覆盖人员、关课、资格及计费；</w:t>
+            </w:r>
+            <w:r>
+              <w:rPr>
+                <w:rFonts w:ascii="Consolas" w:hAnsi="Consolas"/>
+                <w:sz w:val="18"/>
+              </w:rPr>
+              <w:t>http_db_people.ps1</w:t>
+            </w:r>
+            <w:r>
+              <w:t>、</w:t>
+            </w:r>
+            <w:r>
+              <w:rPr>
+                <w:rFonts w:ascii="Consolas" w:hAnsi="Consolas"/>
+                <w:sz w:val="18"/>
+              </w:rPr>
+              <w:t>http_db_closure.ps1</w:t>
+            </w:r>
+            <w:r>
+              <w:t>检查页面流程，</w:t>
+            </w:r>
+            <w:r>
+              <w:rPr>
+                <w:rFonts w:ascii="Consolas" w:hAnsi="Consolas"/>
+                <w:sz w:val="18"/>
+              </w:rPr>
+              <w:t>db_extreme.php</w:t>
+            </w:r>
+            <w:r>
+              <w:t>检查关课与回滚场景。</w:t>
+            </w:r>
+          </w:p>
+        </w:tc>
+      </w:tr>
+      <w:tr>
+        <w:trPr>
+          <w:cantSplit/>
+          <w:jc w:val="center"/>
+        </w:trPr>
+        <w:tc>
+          <w:tcPr>
+            <w:tcW w:w="2699" w:type="dxa"/>
+            <w:vAlign w:val="center"/>
+          </w:tcPr>
+          <w:p>
+            <w:pPr>
+              <w:pStyle w:val="TableText"/>
+              <w:jc w:val="center"/>
+            </w:pPr>
+            <w:r>
               <w:t>个人补充</w:t>
             </w:r>
           </w:p>
@@ -3248,7 +3230,7 @@
         <w:pStyle w:val="21"/>
       </w:pPr>
       <w:bookmarkStart w:id="16" w:name="h_c713756adb79d08b5080"/>
-      <w:bookmarkStart w:id="17" w:name="_Toc242825468"/>
+      <w:bookmarkStart w:id="17" w:name="_Toc242861780"/>
       <w:r>
         <w:t xml:space="preserve">5.4 </w:t>
       </w:r>
@@ -3348,7 +3330,6 @@
           <w:p>
             <w:pPr>
               <w:pStyle w:val="TableText"/>
-              <w:keepNext/>
               <w:jc w:val="center"/>
             </w:pPr>
             <w:r>
@@ -3364,7 +3345,6 @@
           <w:p>
             <w:pPr>
               <w:pStyle w:val="TableText"/>
-              <w:keepNext/>
             </w:pPr>
             <w:r>
               <w:rPr>
@@ -3441,139 +3421,6 @@
             </w:r>
             <w:r>
               <w:t>说明配置及启动。</w:t>
-            </w:r>
-          </w:p>
-        </w:tc>
-      </w:tr>
-      <w:tr>
-        <w:trPr>
-          <w:cantSplit/>
-          <w:jc w:val="center"/>
-        </w:trPr>
-        <w:tc>
-          <w:tcPr>
-            <w:tcW w:w="2699" w:type="dxa"/>
-            <w:vAlign w:val="center"/>
-          </w:tcPr>
-          <w:p>
-            <w:pPr>
-              <w:pStyle w:val="TableText"/>
-              <w:keepNext/>
-              <w:jc w:val="center"/>
-            </w:pPr>
-            <w:r>
-              <w:t>问题处理</w:t>
-            </w:r>
-          </w:p>
-        </w:tc>
-        <w:tc>
-          <w:tcPr>
-            <w:tcW w:w="6939" w:type="dxa"/>
-            <w:vAlign w:val="center"/>
-          </w:tcPr>
-          <w:p>
-            <w:pPr>
-              <w:pStyle w:val="TableText"/>
-              <w:keepNext/>
-            </w:pPr>
-            <w:r>
-              <w:t>登录兼容已有明文与哈希密码，新增和重置密码保存哈希，关联</w:t>
-            </w:r>
-            <w:r>
-              <w:t>D05</w:t>
-            </w:r>
-            <w:r>
-              <w:t>。配置按强制演示、环境变量及本机配置的规则读取，保留密码字符串</w:t>
-            </w:r>
-            <w:r>
-              <w:t>0</w:t>
-            </w:r>
-            <w:r>
-              <w:t>，关联</w:t>
-            </w:r>
-            <w:r>
-              <w:t>D06</w:t>
-            </w:r>
-            <w:r>
-              <w:t>。</w:t>
-            </w:r>
-          </w:p>
-        </w:tc>
-      </w:tr>
-      <w:tr>
-        <w:trPr>
-          <w:cantSplit/>
-          <w:jc w:val="center"/>
-        </w:trPr>
-        <w:tc>
-          <w:tcPr>
-            <w:tcW w:w="2699" w:type="dxa"/>
-            <w:vAlign w:val="center"/>
-          </w:tcPr>
-          <w:p>
-            <w:pPr>
-              <w:pStyle w:val="TableText"/>
-              <w:keepNext/>
-              <w:jc w:val="center"/>
-            </w:pPr>
-            <w:r>
-              <w:t>验证依据与协作</w:t>
-            </w:r>
-          </w:p>
-        </w:tc>
-        <w:tc>
-          <w:tcPr>
-            <w:tcW w:w="6939" w:type="dxa"/>
-            <w:vAlign w:val="center"/>
-          </w:tcPr>
-          <w:p>
-            <w:pPr>
-              <w:pStyle w:val="TableText"/>
-              <w:keepNext/>
-            </w:pPr>
-            <w:r>
-              <w:t>T01—T03</w:t>
-            </w:r>
-            <w:r>
-              <w:t>、</w:t>
-            </w:r>
-            <w:r>
-              <w:t>T13—T15</w:t>
-            </w:r>
-            <w:r>
-              <w:t>、</w:t>
-            </w:r>
-            <w:r>
-              <w:t>T21</w:t>
-            </w:r>
-            <w:r>
-              <w:t>、</w:t>
-            </w:r>
-            <w:r>
-              <w:t>T22</w:t>
-            </w:r>
-            <w:r>
-              <w:t>覆盖登录、查询、异常及目录；</w:t>
-            </w:r>
-            <w:r>
-              <w:rPr>
-                <w:rFonts w:ascii="Consolas" w:hAnsi="Consolas"/>
-                <w:sz w:val="18"/>
-              </w:rPr>
-              <w:t>http_password.php</w:t>
-            </w:r>
-            <w:r>
-              <w:t>和</w:t>
-            </w:r>
-            <w:r>
-              <w:rPr>
-                <w:rFonts w:ascii="Consolas" w:hAnsi="Consolas"/>
-                <w:sz w:val="18"/>
-              </w:rPr>
-              <w:t>config_rules.php</w:t>
-            </w:r>
-            <w:r>
-              <w:t>检查密码与配置。数据库样例由各模块确认后汇总，公共页面按测试计划核对。</w:t>
             </w:r>
           </w:p>
         </w:tc>
@@ -3594,6 +3441,136 @@
               <w:jc w:val="center"/>
             </w:pPr>
             <w:r>
+              <w:lastRenderedPageBreak/>
+              <w:t>问题处理</w:t>
+            </w:r>
+          </w:p>
+        </w:tc>
+        <w:tc>
+          <w:tcPr>
+            <w:tcW w:w="6939" w:type="dxa"/>
+            <w:vAlign w:val="center"/>
+          </w:tcPr>
+          <w:p>
+            <w:pPr>
+              <w:pStyle w:val="TableText"/>
+            </w:pPr>
+            <w:r>
+              <w:t>登录兼容已有明文与哈希密码，新增和重置密码保存哈希，关联</w:t>
+            </w:r>
+            <w:r>
+              <w:t>D05</w:t>
+            </w:r>
+            <w:r>
+              <w:t>。配置按强制演示、环境变量及本机配置的规则读取，保留密码字符串</w:t>
+            </w:r>
+            <w:r>
+              <w:t>0</w:t>
+            </w:r>
+            <w:r>
+              <w:t>，关联</w:t>
+            </w:r>
+            <w:r>
+              <w:t>D06</w:t>
+            </w:r>
+            <w:r>
+              <w:t>。</w:t>
+            </w:r>
+          </w:p>
+        </w:tc>
+      </w:tr>
+      <w:tr>
+        <w:trPr>
+          <w:cantSplit/>
+          <w:jc w:val="center"/>
+        </w:trPr>
+        <w:tc>
+          <w:tcPr>
+            <w:tcW w:w="2699" w:type="dxa"/>
+            <w:vAlign w:val="center"/>
+          </w:tcPr>
+          <w:p>
+            <w:pPr>
+              <w:pStyle w:val="TableText"/>
+              <w:jc w:val="center"/>
+            </w:pPr>
+            <w:r>
+              <w:t>验证依据与协作</w:t>
+            </w:r>
+          </w:p>
+        </w:tc>
+        <w:tc>
+          <w:tcPr>
+            <w:tcW w:w="6939" w:type="dxa"/>
+            <w:vAlign w:val="center"/>
+          </w:tcPr>
+          <w:p>
+            <w:pPr>
+              <w:pStyle w:val="TableText"/>
+            </w:pPr>
+            <w:r>
+              <w:t>T01—T03</w:t>
+            </w:r>
+            <w:r>
+              <w:t>、</w:t>
+            </w:r>
+            <w:r>
+              <w:t>T13—T15</w:t>
+            </w:r>
+            <w:r>
+              <w:t>、</w:t>
+            </w:r>
+            <w:r>
+              <w:t>T21</w:t>
+            </w:r>
+            <w:r>
+              <w:t>、</w:t>
+            </w:r>
+            <w:r>
+              <w:t>T22</w:t>
+            </w:r>
+            <w:r>
+              <w:t>覆盖登录、查询、异常及目录；</w:t>
+            </w:r>
+            <w:r>
+              <w:rPr>
+                <w:rFonts w:ascii="Consolas" w:hAnsi="Consolas"/>
+                <w:sz w:val="18"/>
+              </w:rPr>
+              <w:t>http_password.php</w:t>
+            </w:r>
+            <w:r>
+              <w:t>和</w:t>
+            </w:r>
+            <w:r>
+              <w:rPr>
+                <w:rFonts w:ascii="Consolas" w:hAnsi="Consolas"/>
+                <w:sz w:val="18"/>
+              </w:rPr>
+              <w:t>config_rules.php</w:t>
+            </w:r>
+            <w:r>
+              <w:t>检查密码与配置。数据库样例由各模块确认后汇总，公共页面按测试计划核对。</w:t>
+            </w:r>
+          </w:p>
+        </w:tc>
+      </w:tr>
+      <w:tr>
+        <w:trPr>
+          <w:cantSplit/>
+          <w:jc w:val="center"/>
+        </w:trPr>
+        <w:tc>
+          <w:tcPr>
+            <w:tcW w:w="2699" w:type="dxa"/>
+            <w:vAlign w:val="center"/>
+          </w:tcPr>
+          <w:p>
+            <w:pPr>
+              <w:pStyle w:val="TableText"/>
+              <w:jc w:val="center"/>
+            </w:pPr>
+            <w:r>
               <w:t>个人补充</w:t>
             </w:r>
           </w:p>
@@ -3636,9 +3613,8 @@
         <w:pStyle w:val="21"/>
       </w:pPr>
       <w:bookmarkStart w:id="18" w:name="h_cc9f4a77e1876c69ca0c"/>
-      <w:bookmarkStart w:id="19" w:name="_Toc242825469"/>
-      <w:r>
-        <w:lastRenderedPageBreak/>
+      <w:bookmarkStart w:id="19" w:name="_Toc242861781"/>
+      <w:r>
         <w:t xml:space="preserve">5.5 </w:t>
       </w:r>
       <w:r>
@@ -3803,7 +3779,6 @@
           <w:p>
             <w:pPr>
               <w:pStyle w:val="TableText"/>
-              <w:keepNext/>
               <w:jc w:val="center"/>
             </w:pPr>
             <w:r>
@@ -3822,7 +3797,6 @@
           <w:p>
             <w:pPr>
               <w:pStyle w:val="TableText"/>
-              <w:keepNext/>
               <w:jc w:val="center"/>
             </w:pPr>
             <w:r>
@@ -3838,7 +3812,6 @@
           <w:p>
             <w:pPr>
               <w:pStyle w:val="TableText"/>
-              <w:keepNext/>
               <w:jc w:val="center"/>
             </w:pPr>
             <w:r>
@@ -3854,7 +3827,6 @@
           <w:p>
             <w:pPr>
               <w:pStyle w:val="TableText"/>
-              <w:keepNext/>
               <w:jc w:val="center"/>
             </w:pPr>
             <w:r>
@@ -3870,185 +3842,6 @@
           <w:p>
             <w:pPr>
               <w:pStyle w:val="TableText"/>
-              <w:keepNext/>
-              <w:jc w:val="center"/>
-            </w:pPr>
-            <w:r>
-              <w:t>待填</w:t>
-            </w:r>
-          </w:p>
-        </w:tc>
-      </w:tr>
-      <w:tr>
-        <w:trPr>
-          <w:cantSplit/>
-          <w:jc w:val="center"/>
-        </w:trPr>
-        <w:tc>
-          <w:tcPr>
-            <w:tcW w:w="1349" w:type="dxa"/>
-            <w:vAlign w:val="center"/>
-          </w:tcPr>
-          <w:p>
-            <w:pPr>
-              <w:pStyle w:val="TableText"/>
-              <w:keepNext/>
-              <w:jc w:val="center"/>
-            </w:pPr>
-            <w:r>
-              <w:t>成员</w:t>
-            </w:r>
-            <w:r>
-              <w:t>2</w:t>
-            </w:r>
-          </w:p>
-        </w:tc>
-        <w:tc>
-          <w:tcPr>
-            <w:tcW w:w="1735" w:type="dxa"/>
-            <w:vAlign w:val="center"/>
-          </w:tcPr>
-          <w:p>
-            <w:pPr>
-              <w:pStyle w:val="TableText"/>
-              <w:keepNext/>
-              <w:jc w:val="center"/>
-            </w:pPr>
-            <w:r>
-              <w:t>待填</w:t>
-            </w:r>
-          </w:p>
-        </w:tc>
-        <w:tc>
-          <w:tcPr>
-            <w:tcW w:w="1735" w:type="dxa"/>
-            <w:vAlign w:val="center"/>
-          </w:tcPr>
-          <w:p>
-            <w:pPr>
-              <w:pStyle w:val="TableText"/>
-              <w:keepNext/>
-              <w:jc w:val="center"/>
-            </w:pPr>
-            <w:r>
-              <w:t>待填</w:t>
-            </w:r>
-          </w:p>
-        </w:tc>
-        <w:tc>
-          <w:tcPr>
-            <w:tcW w:w="2120" w:type="dxa"/>
-            <w:vAlign w:val="center"/>
-          </w:tcPr>
-          <w:p>
-            <w:pPr>
-              <w:pStyle w:val="TableText"/>
-              <w:keepNext/>
-              <w:jc w:val="center"/>
-            </w:pPr>
-            <w:r>
-              <w:t>待填</w:t>
-            </w:r>
-          </w:p>
-        </w:tc>
-        <w:tc>
-          <w:tcPr>
-            <w:tcW w:w="2699" w:type="dxa"/>
-            <w:vAlign w:val="center"/>
-          </w:tcPr>
-          <w:p>
-            <w:pPr>
-              <w:pStyle w:val="TableText"/>
-              <w:keepNext/>
-              <w:jc w:val="center"/>
-            </w:pPr>
-            <w:r>
-              <w:t>待填</w:t>
-            </w:r>
-          </w:p>
-        </w:tc>
-      </w:tr>
-      <w:tr>
-        <w:trPr>
-          <w:cantSplit/>
-          <w:jc w:val="center"/>
-        </w:trPr>
-        <w:tc>
-          <w:tcPr>
-            <w:tcW w:w="1349" w:type="dxa"/>
-            <w:vAlign w:val="center"/>
-          </w:tcPr>
-          <w:p>
-            <w:pPr>
-              <w:pStyle w:val="TableText"/>
-              <w:keepNext/>
-              <w:jc w:val="center"/>
-            </w:pPr>
-            <w:r>
-              <w:t>成员</w:t>
-            </w:r>
-            <w:r>
-              <w:t>3</w:t>
-            </w:r>
-          </w:p>
-        </w:tc>
-        <w:tc>
-          <w:tcPr>
-            <w:tcW w:w="1735" w:type="dxa"/>
-            <w:vAlign w:val="center"/>
-          </w:tcPr>
-          <w:p>
-            <w:pPr>
-              <w:pStyle w:val="TableText"/>
-              <w:keepNext/>
-              <w:jc w:val="center"/>
-            </w:pPr>
-            <w:r>
-              <w:t>待填</w:t>
-            </w:r>
-          </w:p>
-        </w:tc>
-        <w:tc>
-          <w:tcPr>
-            <w:tcW w:w="1735" w:type="dxa"/>
-            <w:vAlign w:val="center"/>
-          </w:tcPr>
-          <w:p>
-            <w:pPr>
-              <w:pStyle w:val="TableText"/>
-              <w:keepNext/>
-              <w:jc w:val="center"/>
-            </w:pPr>
-            <w:r>
-              <w:t>待填</w:t>
-            </w:r>
-          </w:p>
-        </w:tc>
-        <w:tc>
-          <w:tcPr>
-            <w:tcW w:w="2120" w:type="dxa"/>
-            <w:vAlign w:val="center"/>
-          </w:tcPr>
-          <w:p>
-            <w:pPr>
-              <w:pStyle w:val="TableText"/>
-              <w:keepNext/>
-              <w:jc w:val="center"/>
-            </w:pPr>
-            <w:r>
-              <w:t>待填</w:t>
-            </w:r>
-          </w:p>
-        </w:tc>
-        <w:tc>
-          <w:tcPr>
-            <w:tcW w:w="2699" w:type="dxa"/>
-            <w:vAlign w:val="center"/>
-          </w:tcPr>
-          <w:p>
-            <w:pPr>
-              <w:pStyle w:val="TableText"/>
-              <w:keepNext/>
               <w:jc w:val="center"/>
             </w:pPr>
             <w:r>
@@ -4076,7 +3869,7 @@
               <w:t>成员</w:t>
             </w:r>
             <w:r>
-              <w:t>4</w:t>
+              <w:t>2</w:t>
             </w:r>
           </w:p>
         </w:tc>
@@ -4141,6 +3934,174 @@
           </w:p>
         </w:tc>
       </w:tr>
+      <w:tr>
+        <w:trPr>
+          <w:cantSplit/>
+          <w:jc w:val="center"/>
+        </w:trPr>
+        <w:tc>
+          <w:tcPr>
+            <w:tcW w:w="1349" w:type="dxa"/>
+            <w:vAlign w:val="center"/>
+          </w:tcPr>
+          <w:p>
+            <w:pPr>
+              <w:pStyle w:val="TableText"/>
+              <w:jc w:val="center"/>
+            </w:pPr>
+            <w:r>
+              <w:t>成员</w:t>
+            </w:r>
+            <w:r>
+              <w:t>3</w:t>
+            </w:r>
+          </w:p>
+        </w:tc>
+        <w:tc>
+          <w:tcPr>
+            <w:tcW w:w="1735" w:type="dxa"/>
+            <w:vAlign w:val="center"/>
+          </w:tcPr>
+          <w:p>
+            <w:pPr>
+              <w:pStyle w:val="TableText"/>
+              <w:jc w:val="center"/>
+            </w:pPr>
+            <w:r>
+              <w:t>待填</w:t>
+            </w:r>
+          </w:p>
+        </w:tc>
+        <w:tc>
+          <w:tcPr>
+            <w:tcW w:w="1735" w:type="dxa"/>
+            <w:vAlign w:val="center"/>
+          </w:tcPr>
+          <w:p>
+            <w:pPr>
+              <w:pStyle w:val="TableText"/>
+              <w:jc w:val="center"/>
+            </w:pPr>
+            <w:r>
+              <w:t>待填</w:t>
+            </w:r>
+          </w:p>
+        </w:tc>
+        <w:tc>
+          <w:tcPr>
+            <w:tcW w:w="2120" w:type="dxa"/>
+            <w:vAlign w:val="center"/>
+          </w:tcPr>
+          <w:p>
+            <w:pPr>
+              <w:pStyle w:val="TableText"/>
+              <w:jc w:val="center"/>
+            </w:pPr>
+            <w:r>
+              <w:t>待填</w:t>
+            </w:r>
+          </w:p>
+        </w:tc>
+        <w:tc>
+          <w:tcPr>
+            <w:tcW w:w="2699" w:type="dxa"/>
+            <w:vAlign w:val="center"/>
+          </w:tcPr>
+          <w:p>
+            <w:pPr>
+              <w:pStyle w:val="TableText"/>
+              <w:jc w:val="center"/>
+            </w:pPr>
+            <w:r>
+              <w:t>待填</w:t>
+            </w:r>
+          </w:p>
+        </w:tc>
+      </w:tr>
+      <w:tr>
+        <w:trPr>
+          <w:cantSplit/>
+          <w:jc w:val="center"/>
+        </w:trPr>
+        <w:tc>
+          <w:tcPr>
+            <w:tcW w:w="1349" w:type="dxa"/>
+            <w:vAlign w:val="center"/>
+          </w:tcPr>
+          <w:p>
+            <w:pPr>
+              <w:pStyle w:val="TableText"/>
+              <w:jc w:val="center"/>
+            </w:pPr>
+            <w:r>
+              <w:t>成员</w:t>
+            </w:r>
+            <w:r>
+              <w:t>4</w:t>
+            </w:r>
+          </w:p>
+        </w:tc>
+        <w:tc>
+          <w:tcPr>
+            <w:tcW w:w="1735" w:type="dxa"/>
+            <w:vAlign w:val="center"/>
+          </w:tcPr>
+          <w:p>
+            <w:pPr>
+              <w:pStyle w:val="TableText"/>
+              <w:jc w:val="center"/>
+            </w:pPr>
+            <w:r>
+              <w:t>待填</w:t>
+            </w:r>
+          </w:p>
+        </w:tc>
+        <w:tc>
+          <w:tcPr>
+            <w:tcW w:w="1735" w:type="dxa"/>
+            <w:vAlign w:val="center"/>
+          </w:tcPr>
+          <w:p>
+            <w:pPr>
+              <w:pStyle w:val="TableText"/>
+              <w:jc w:val="center"/>
+            </w:pPr>
+            <w:r>
+              <w:t>待填</w:t>
+            </w:r>
+          </w:p>
+        </w:tc>
+        <w:tc>
+          <w:tcPr>
+            <w:tcW w:w="2120" w:type="dxa"/>
+            <w:vAlign w:val="center"/>
+          </w:tcPr>
+          <w:p>
+            <w:pPr>
+              <w:pStyle w:val="TableText"/>
+              <w:jc w:val="center"/>
+            </w:pPr>
+            <w:r>
+              <w:t>待填</w:t>
+            </w:r>
+          </w:p>
+        </w:tc>
+        <w:tc>
+          <w:tcPr>
+            <w:tcW w:w="2699" w:type="dxa"/>
+            <w:vAlign w:val="center"/>
+          </w:tcPr>
+          <w:p>
+            <w:pPr>
+              <w:pStyle w:val="TableText"/>
+              <w:jc w:val="center"/>
+            </w:pPr>
+            <w:r>
+              <w:t>待填</w:t>
+            </w:r>
+          </w:p>
+        </w:tc>
+      </w:tr>
     </w:tbl>
     <w:p>
       <w:pPr>
@@ -4163,7 +4124,7 @@
         <w:pStyle w:val="1"/>
       </w:pPr>
       <w:bookmarkStart w:id="20" w:name="h_40ea459707d3329c5dcb"/>
-      <w:bookmarkStart w:id="21" w:name="_Toc242825470"/>
+      <w:bookmarkStart w:id="21" w:name="_Toc242861782"/>
       <w:r>
         <w:t xml:space="preserve">6 </w:t>
       </w:r>
@@ -4219,6 +4180,9 @@
     </w:p>
     <w:p>
       <w:r>
+        <w:t>截至</w:t>
+      </w:r>
+      <w:r>
         <w:t>2026</w:t>
       </w:r>
       <w:r>
@@ -4231,82 +4195,118 @@
         <w:t>月</w:t>
       </w:r>
       <w:r>
+        <w:t>14</w:t>
+      </w:r>
+      <w:r>
+        <w:t>日，当前代码提交</w:t>
+      </w:r>
+      <w:r>
+        <w:rPr>
+          <w:rFonts w:ascii="Consolas" w:hAnsi="Consolas"/>
+          <w:sz w:val="18"/>
+        </w:rPr>
+        <w:t>73b5336</w:t>
+      </w:r>
+      <w:r>
+        <w:t>已完成独立临时</w:t>
+      </w:r>
+      <w:r>
+        <w:t>MySQL</w:t>
+      </w:r>
+      <w:r>
+        <w:t>、</w:t>
+      </w:r>
+      <w:r>
+        <w:t>PHP</w:t>
+      </w:r>
+      <w:r>
+        <w:t>服务及会话目录中的完整回归：</w:t>
+      </w:r>
+      <w:r>
+        <w:t>39</w:t>
+      </w:r>
+      <w:r>
+        <w:t>个阶段、</w:t>
+      </w:r>
+      <w:r>
+        <w:t>1067</w:t>
+      </w:r>
+      <w:r>
+        <w:t>项检查全部通过，退出码</w:t>
+      </w:r>
+      <w:r>
+        <w:t>0</w:t>
+      </w:r>
+      <w:r>
+        <w:t>，最后一席竞争执行</w:t>
+      </w:r>
+      <w:r>
+        <w:t>5</w:t>
+      </w:r>
+      <w:r>
+        <w:t>轮。该回归覆盖页面精简后的实现，以及先修课、秒级时间冲突和数据库连接复用修复；其中先修与时间边界</w:t>
+      </w:r>
+      <w:r>
         <w:t>13</w:t>
       </w:r>
       <w:r>
-        <w:t>日业务版本在独立临时</w:t>
-      </w:r>
-      <w:r>
-        <w:t>MySQL</w:t>
-      </w:r>
-      <w:r>
-        <w:t>中完成</w:t>
-      </w:r>
-      <w:r>
-        <w:t>37</w:t>
-      </w:r>
-      <w:r>
-        <w:t>个阶段、</w:t>
-      </w:r>
-      <w:r>
-        <w:t>1037</w:t>
-      </w:r>
-      <w:r>
-        <w:t>项自动检查，全部通过，其中最后一席竞争执行</w:t>
-      </w:r>
-      <w:r>
-        <w:t>5</w:t>
-      </w:r>
-      <w:r>
-        <w:t>轮。随后提交</w:t>
-      </w:r>
-      <w:r>
-        <w:t>e2b9006</w:t>
-      </w:r>
-      <w:r>
-        <w:t>精简页面文字及折叠明细，</w:t>
-      </w:r>
-      <w:r>
-        <w:t>9</w:t>
-      </w:r>
-      <w:r>
-        <w:t>个修改</w:t>
+        <w:t>项、</w:t>
+      </w:r>
+      <w:r>
+        <w:t>HTTP</w:t>
+      </w:r>
+      <w:r>
+        <w:t>连接检查</w:t>
+      </w:r>
+      <w:r>
+        <w:t>15</w:t>
+      </w:r>
+      <w:r>
+        <w:t>项均通过。</w:t>
       </w:r>
       <w:r>
         <w:t>PHP</w:t>
       </w:r>
       <w:r>
-        <w:t>文件语法检查、</w:t>
-      </w:r>
-      <w:r>
-        <w:t>21</w:t>
-      </w:r>
-      <w:r>
-        <w:t>项前端检查及</w:t>
-      </w:r>
-      <w:r>
-        <w:t>Git</w:t>
-      </w:r>
-      <w:r>
-        <w:t>空白检查通过；页面精简后未重新运行完整回归。原数据库的</w:t>
-      </w:r>
-      <w:r>
-        <w:t>9</w:t>
-      </w:r>
-      <w:r>
-        <w:t>个升级脚本执行成功，会话登记、刷新和清理验证通过。浏览器人工操作、键盘和窄屏视觉验收尚未完成。完整记录见</w:t>
+        <w:t>服务日志无</w:t>
+      </w:r>
+      <w:r>
+        <w:t>Warning</w:t>
+      </w:r>
+      <w:r>
+        <w:t>、</w:t>
+      </w:r>
+      <w:r>
+        <w:t>Notice</w:t>
+      </w:r>
+      <w:r>
+        <w:t>、</w:t>
+      </w:r>
+      <w:r>
+        <w:t>Fatal error</w:t>
+      </w:r>
+      <w:r>
+        <w:t>或未处理异常。浏览器人工操作、键盘、窄屏视觉验收和大规模性能测试仍未完成。完整记录见</w:t>
       </w:r>
       <w:hyperlink r:id="rId11">
         <w:r>
-          <w:t>本次自动检查记录</w:t>
+          <w:t>最新自动检查记录</w:t>
         </w:r>
       </w:hyperlink>
       <w:r>
+        <w:t>，新增边界明细见</w:t>
+      </w:r>
+      <w:hyperlink r:id="rId12">
+        <w:r>
+          <w:t>边界检查记录</w:t>
+        </w:r>
+      </w:hyperlink>
+      <w:r>
         <w:t>。</w:t>
       </w:r>
     </w:p>
     <w:sectPr>
-      <w:footerReference w:type="default" r:id="rId12"/>
+      <w:footerReference w:type="default" r:id="rId13"/>
       <w:pgSz w:w="11906" w:h="16838"/>
       <w:pgMar w:top="1134" w:right="1134" w:bottom="1134" w:left="1134" w:header="720" w:footer="510" w:gutter="0"/>
       <w:cols w:space="720"/>
@@ -4580,31 +4580,31 @@
       </w:rPr>
     </w:lvl>
   </w:abstractNum>
-  <w:num w:numId="1" w16cid:durableId="335618868">
+  <w:num w:numId="1" w16cid:durableId="277881224">
     <w:abstractNumId w:val="8"/>
   </w:num>
-  <w:num w:numId="2" w16cid:durableId="1509053865">
+  <w:num w:numId="2" w16cid:durableId="2027822225">
     <w:abstractNumId w:val="6"/>
   </w:num>
-  <w:num w:numId="3" w16cid:durableId="1464496984">
+  <w:num w:numId="3" w16cid:durableId="1496068572">
     <w:abstractNumId w:val="5"/>
   </w:num>
-  <w:num w:numId="4" w16cid:durableId="2062053219">
+  <w:num w:numId="4" w16cid:durableId="339089383">
     <w:abstractNumId w:val="4"/>
   </w:num>
-  <w:num w:numId="5" w16cid:durableId="16466334">
+  <w:num w:numId="5" w16cid:durableId="249504568">
     <w:abstractNumId w:val="7"/>
   </w:num>
-  <w:num w:numId="6" w16cid:durableId="1478566503">
+  <w:num w:numId="6" w16cid:durableId="125658731">
     <w:abstractNumId w:val="3"/>
   </w:num>
-  <w:num w:numId="7" w16cid:durableId="2006778389">
+  <w:num w:numId="7" w16cid:durableId="1348671810">
     <w:abstractNumId w:val="2"/>
   </w:num>
-  <w:num w:numId="8" w16cid:durableId="322971408">
+  <w:num w:numId="8" w16cid:durableId="790199842">
     <w:abstractNumId w:val="1"/>
   </w:num>
-  <w:num w:numId="9" w16cid:durableId="1959406081">
+  <w:num w:numId="9" w16cid:durableId="429470578">
     <w:abstractNumId w:val="0"/>
   </w:num>
 </w:numbering>
@@ -16038,7 +16038,7 @@
     <w:autoRedefine/>
     <w:uiPriority w:val="39"/>
     <w:unhideWhenUsed/>
-    <w:rsid w:val="00893C2C"/>
+    <w:rsid w:val="00BE2DD2"/>
   </w:style>
   <w:style w:type="paragraph" w:styleId="TOC2">
     <w:name w:val="toc 2"/>
@@ -16047,7 +16047,7 @@
     <w:autoRedefine/>
     <w:uiPriority w:val="39"/>
     <w:unhideWhenUsed/>
-    <w:rsid w:val="00893C2C"/>
+    <w:rsid w:val="00BE2DD2"/>
     <w:pPr>
       <w:ind w:leftChars="200" w:left="420"/>
     </w:pPr>
@@ -16057,7 +16057,7 @@
     <w:basedOn w:val="a2"/>
     <w:uiPriority w:val="99"/>
     <w:unhideWhenUsed/>
-    <w:rsid w:val="00893C2C"/>
+    <w:rsid w:val="00BE2DD2"/>
     <w:rPr>
       <w:color w:val="0000FF" w:themeColor="hyperlink"/>
       <w:u w:val="single"/>

</xml_diff>

<commit_message>
Finalize October 14 documents and simplify wording
</commit_message>
<xml_diff>
--- a/课程注册系统工作总结.docx
+++ b/课程注册系统工作总结.docx
@@ -13,13 +13,7 @@
     </w:p>
     <w:p>
       <w:r>
-        <w:t>初稿日期：</w:t>
-      </w:r>
-      <w:r>
-        <w:t>2026-10-12</w:t>
-      </w:r>
-      <w:r>
-        <w:t>；当前项目同步日期：</w:t>
+        <w:t>最终同步版本：</w:t>
       </w:r>
       <w:r>
         <w:t>2026-10-14</w:t>
@@ -60,7 +54,7 @@
       <w:r>
         <w:fldChar w:fldCharType="separate"/>
       </w:r>
-      <w:hyperlink w:anchor="_Toc242861772" w:history="1">
+      <w:hyperlink w:anchor="_Toc242864616" w:history="1">
         <w:r>
           <w:rPr>
             <w:rStyle w:val="aff9"/>
@@ -104,7 +98,7 @@
             <w:noProof/>
             <w:webHidden/>
           </w:rPr>
-          <w:instrText>PAGEREF _Toc242861772 \h</w:instrText>
+          <w:instrText>PAGEREF _Toc242864616 \h</w:instrText>
         </w:r>
         <w:r>
           <w:rPr>
@@ -157,7 +151,7 @@
           <w:noProof/>
         </w:rPr>
       </w:pPr>
-      <w:hyperlink w:anchor="_Toc242861773" w:history="1">
+      <w:hyperlink w:anchor="_Toc242864617" w:history="1">
         <w:r>
           <w:rPr>
             <w:rStyle w:val="aff9"/>
@@ -201,7 +195,7 @@
             <w:noProof/>
             <w:webHidden/>
           </w:rPr>
-          <w:instrText>PAGEREF _Toc242861773 \h</w:instrText>
+          <w:instrText>PAGEREF _Toc242864617 \h</w:instrText>
         </w:r>
         <w:r>
           <w:rPr>
@@ -254,7 +248,7 @@
           <w:noProof/>
         </w:rPr>
       </w:pPr>
-      <w:hyperlink w:anchor="_Toc242861774" w:history="1">
+      <w:hyperlink w:anchor="_Toc242864618" w:history="1">
         <w:r>
           <w:rPr>
             <w:rStyle w:val="aff9"/>
@@ -298,7 +292,7 @@
             <w:noProof/>
             <w:webHidden/>
           </w:rPr>
-          <w:instrText>PAGEREF _Toc242861774 \h</w:instrText>
+          <w:instrText>PAGEREF _Toc242864618 \h</w:instrText>
         </w:r>
         <w:r>
           <w:rPr>
@@ -351,7 +345,7 @@
           <w:noProof/>
         </w:rPr>
       </w:pPr>
-      <w:hyperlink w:anchor="_Toc242861775" w:history="1">
+      <w:hyperlink w:anchor="_Toc242864619" w:history="1">
         <w:r>
           <w:rPr>
             <w:rStyle w:val="aff9"/>
@@ -364,7 +358,7 @@
             <w:rStyle w:val="aff9"/>
             <w:noProof/>
           </w:rPr>
-          <w:t>总结与改进方向</w:t>
+          <w:t>项目总结</w:t>
         </w:r>
         <w:r>
           <w:rPr>
@@ -395,7 +389,7 @@
             <w:noProof/>
             <w:webHidden/>
           </w:rPr>
-          <w:instrText>PAGEREF _Toc242861775 \h</w:instrText>
+          <w:instrText>PAGEREF _Toc242864619 \h</w:instrText>
         </w:r>
         <w:r>
           <w:rPr>
@@ -448,7 +442,7 @@
           <w:noProof/>
         </w:rPr>
       </w:pPr>
-      <w:hyperlink w:anchor="_Toc242861776" w:history="1">
+      <w:hyperlink w:anchor="_Toc242864620" w:history="1">
         <w:r>
           <w:rPr>
             <w:rStyle w:val="aff9"/>
@@ -492,7 +486,7 @@
             <w:noProof/>
             <w:webHidden/>
           </w:rPr>
-          <w:instrText>PAGEREF _Toc242861776 \h</w:instrText>
+          <w:instrText>PAGEREF _Toc242864620 \h</w:instrText>
         </w:r>
         <w:r>
           <w:rPr>
@@ -546,7 +540,7 @@
           <w:noProof/>
         </w:rPr>
       </w:pPr>
-      <w:hyperlink w:anchor="_Toc242861777" w:history="1">
+      <w:hyperlink w:anchor="_Toc242864621" w:history="1">
         <w:r>
           <w:rPr>
             <w:rStyle w:val="aff9"/>
@@ -604,7 +598,7 @@
             <w:noProof/>
             <w:webHidden/>
           </w:rPr>
-          <w:instrText>PAGEREF _Toc242861777 \h</w:instrText>
+          <w:instrText>PAGEREF _Toc242864621 \h</w:instrText>
         </w:r>
         <w:r>
           <w:rPr>
@@ -658,7 +652,7 @@
           <w:noProof/>
         </w:rPr>
       </w:pPr>
-      <w:hyperlink w:anchor="_Toc242861778" w:history="1">
+      <w:hyperlink w:anchor="_Toc242864622" w:history="1">
         <w:r>
           <w:rPr>
             <w:rStyle w:val="aff9"/>
@@ -716,7 +710,7 @@
             <w:noProof/>
             <w:webHidden/>
           </w:rPr>
-          <w:instrText>PAGEREF _Toc242861778 \h</w:instrText>
+          <w:instrText>PAGEREF _Toc242864622 \h</w:instrText>
         </w:r>
         <w:r>
           <w:rPr>
@@ -770,7 +764,7 @@
           <w:noProof/>
         </w:rPr>
       </w:pPr>
-      <w:hyperlink w:anchor="_Toc242861779" w:history="1">
+      <w:hyperlink w:anchor="_Toc242864623" w:history="1">
         <w:r>
           <w:rPr>
             <w:rStyle w:val="aff9"/>
@@ -828,7 +822,7 @@
             <w:noProof/>
             <w:webHidden/>
           </w:rPr>
-          <w:instrText>PAGEREF _Toc242861779 \h</w:instrText>
+          <w:instrText>PAGEREF _Toc242864623 \h</w:instrText>
         </w:r>
         <w:r>
           <w:rPr>
@@ -882,7 +876,7 @@
           <w:noProof/>
         </w:rPr>
       </w:pPr>
-      <w:hyperlink w:anchor="_Toc242861780" w:history="1">
+      <w:hyperlink w:anchor="_Toc242864624" w:history="1">
         <w:r>
           <w:rPr>
             <w:rStyle w:val="aff9"/>
@@ -940,7 +934,7 @@
             <w:noProof/>
             <w:webHidden/>
           </w:rPr>
-          <w:instrText>PAGEREF _Toc242861780 \h</w:instrText>
+          <w:instrText>PAGEREF _Toc242864624 \h</w:instrText>
         </w:r>
         <w:r>
           <w:rPr>
@@ -994,7 +988,7 @@
           <w:noProof/>
         </w:rPr>
       </w:pPr>
-      <w:hyperlink w:anchor="_Toc242861781" w:history="1">
+      <w:hyperlink w:anchor="_Toc242864625" w:history="1">
         <w:r>
           <w:rPr>
             <w:rStyle w:val="aff9"/>
@@ -1007,7 +1001,7 @@
             <w:rStyle w:val="aff9"/>
             <w:noProof/>
           </w:rPr>
-          <w:t>基本信息与贡献记录</w:t>
+          <w:t>分工汇总</w:t>
         </w:r>
         <w:r>
           <w:rPr>
@@ -1038,104 +1032,7 @@
             <w:noProof/>
             <w:webHidden/>
           </w:rPr>
-          <w:instrText>PAGEREF _Toc242861781 \h</w:instrText>
-        </w:r>
-        <w:r>
-          <w:rPr>
-            <w:rFonts w:hint="eastAsia"/>
-            <w:noProof/>
-            <w:webHidden/>
-          </w:rPr>
-          <w:instrText xml:space="preserve"> </w:instrText>
-        </w:r>
-        <w:r>
-          <w:rPr>
-            <w:rFonts w:hint="eastAsia"/>
-            <w:noProof/>
-            <w:webHidden/>
-          </w:rPr>
-        </w:r>
-        <w:r>
-          <w:rPr>
-            <w:rFonts w:hint="eastAsia"/>
-            <w:noProof/>
-            <w:webHidden/>
-          </w:rPr>
-          <w:fldChar w:fldCharType="separate"/>
-        </w:r>
-        <w:r>
-          <w:rPr>
-            <w:noProof/>
-            <w:webHidden/>
-          </w:rPr>
-          <w:t>5</w:t>
-        </w:r>
-        <w:r>
-          <w:rPr>
-            <w:rFonts w:hint="eastAsia"/>
-            <w:noProof/>
-            <w:webHidden/>
-          </w:rPr>
-          <w:fldChar w:fldCharType="end"/>
-        </w:r>
-      </w:hyperlink>
-    </w:p>
-    <w:p>
-      <w:pPr>
-        <w:pStyle w:val="TOC1"/>
-        <w:tabs>
-          <w:tab w:val="right" w:leader="dot" w:pos="9628"/>
-        </w:tabs>
-        <w:rPr>
-          <w:rFonts w:hint="eastAsia"/>
-          <w:noProof/>
-        </w:rPr>
-      </w:pPr>
-      <w:hyperlink w:anchor="_Toc242861782" w:history="1">
-        <w:r>
-          <w:rPr>
-            <w:rStyle w:val="aff9"/>
-            <w:noProof/>
-          </w:rPr>
-          <w:t xml:space="preserve">6 </w:t>
-        </w:r>
-        <w:r>
-          <w:rPr>
-            <w:rStyle w:val="aff9"/>
-            <w:noProof/>
-          </w:rPr>
-          <w:t>当前版本补充</w:t>
-        </w:r>
-        <w:r>
-          <w:rPr>
-            <w:rFonts w:hint="eastAsia"/>
-            <w:noProof/>
-            <w:webHidden/>
-          </w:rPr>
-          <w:tab/>
-        </w:r>
-        <w:r>
-          <w:rPr>
-            <w:rFonts w:hint="eastAsia"/>
-            <w:noProof/>
-            <w:webHidden/>
-          </w:rPr>
-          <w:fldChar w:fldCharType="begin"/>
-        </w:r>
-        <w:r>
-          <w:rPr>
-            <w:rFonts w:hint="eastAsia"/>
-            <w:noProof/>
-            <w:webHidden/>
-          </w:rPr>
-          <w:instrText xml:space="preserve"> </w:instrText>
-        </w:r>
-        <w:r>
-          <w:rPr>
-            <w:noProof/>
-            <w:webHidden/>
-          </w:rPr>
-          <w:instrText>PAGEREF _Toc242861782 \h</w:instrText>
+          <w:instrText>PAGEREF _Toc242864625 \h</w:instrText>
         </w:r>
         <w:r>
           <w:rPr>
@@ -1183,16 +1080,12 @@
       </w:r>
     </w:p>
     <w:p>
-      <w:r>
-        <w:br w:type="page"/>
-      </w:r>
-    </w:p>
-    <w:p>
       <w:pPr>
         <w:pStyle w:val="1"/>
+        <w:pageBreakBefore/>
       </w:pPr>
       <w:bookmarkStart w:id="0" w:name="h_2d27fac8cbdecbcea690"/>
-      <w:bookmarkStart w:id="1" w:name="_Toc242861772"/>
+      <w:bookmarkStart w:id="1" w:name="_Toc242864616"/>
       <w:r>
         <w:lastRenderedPageBreak/>
         <w:t xml:space="preserve">1 </w:t>
@@ -1250,7 +1143,7 @@
         <w:pStyle w:val="1"/>
       </w:pPr>
       <w:bookmarkStart w:id="2" w:name="h_8d71bb3dd4cecc93ea1c"/>
-      <w:bookmarkStart w:id="3" w:name="_Toc242861773"/>
+      <w:bookmarkStart w:id="3" w:name="_Toc242864617"/>
       <w:r>
         <w:t xml:space="preserve">2 </w:t>
       </w:r>
@@ -1557,19 +1450,13 @@
     </w:p>
     <w:p>
       <w:r>
-        <w:t>本轮补充修复了先修课同名误匹配、原注册课程重复校验和秒级时间冲突漏判。课程身份改按代码判断，原有注册与新增注册分别处理，数据库时间保留秒数参与比较。完整回归中曾出现连接端口耗尽导致课表</w:t>
-      </w:r>
-      <w:r>
-        <w:t>HTTP 500</w:t>
-      </w:r>
-      <w:r>
-        <w:t>，随后将网页请求内的</w:t>
+        <w:t>已修复先修课同名误匹配、原注册课程重复校验和秒级时间冲突漏判。课程身份改按代码判断，原有注册与新增注册分别处理，数据库时间保留秒数参与比较。为避免重复连接导致端口耗尽和页面访问失败，网页请求内复用</w:t>
       </w:r>
       <w:r>
         <w:t>PDO</w:t>
       </w:r>
       <w:r>
-        <w:t>连接复用；</w:t>
+        <w:t>连接；</w:t>
       </w:r>
       <w:r>
         <w:t>7</w:t>
@@ -1591,7 +1478,6 @@
       </w:r>
     </w:p>
     <w:p>
-      <w:proofErr w:type="spellStart"/>
       <w:r>
         <w:t>修改后分别检查正常操作和原有出错场景，并比较操作前后的数据库记录。问题处理和复测结果见</w:t>
       </w:r>
@@ -1599,7 +1485,6 @@
         <w:r>
           <w:t>测试报告</w:t>
         </w:r>
-        <w:proofErr w:type="spellEnd"/>
       </w:hyperlink>
       <w:r>
         <w:t>。</w:t>
@@ -1610,7 +1495,7 @@
         <w:pStyle w:val="1"/>
       </w:pPr>
       <w:bookmarkStart w:id="4" w:name="h_4ad32647cdfabbff5030"/>
-      <w:bookmarkStart w:id="5" w:name="_Toc242861774"/>
+      <w:bookmarkStart w:id="5" w:name="_Toc242864618"/>
       <w:r>
         <w:t xml:space="preserve">3 </w:t>
       </w:r>
@@ -1622,68 +1507,7 @@
     </w:p>
     <w:p>
       <w:r>
-        <w:t>2026</w:t>
-      </w:r>
-      <w:r>
-        <w:t>年</w:t>
-      </w:r>
-      <w:r>
-        <w:t>10</w:t>
-      </w:r>
-      <w:r>
-        <w:t>月</w:t>
-      </w:r>
-      <w:r>
-        <w:t>12</w:t>
-      </w:r>
-      <w:r>
-        <w:t>日历史回归完成</w:t>
-      </w:r>
-      <w:r>
-        <w:t>29</w:t>
-      </w:r>
-      <w:r>
-        <w:t>个阶段、</w:t>
-      </w:r>
-      <w:r>
-        <w:t>847</w:t>
-      </w:r>
-      <w:r>
-        <w:t>条检查，</w:t>
-      </w:r>
-      <w:r>
-        <w:t>10</w:t>
-      </w:r>
-      <w:r>
-        <w:t>月</w:t>
-      </w:r>
-      <w:r>
-        <w:t>13</w:t>
-      </w:r>
-      <w:r>
-        <w:t>日前一轮业务回归完成</w:t>
-      </w:r>
-      <w:r>
-        <w:t>37</w:t>
-      </w:r>
-      <w:r>
-        <w:t>个阶段、</w:t>
-      </w:r>
-      <w:r>
-        <w:t>1037</w:t>
-      </w:r>
-      <w:r>
-        <w:t>项检查。当前提交</w:t>
-      </w:r>
-      <w:r>
-        <w:rPr>
-          <w:rFonts w:ascii="Consolas" w:hAnsi="Consolas"/>
-          <w:sz w:val="18"/>
-        </w:rPr>
-        <w:t>73b5336</w:t>
-      </w:r>
-      <w:r>
-        <w:t>的完整回归完成</w:t>
+        <w:t>完整自动回归完成</w:t>
       </w:r>
       <w:r>
         <w:t>39</w:t>
@@ -1695,23 +1519,23 @@
         <w:t>1067</w:t>
       </w:r>
       <w:r>
-        <w:t>项检查，全部通过，覆盖页面精简后的流程和本轮修复。检查包括登录权限、课程查询、选退课、任教、成绩、人员管理、关课和数据库异常，最后一个名额竞争完成</w:t>
+        <w:t>项检查，全部通过，覆盖当前页面与业务实现及问题修复。检查包括登录权限、课程查询、选退课、任教、成绩、人员管理、关课和数据库异常，最后一个名额竞争完成</w:t>
       </w:r>
       <w:r>
         <w:t>5</w:t>
       </w:r>
       <w:r>
-        <w:t>轮，未出现超额分配。历史各轮结果分别记录，不累加为当前检查数量。</w:t>
+        <w:t>轮，未出现超额分配。</w:t>
+      </w:r>
+    </w:p>
+    <w:p>
+      <w:r>
+        <w:t>业务规则需要在页面、服务端和数据库之间保持一致。例如，页面可以提前提示重复课程，但提交时仍需重新检查数量、先修条件和剩余名额；选课和关课包含多项写入，应使用事务保证全部成功或全部撤销。</w:t>
       </w:r>
     </w:p>
     <w:p>
       <w:r>
         <w:lastRenderedPageBreak/>
-        <w:t>业务规则需要在页面、服务端和数据库之间保持一致。例如，页面可以提前提示重复课程，但提交时仍需重新检查数量、先修条件和剩余名额；选课和关课包含多项写入，应使用事务保证全部成功或全部撤销。</w:t>
-      </w:r>
-    </w:p>
-    <w:p>
-      <w:r>
         <w:t>选课页面通过定时查询更新名额，所选首选班满额时提示调整，并保留正在填写的内容。刷新只提供操作提示，正式提交仍由服务端检查最新人数。</w:t>
       </w:r>
     </w:p>
@@ -1729,26 +1553,26 @@
       <w:pPr>
         <w:pStyle w:val="1"/>
       </w:pPr>
-      <w:bookmarkStart w:id="6" w:name="h_db612fb661ac9609d2ab"/>
-      <w:bookmarkStart w:id="7" w:name="_Toc242861775"/>
+      <w:bookmarkStart w:id="6" w:name="h_9da0aba1b80986abfeb0"/>
+      <w:bookmarkStart w:id="7" w:name="_Toc242864619"/>
       <w:r>
         <w:t xml:space="preserve">4 </w:t>
       </w:r>
       <w:r>
-        <w:t>总结与改进方向</w:t>
+        <w:t>项目总结</w:t>
       </w:r>
       <w:bookmarkEnd w:id="6"/>
       <w:bookmarkEnd w:id="7"/>
     </w:p>
     <w:p>
       <w:r>
-        <w:t>当前版本按课程项目范围完成主要业务，计费使用模拟发送，课程目录使用本地数据库或</w:t>
+        <w:t>系统完成学生选课、教师任教和教务管理的主要流程。计费使用模拟发送，课程目录使用本地数据库或</w:t>
       </w:r>
       <w:r>
         <w:t>JSON</w:t>
       </w:r>
       <w:r>
-        <w:t>快照。后续整理重点是核对运行说明、文档中的规则与实际操作结果，并保持</w:t>
+        <w:t>快照。运行说明、业务规则和测试场景采用一致的表述，</w:t>
       </w:r>
       <w:r>
         <w:t>Markdown</w:t>
@@ -1760,19 +1584,17 @@
         <w:t>Word</w:t>
       </w:r>
       <w:r>
-        <w:t>版本一致。</w:t>
+        <w:t>内容对应。</w:t>
       </w:r>
     </w:p>
     <w:p>
-      <w:proofErr w:type="spellStart"/>
       <w:r>
-        <w:t>页面布局、键盘操作、时间边界和新电脑运行按测试计划检查并记录。成员信息、分工和个人工作记录集中在下节，具体开发安排见</w:t>
+        <w:t>各模块的实现、问题处理和工作体会见下节，开发分工见</w:t>
       </w:r>
       <w:hyperlink r:id="rId10">
         <w:r>
           <w:t>开发计划</w:t>
         </w:r>
-        <w:proofErr w:type="spellEnd"/>
       </w:hyperlink>
       <w:r>
         <w:t>。</w:t>
@@ -1783,7 +1605,7 @@
         <w:pStyle w:val="1"/>
       </w:pPr>
       <w:bookmarkStart w:id="8" w:name="h_f18102740983e1bd8b16"/>
-      <w:bookmarkStart w:id="9" w:name="_Toc242861776"/>
+      <w:bookmarkStart w:id="9" w:name="_Toc242864620"/>
       <w:r>
         <w:t xml:space="preserve">5 </w:t>
       </w:r>
@@ -1798,7 +1620,7 @@
         <w:keepNext/>
       </w:pPr>
       <w:r>
-        <w:t>暂用成员</w:t>
+        <w:t>成员</w:t>
       </w:r>
       <w:r>
         <w:t>1—</w:t>
@@ -1810,13 +1632,7 @@
         <w:t>4</w:t>
       </w:r>
       <w:r>
-        <w:t>表示小组成员。下表按约定分工归纳工作范围，各节结合现有实现列出模块内容、问题处理及验证依据。测试执行人和完成时间以实际记录为准，成员基本信息和贡献比例统一记录在第</w:t>
-      </w:r>
-      <w:r>
-        <w:t>5.5</w:t>
-      </w:r>
-      <w:r>
-        <w:t>节。以下程序路径以</w:t>
+        <w:t>分别负责学生、教师、教务和公共模块。以下记录按模块说明实现、问题处理和测试依据，程序路径以</w:t>
       </w:r>
       <w:r>
         <w:rPr>
@@ -2149,7 +1965,7 @@
         <w:pStyle w:val="21"/>
       </w:pPr>
       <w:bookmarkStart w:id="10" w:name="h_45b8718b9801aed05a7d"/>
-      <w:bookmarkStart w:id="11" w:name="_Toc242861777"/>
+      <w:bookmarkStart w:id="11" w:name="_Toc242864621"/>
       <w:r>
         <w:t xml:space="preserve">5.1 </w:t>
       </w:r>
@@ -2337,7 +2153,6 @@
               <w:jc w:val="center"/>
             </w:pPr>
             <w:r>
-              <w:lastRenderedPageBreak/>
               <w:t>问题处理</w:t>
             </w:r>
           </w:p>
@@ -2467,7 +2282,8 @@
               <w:jc w:val="center"/>
             </w:pPr>
             <w:r>
-              <w:t>个人补充</w:t>
+              <w:lastRenderedPageBreak/>
+              <w:t>工作体会</w:t>
             </w:r>
           </w:p>
         </w:tc>
@@ -2481,19 +2297,7 @@
               <w:pStyle w:val="TableText"/>
             </w:pPr>
             <w:r>
-              <w:t>完成日期：</w:t>
-            </w:r>
-            <w:r>
-              <w:t>________</w:t>
-            </w:r>
-            <w:r>
-              <w:t>；个人体会：</w:t>
-            </w:r>
-            <w:r>
-              <w:t>________</w:t>
-            </w:r>
-            <w:r>
-              <w:t>。</w:t>
+              <w:t>页面名额提示与正式提交分开处理。提交时重新读取人数，才能保证多人选课时数据一致。</w:t>
             </w:r>
           </w:p>
         </w:tc>
@@ -2509,7 +2313,7 @@
         <w:pStyle w:val="21"/>
       </w:pPr>
       <w:bookmarkStart w:id="12" w:name="h_863a6d4b43e5d58fcb42"/>
-      <w:bookmarkStart w:id="13" w:name="_Toc242861778"/>
+      <w:bookmarkStart w:id="13" w:name="_Toc242864622"/>
       <w:r>
         <w:t xml:space="preserve">5.2 </w:t>
       </w:r>
@@ -2826,7 +2630,7 @@
               <w:jc w:val="center"/>
             </w:pPr>
             <w:r>
-              <w:t>个人补充</w:t>
+              <w:t>工作体会</w:t>
             </w:r>
           </w:p>
         </w:tc>
@@ -2840,19 +2644,7 @@
               <w:pStyle w:val="TableText"/>
             </w:pPr>
             <w:r>
-              <w:t>完成日期：</w:t>
-            </w:r>
-            <w:r>
-              <w:t>________</w:t>
-            </w:r>
-            <w:r>
-              <w:t>；个人体会：</w:t>
-            </w:r>
-            <w:r>
-              <w:t>________</w:t>
-            </w:r>
-            <w:r>
-              <w:t>。</w:t>
+              <w:t>成绩录入不仅要检查等级，还要检查任课关系、教学状态和页面版本，避免旧页面覆盖新成绩。</w:t>
             </w:r>
           </w:p>
         </w:tc>
@@ -2868,7 +2660,7 @@
         <w:pStyle w:val="21"/>
       </w:pPr>
       <w:bookmarkStart w:id="14" w:name="h_9eb9cfd86d6fade58376"/>
-      <w:bookmarkStart w:id="15" w:name="_Toc242861779"/>
+      <w:bookmarkStart w:id="15" w:name="_Toc242864623"/>
       <w:r>
         <w:t xml:space="preserve">5.3 </w:t>
       </w:r>
@@ -3188,7 +2980,7 @@
               <w:jc w:val="center"/>
             </w:pPr>
             <w:r>
-              <w:t>个人补充</w:t>
+              <w:t>工作体会</w:t>
             </w:r>
           </w:p>
         </w:tc>
@@ -3202,19 +2994,7 @@
               <w:pStyle w:val="TableText"/>
             </w:pPr>
             <w:r>
-              <w:t>完成日期：</w:t>
-            </w:r>
-            <w:r>
-              <w:t>________</w:t>
-            </w:r>
-            <w:r>
-              <w:t>；个人体会：</w:t>
-            </w:r>
-            <w:r>
-              <w:t>________</w:t>
-            </w:r>
-            <w:r>
-              <w:t>。</w:t>
+              <w:t>关课的处理顺序会影响最终课表。先补位再判断最低人数，并用事务保证失败时整次撤销。</w:t>
             </w:r>
           </w:p>
         </w:tc>
@@ -3230,7 +3010,7 @@
         <w:pStyle w:val="21"/>
       </w:pPr>
       <w:bookmarkStart w:id="16" w:name="h_c713756adb79d08b5080"/>
-      <w:bookmarkStart w:id="17" w:name="_Toc242861780"/>
+      <w:bookmarkStart w:id="17" w:name="_Toc242864624"/>
       <w:r>
         <w:t xml:space="preserve">5.4 </w:t>
       </w:r>
@@ -3441,7 +3221,6 @@
               <w:jc w:val="center"/>
             </w:pPr>
             <w:r>
-              <w:lastRenderedPageBreak/>
               <w:t>问题处理</w:t>
             </w:r>
           </w:p>
@@ -3495,6 +3274,7 @@
               <w:jc w:val="center"/>
             </w:pPr>
             <w:r>
+              <w:lastRenderedPageBreak/>
               <w:t>验证依据与协作</w:t>
             </w:r>
           </w:p>
@@ -3571,7 +3351,7 @@
               <w:jc w:val="center"/>
             </w:pPr>
             <w:r>
-              <w:t>个人补充</w:t>
+              <w:t>工作体会</w:t>
             </w:r>
           </w:p>
         </w:tc>
@@ -3585,19 +3365,7 @@
               <w:pStyle w:val="TableText"/>
             </w:pPr>
             <w:r>
-              <w:t>完成日期：</w:t>
-            </w:r>
-            <w:r>
-              <w:t>________</w:t>
-            </w:r>
-            <w:r>
-              <w:t>；个人体会：</w:t>
-            </w:r>
-            <w:r>
-              <w:t>________</w:t>
-            </w:r>
-            <w:r>
-              <w:t>。</w:t>
+              <w:t>登录、配置和数据库连接由公共模块统一处理，便于各页面采用相同的权限和错误提示。</w:t>
             </w:r>
           </w:p>
         </w:tc>
@@ -3612,24 +3380,16 @@
       <w:pPr>
         <w:pStyle w:val="21"/>
       </w:pPr>
-      <w:bookmarkStart w:id="18" w:name="h_cc9f4a77e1876c69ca0c"/>
-      <w:bookmarkStart w:id="19" w:name="_Toc242861781"/>
+      <w:bookmarkStart w:id="18" w:name="h_56b5072e2de188901a6e"/>
+      <w:bookmarkStart w:id="19" w:name="_Toc242864625"/>
       <w:r>
         <w:t xml:space="preserve">5.5 </w:t>
       </w:r>
       <w:r>
-        <w:t>基本信息与贡献记录</w:t>
+        <w:t>分工汇总</w:t>
       </w:r>
       <w:bookmarkEnd w:id="18"/>
       <w:bookmarkEnd w:id="19"/>
-    </w:p>
-    <w:p>
-      <w:pPr>
-        <w:keepNext/>
-      </w:pPr>
-      <w:r>
-        <w:t>组号：待填。组长：待填。实际开发起止日期：待填。</w:t>
-      </w:r>
     </w:p>
     <w:tbl>
       <w:tblPr>
@@ -3653,11 +3413,9 @@
         <w:tblLook w:val="04A0" w:firstRow="1" w:lastRow="0" w:firstColumn="1" w:lastColumn="0" w:noHBand="0" w:noVBand="1"/>
       </w:tblPr>
       <w:tblGrid>
-        <w:gridCol w:w="1349"/>
-        <w:gridCol w:w="1735"/>
-        <w:gridCol w:w="1735"/>
         <w:gridCol w:w="2120"/>
-        <w:gridCol w:w="2699"/>
+        <w:gridCol w:w="3180"/>
+        <w:gridCol w:w="4337"/>
       </w:tblGrid>
       <w:tr>
         <w:trPr>
@@ -3665,66 +3423,6 @@
           <w:tblHeader/>
           <w:jc w:val="center"/>
         </w:trPr>
-        <w:tc>
-          <w:tcPr>
-            <w:tcW w:w="1349" w:type="dxa"/>
-            <w:shd w:val="clear" w:color="auto" w:fill="E6EEF5"/>
-            <w:vAlign w:val="center"/>
-          </w:tcPr>
-          <w:p>
-            <w:pPr>
-              <w:pStyle w:val="TableText"/>
-              <w:keepNext/>
-              <w:jc w:val="center"/>
-            </w:pPr>
-            <w:r>
-              <w:rPr>
-                <w:b/>
-              </w:rPr>
-              <w:t>成员</w:t>
-            </w:r>
-          </w:p>
-        </w:tc>
-        <w:tc>
-          <w:tcPr>
-            <w:tcW w:w="1735" w:type="dxa"/>
-            <w:shd w:val="clear" w:color="auto" w:fill="E6EEF5"/>
-            <w:vAlign w:val="center"/>
-          </w:tcPr>
-          <w:p>
-            <w:pPr>
-              <w:pStyle w:val="TableText"/>
-              <w:keepNext/>
-              <w:jc w:val="center"/>
-            </w:pPr>
-            <w:r>
-              <w:rPr>
-                <w:b/>
-              </w:rPr>
-              <w:t>姓名</w:t>
-            </w:r>
-          </w:p>
-        </w:tc>
-        <w:tc>
-          <w:tcPr>
-            <w:tcW w:w="1735" w:type="dxa"/>
-            <w:shd w:val="clear" w:color="auto" w:fill="E6EEF5"/>
-            <w:vAlign w:val="center"/>
-          </w:tcPr>
-          <w:p>
-            <w:pPr>
-              <w:pStyle w:val="TableText"/>
-              <w:keepNext/>
-              <w:jc w:val="center"/>
-            </w:pPr>
-            <w:r>
-              <w:rPr>
-                <w:b/>
-              </w:rPr>
-              <w:t>学号</w:t>
-            </w:r>
-          </w:p>
-        </w:tc>
         <w:tc>
           <w:tcPr>
             <w:tcW w:w="2120" w:type="dxa"/>
@@ -3741,13 +3439,13 @@
               <w:rPr>
                 <w:b/>
               </w:rPr>
-              <w:t>贡献比例</w:t>
+              <w:t>成员</w:t>
             </w:r>
           </w:p>
         </w:tc>
         <w:tc>
           <w:tcPr>
-            <w:tcW w:w="2699" w:type="dxa"/>
+            <w:tcW w:w="3180" w:type="dxa"/>
             <w:shd w:val="clear" w:color="auto" w:fill="E6EEF5"/>
             <w:vAlign w:val="center"/>
           </w:tcPr>
@@ -3755,13 +3453,31 @@
             <w:pPr>
               <w:pStyle w:val="TableText"/>
               <w:keepNext/>
-              <w:jc w:val="center"/>
             </w:pPr>
             <w:r>
               <w:rPr>
                 <w:b/>
               </w:rPr>
-              <w:t>签名</w:t>
+              <w:t>主要成果</w:t>
+            </w:r>
+          </w:p>
+        </w:tc>
+        <w:tc>
+          <w:tcPr>
+            <w:tcW w:w="4337" w:type="dxa"/>
+            <w:shd w:val="clear" w:color="auto" w:fill="E6EEF5"/>
+            <w:vAlign w:val="center"/>
+          </w:tcPr>
+          <w:p>
+            <w:pPr>
+              <w:pStyle w:val="TableText"/>
+              <w:keepNext/>
+            </w:pPr>
+            <w:r>
+              <w:rPr>
+                <w:b/>
+              </w:rPr>
+              <w:t>联调内容</w:t>
             </w:r>
           </w:p>
         </w:tc>
@@ -3773,7 +3489,7 @@
         </w:trPr>
         <w:tc>
           <w:tcPr>
-            <w:tcW w:w="1349" w:type="dxa"/>
+            <w:tcW w:w="2120" w:type="dxa"/>
             <w:vAlign w:val="center"/>
           </w:tcPr>
           <w:p>
@@ -3791,34 +3507,38 @@
         </w:tc>
         <w:tc>
           <w:tcPr>
-            <w:tcW w:w="1735" w:type="dxa"/>
+            <w:tcW w:w="3180" w:type="dxa"/>
             <w:vAlign w:val="center"/>
           </w:tcPr>
           <w:p>
             <w:pPr>
               <w:pStyle w:val="TableText"/>
-              <w:jc w:val="center"/>
             </w:pPr>
             <w:r>
-              <w:t>待填</w:t>
+              <w:t>学生选课、退课、课表、成绩查询、草稿和方案删除</w:t>
             </w:r>
           </w:p>
         </w:tc>
         <w:tc>
           <w:tcPr>
-            <w:tcW w:w="1735" w:type="dxa"/>
+            <w:tcW w:w="4337" w:type="dxa"/>
             <w:vAlign w:val="center"/>
           </w:tcPr>
           <w:p>
             <w:pPr>
               <w:pStyle w:val="TableText"/>
-              <w:jc w:val="center"/>
             </w:pPr>
             <w:r>
-              <w:t>待填</w:t>
+              <w:t>与教师模块核对成绩显示，与教务模块核对关课补位</w:t>
             </w:r>
           </w:p>
         </w:tc>
+      </w:tr>
+      <w:tr>
+        <w:trPr>
+          <w:cantSplit/>
+          <w:jc w:val="center"/>
+        </w:trPr>
         <w:tc>
           <w:tcPr>
             <w:tcW w:w="2120" w:type="dxa"/>
@@ -3830,22 +3550,38 @@
               <w:jc w:val="center"/>
             </w:pPr>
             <w:r>
-              <w:t>待填</w:t>
+              <w:t>成员</w:t>
+            </w:r>
+            <w:r>
+              <w:t>2</w:t>
             </w:r>
           </w:p>
         </w:tc>
         <w:tc>
           <w:tcPr>
-            <w:tcW w:w="2699" w:type="dxa"/>
+            <w:tcW w:w="3180" w:type="dxa"/>
             <w:vAlign w:val="center"/>
           </w:tcPr>
           <w:p>
             <w:pPr>
               <w:pStyle w:val="TableText"/>
-              <w:jc w:val="center"/>
             </w:pPr>
             <w:r>
-              <w:t>待填</w:t>
+              <w:t>任教认领、名单和成绩维护</w:t>
+            </w:r>
+          </w:p>
+        </w:tc>
+        <w:tc>
+          <w:tcPr>
+            <w:tcW w:w="4337" w:type="dxa"/>
+            <w:vAlign w:val="center"/>
+          </w:tcPr>
+          <w:p>
+            <w:pPr>
+              <w:pStyle w:val="TableText"/>
+            </w:pPr>
+            <w:r>
+              <w:t>与教务模块核对资格，与学生模块核对查询结果</w:t>
             </w:r>
           </w:p>
         </w:tc>
@@ -3857,7 +3593,7 @@
         </w:trPr>
         <w:tc>
           <w:tcPr>
-            <w:tcW w:w="1349" w:type="dxa"/>
+            <w:tcW w:w="2120" w:type="dxa"/>
             <w:vAlign w:val="center"/>
           </w:tcPr>
           <w:p>
@@ -3869,40 +3605,44 @@
               <w:t>成员</w:t>
             </w:r>
             <w:r>
-              <w:t>2</w:t>
+              <w:t>3</w:t>
             </w:r>
           </w:p>
         </w:tc>
         <w:tc>
           <w:tcPr>
-            <w:tcW w:w="1735" w:type="dxa"/>
+            <w:tcW w:w="3180" w:type="dxa"/>
             <w:vAlign w:val="center"/>
           </w:tcPr>
           <w:p>
             <w:pPr>
               <w:pStyle w:val="TableText"/>
-              <w:jc w:val="center"/>
             </w:pPr>
             <w:r>
-              <w:t>待填</w:t>
+              <w:t>人员维护、资格管理、关课和模拟计费</w:t>
             </w:r>
           </w:p>
         </w:tc>
         <w:tc>
           <w:tcPr>
-            <w:tcW w:w="1735" w:type="dxa"/>
+            <w:tcW w:w="4337" w:type="dxa"/>
             <w:vAlign w:val="center"/>
           </w:tcPr>
           <w:p>
             <w:pPr>
               <w:pStyle w:val="TableText"/>
-              <w:jc w:val="center"/>
             </w:pPr>
             <w:r>
-              <w:t>待填</w:t>
+              <w:t>与学生模块核对人数与课表，与公共模块核对账号状态</w:t>
             </w:r>
           </w:p>
         </w:tc>
+      </w:tr>
+      <w:tr>
+        <w:trPr>
+          <w:cantSplit/>
+          <w:jc w:val="center"/>
+        </w:trPr>
         <w:tc>
           <w:tcPr>
             <w:tcW w:w="2120" w:type="dxa"/>
@@ -3914,190 +3654,38 @@
               <w:jc w:val="center"/>
             </w:pPr>
             <w:r>
-              <w:t>待填</w:t>
+              <w:t>成员</w:t>
+            </w:r>
+            <w:r>
+              <w:t>4</w:t>
             </w:r>
           </w:p>
         </w:tc>
         <w:tc>
           <w:tcPr>
-            <w:tcW w:w="2699" w:type="dxa"/>
+            <w:tcW w:w="3180" w:type="dxa"/>
             <w:vAlign w:val="center"/>
           </w:tcPr>
           <w:p>
             <w:pPr>
               <w:pStyle w:val="TableText"/>
-              <w:jc w:val="center"/>
             </w:pPr>
             <w:r>
-              <w:t>待填</w:t>
+              <w:t>登录、公共页面、课程查询、配置及启动说明</w:t>
             </w:r>
           </w:p>
         </w:tc>
-      </w:tr>
-      <w:tr>
-        <w:trPr>
-          <w:cantSplit/>
-          <w:jc w:val="center"/>
-        </w:trPr>
         <w:tc>
           <w:tcPr>
-            <w:tcW w:w="1349" w:type="dxa"/>
+            <w:tcW w:w="4337" w:type="dxa"/>
             <w:vAlign w:val="center"/>
           </w:tcPr>
           <w:p>
             <w:pPr>
               <w:pStyle w:val="TableText"/>
-              <w:jc w:val="center"/>
             </w:pPr>
             <w:r>
-              <w:t>成员</w:t>
-            </w:r>
-            <w:r>
-              <w:t>3</w:t>
-            </w:r>
-          </w:p>
-        </w:tc>
-        <w:tc>
-          <w:tcPr>
-            <w:tcW w:w="1735" w:type="dxa"/>
-            <w:vAlign w:val="center"/>
-          </w:tcPr>
-          <w:p>
-            <w:pPr>
-              <w:pStyle w:val="TableText"/>
-              <w:jc w:val="center"/>
-            </w:pPr>
-            <w:r>
-              <w:t>待填</w:t>
-            </w:r>
-          </w:p>
-        </w:tc>
-        <w:tc>
-          <w:tcPr>
-            <w:tcW w:w="1735" w:type="dxa"/>
-            <w:vAlign w:val="center"/>
-          </w:tcPr>
-          <w:p>
-            <w:pPr>
-              <w:pStyle w:val="TableText"/>
-              <w:jc w:val="center"/>
-            </w:pPr>
-            <w:r>
-              <w:t>待填</w:t>
-            </w:r>
-          </w:p>
-        </w:tc>
-        <w:tc>
-          <w:tcPr>
-            <w:tcW w:w="2120" w:type="dxa"/>
-            <w:vAlign w:val="center"/>
-          </w:tcPr>
-          <w:p>
-            <w:pPr>
-              <w:pStyle w:val="TableText"/>
-              <w:jc w:val="center"/>
-            </w:pPr>
-            <w:r>
-              <w:t>待填</w:t>
-            </w:r>
-          </w:p>
-        </w:tc>
-        <w:tc>
-          <w:tcPr>
-            <w:tcW w:w="2699" w:type="dxa"/>
-            <w:vAlign w:val="center"/>
-          </w:tcPr>
-          <w:p>
-            <w:pPr>
-              <w:pStyle w:val="TableText"/>
-              <w:jc w:val="center"/>
-            </w:pPr>
-            <w:r>
-              <w:t>待填</w:t>
-            </w:r>
-          </w:p>
-        </w:tc>
-      </w:tr>
-      <w:tr>
-        <w:trPr>
-          <w:cantSplit/>
-          <w:jc w:val="center"/>
-        </w:trPr>
-        <w:tc>
-          <w:tcPr>
-            <w:tcW w:w="1349" w:type="dxa"/>
-            <w:vAlign w:val="center"/>
-          </w:tcPr>
-          <w:p>
-            <w:pPr>
-              <w:pStyle w:val="TableText"/>
-              <w:jc w:val="center"/>
-            </w:pPr>
-            <w:r>
-              <w:t>成员</w:t>
-            </w:r>
-            <w:r>
-              <w:t>4</w:t>
-            </w:r>
-          </w:p>
-        </w:tc>
-        <w:tc>
-          <w:tcPr>
-            <w:tcW w:w="1735" w:type="dxa"/>
-            <w:vAlign w:val="center"/>
-          </w:tcPr>
-          <w:p>
-            <w:pPr>
-              <w:pStyle w:val="TableText"/>
-              <w:jc w:val="center"/>
-            </w:pPr>
-            <w:r>
-              <w:t>待填</w:t>
-            </w:r>
-          </w:p>
-        </w:tc>
-        <w:tc>
-          <w:tcPr>
-            <w:tcW w:w="1735" w:type="dxa"/>
-            <w:vAlign w:val="center"/>
-          </w:tcPr>
-          <w:p>
-            <w:pPr>
-              <w:pStyle w:val="TableText"/>
-              <w:jc w:val="center"/>
-            </w:pPr>
-            <w:r>
-              <w:t>待填</w:t>
-            </w:r>
-          </w:p>
-        </w:tc>
-        <w:tc>
-          <w:tcPr>
-            <w:tcW w:w="2120" w:type="dxa"/>
-            <w:vAlign w:val="center"/>
-          </w:tcPr>
-          <w:p>
-            <w:pPr>
-              <w:pStyle w:val="TableText"/>
-              <w:jc w:val="center"/>
-            </w:pPr>
-            <w:r>
-              <w:t>待填</w:t>
-            </w:r>
-          </w:p>
-        </w:tc>
-        <w:tc>
-          <w:tcPr>
-            <w:tcW w:w="2699" w:type="dxa"/>
-            <w:vAlign w:val="center"/>
-          </w:tcPr>
-          <w:p>
-            <w:pPr>
-              <w:pStyle w:val="TableText"/>
-              <w:jc w:val="center"/>
-            </w:pPr>
-            <w:r>
-              <w:t>待填</w:t>
+              <w:t>汇总数据样例，统一权限、页面样式和运行配置</w:t>
             </w:r>
           </w:p>
         </w:tc>
@@ -4108,205 +3696,8 @@
         <w:spacing w:after="60" w:line="40" w:lineRule="exact"/>
       </w:pPr>
     </w:p>
-    <w:p>
-      <w:r>
-        <w:t>贡献比例由小组根据实际工作量确认，合计</w:t>
-      </w:r>
-      <w:r>
-        <w:t>100%</w:t>
-      </w:r>
-      <w:r>
-        <w:t>，由组长汇总。其他正式文档引用本表；各次测试的执行日期仍保留在测试记录中。</w:t>
-      </w:r>
-    </w:p>
-    <w:p>
-      <w:pPr>
-        <w:pStyle w:val="1"/>
-      </w:pPr>
-      <w:bookmarkStart w:id="20" w:name="h_40ea459707d3329c5dcb"/>
-      <w:bookmarkStart w:id="21" w:name="_Toc242861782"/>
-      <w:r>
-        <w:t xml:space="preserve">6 </w:t>
-      </w:r>
-      <w:r>
-        <w:t>当前版本补充</w:t>
-      </w:r>
-      <w:bookmarkEnd w:id="20"/>
-      <w:bookmarkEnd w:id="21"/>
-    </w:p>
-    <w:p>
-      <w:r>
-        <w:t>数量规则改为最多</w:t>
-      </w:r>
-      <w:r>
-        <w:t>4</w:t>
-      </w:r>
-      <w:r>
-        <w:t>个首选和</w:t>
-      </w:r>
-      <w:r>
-        <w:t>2</w:t>
-      </w:r>
-      <w:r>
-        <w:t>个备选，未填满也可提交；关课根据全部首选空位尝试备选递补，最多注册</w:t>
-      </w:r>
-      <w:r>
-        <w:t>4</w:t>
-      </w:r>
-      <w:r>
-        <w:t>门。重新开启使用关闭前快照恢复，已有成绩时拒绝。页面删除重复说明并将结果明细折叠，便于课程演示。</w:t>
-      </w:r>
-    </w:p>
-    <w:p>
-      <w:r>
-        <w:t>原站出现选课会话不可用时，日志确认缺少</w:t>
-      </w:r>
-      <w:r>
-        <w:rPr>
-          <w:rFonts w:ascii="Consolas" w:hAnsi="Consolas"/>
-          <w:sz w:val="18"/>
-        </w:rPr>
-        <w:t>selection_sessions</w:t>
-      </w:r>
-      <w:r>
-        <w:t>表。补建后会话登记、刷新及退出清理通过，随后</w:t>
-      </w:r>
-      <w:r>
-        <w:t>9</w:t>
-      </w:r>
-      <w:r>
-        <w:t>个升级脚本全部执行成功。该问题说明代码拉取与数据库升级需要分别验证。</w:t>
-      </w:r>
-    </w:p>
-    <w:p>
-      <w:r>
-        <w:t>截至</w:t>
-      </w:r>
-      <w:r>
-        <w:t>2026</w:t>
-      </w:r>
-      <w:r>
-        <w:t>年</w:t>
-      </w:r>
-      <w:r>
-        <w:t>10</w:t>
-      </w:r>
-      <w:r>
-        <w:t>月</w:t>
-      </w:r>
-      <w:r>
-        <w:t>14</w:t>
-      </w:r>
-      <w:r>
-        <w:t>日，当前代码提交</w:t>
-      </w:r>
-      <w:r>
-        <w:rPr>
-          <w:rFonts w:ascii="Consolas" w:hAnsi="Consolas"/>
-          <w:sz w:val="18"/>
-        </w:rPr>
-        <w:t>73b5336</w:t>
-      </w:r>
-      <w:r>
-        <w:t>已完成独立临时</w:t>
-      </w:r>
-      <w:r>
-        <w:t>MySQL</w:t>
-      </w:r>
-      <w:r>
-        <w:t>、</w:t>
-      </w:r>
-      <w:r>
-        <w:t>PHP</w:t>
-      </w:r>
-      <w:r>
-        <w:t>服务及会话目录中的完整回归：</w:t>
-      </w:r>
-      <w:r>
-        <w:t>39</w:t>
-      </w:r>
-      <w:r>
-        <w:t>个阶段、</w:t>
-      </w:r>
-      <w:r>
-        <w:t>1067</w:t>
-      </w:r>
-      <w:r>
-        <w:t>项检查全部通过，退出码</w:t>
-      </w:r>
-      <w:r>
-        <w:t>0</w:t>
-      </w:r>
-      <w:r>
-        <w:t>，最后一席竞争执行</w:t>
-      </w:r>
-      <w:r>
-        <w:t>5</w:t>
-      </w:r>
-      <w:r>
-        <w:t>轮。该回归覆盖页面精简后的实现，以及先修课、秒级时间冲突和数据库连接复用修复；其中先修与时间边界</w:t>
-      </w:r>
-      <w:r>
-        <w:t>13</w:t>
-      </w:r>
-      <w:r>
-        <w:t>项、</w:t>
-      </w:r>
-      <w:r>
-        <w:t>HTTP</w:t>
-      </w:r>
-      <w:r>
-        <w:t>连接检查</w:t>
-      </w:r>
-      <w:r>
-        <w:t>15</w:t>
-      </w:r>
-      <w:r>
-        <w:t>项均通过。</w:t>
-      </w:r>
-      <w:r>
-        <w:t>PHP</w:t>
-      </w:r>
-      <w:r>
-        <w:t>服务日志无</w:t>
-      </w:r>
-      <w:r>
-        <w:t>Warning</w:t>
-      </w:r>
-      <w:r>
-        <w:t>、</w:t>
-      </w:r>
-      <w:r>
-        <w:t>Notice</w:t>
-      </w:r>
-      <w:r>
-        <w:t>、</w:t>
-      </w:r>
-      <w:r>
-        <w:t>Fatal error</w:t>
-      </w:r>
-      <w:r>
-        <w:t>或未处理异常。浏览器人工操作、键盘、窄屏视觉验收和大规模性能测试仍未完成。完整记录见</w:t>
-      </w:r>
-      <w:hyperlink r:id="rId11">
-        <w:r>
-          <w:t>最新自动检查记录</w:t>
-        </w:r>
-      </w:hyperlink>
-      <w:r>
-        <w:t>，新增边界明细见</w:t>
-      </w:r>
-      <w:hyperlink r:id="rId12">
-        <w:r>
-          <w:t>边界检查记录</w:t>
-        </w:r>
-      </w:hyperlink>
-      <w:r>
-        <w:t>。</w:t>
-      </w:r>
-    </w:p>
     <w:sectPr>
-      <w:footerReference w:type="default" r:id="rId13"/>
+      <w:footerReference w:type="default" r:id="rId11"/>
       <w:pgSz w:w="11906" w:h="16838"/>
       <w:pgMar w:top="1134" w:right="1134" w:bottom="1134" w:left="1134" w:header="720" w:footer="510" w:gutter="0"/>
       <w:cols w:space="720"/>
@@ -4580,31 +3971,31 @@
       </w:rPr>
     </w:lvl>
   </w:abstractNum>
-  <w:num w:numId="1" w16cid:durableId="277881224">
+  <w:num w:numId="1" w16cid:durableId="1844316705">
     <w:abstractNumId w:val="8"/>
   </w:num>
-  <w:num w:numId="2" w16cid:durableId="2027822225">
+  <w:num w:numId="2" w16cid:durableId="123426831">
     <w:abstractNumId w:val="6"/>
   </w:num>
-  <w:num w:numId="3" w16cid:durableId="1496068572">
+  <w:num w:numId="3" w16cid:durableId="121387255">
     <w:abstractNumId w:val="5"/>
   </w:num>
-  <w:num w:numId="4" w16cid:durableId="339089383">
+  <w:num w:numId="4" w16cid:durableId="1124235311">
     <w:abstractNumId w:val="4"/>
   </w:num>
-  <w:num w:numId="5" w16cid:durableId="249504568">
+  <w:num w:numId="5" w16cid:durableId="1612392791">
     <w:abstractNumId w:val="7"/>
   </w:num>
-  <w:num w:numId="6" w16cid:durableId="125658731">
+  <w:num w:numId="6" w16cid:durableId="978732272">
     <w:abstractNumId w:val="3"/>
   </w:num>
-  <w:num w:numId="7" w16cid:durableId="1348671810">
+  <w:num w:numId="7" w16cid:durableId="1486046089">
     <w:abstractNumId w:val="2"/>
   </w:num>
-  <w:num w:numId="8" w16cid:durableId="790199842">
+  <w:num w:numId="8" w16cid:durableId="1002395006">
     <w:abstractNumId w:val="1"/>
   </w:num>
-  <w:num w:numId="9" w16cid:durableId="429470578">
+  <w:num w:numId="9" w16cid:durableId="1039667373">
     <w:abstractNumId w:val="0"/>
   </w:num>
 </w:numbering>
@@ -5932,8 +5323,13 @@
     <w:qFormat/>
     <w:rsid w:val="00FC693F"/>
     <w:pPr>
+      <w:keepNext w:val="0"/>
+      <w:spacing w:before="0" w:after="40" w:line="240" w:lineRule="auto"/>
       <w:outlineLvl w:val="9"/>
     </w:pPr>
+    <w:rPr>
+      <w:sz w:val="21"/>
+    </w:rPr>
   </w:style>
   <w:style w:type="table" w:styleId="aff1">
     <w:name w:val="Table Grid"/>
@@ -16014,21 +15410,23 @@
   <w:style w:type="paragraph" w:customStyle="1" w:styleId="TOC11">
     <w:name w:val="TOC 11"/>
     <w:pPr>
-      <w:spacing w:after="80"/>
+      <w:spacing w:after="40" w:line="240" w:lineRule="auto"/>
     </w:pPr>
     <w:rPr>
       <w:rFonts w:ascii="Calibri" w:eastAsia="宋体" w:hAnsi="Calibri"/>
       <w:color w:val="000000"/>
+      <w:sz w:val="21"/>
     </w:rPr>
   </w:style>
   <w:style w:type="paragraph" w:customStyle="1" w:styleId="TOC21">
     <w:name w:val="TOC 21"/>
     <w:pPr>
-      <w:spacing w:after="80"/>
+      <w:spacing w:after="40" w:line="240" w:lineRule="auto"/>
     </w:pPr>
     <w:rPr>
       <w:rFonts w:ascii="Calibri" w:eastAsia="宋体" w:hAnsi="Calibri"/>
       <w:color w:val="000000"/>
+      <w:sz w:val="21"/>
     </w:rPr>
   </w:style>
   <w:style w:type="paragraph" w:styleId="TOC1">
@@ -16038,7 +15436,7 @@
     <w:autoRedefine/>
     <w:uiPriority w:val="39"/>
     <w:unhideWhenUsed/>
-    <w:rsid w:val="00BE2DD2"/>
+    <w:rsid w:val="00522CC6"/>
   </w:style>
   <w:style w:type="paragraph" w:styleId="TOC2">
     <w:name w:val="toc 2"/>
@@ -16047,7 +15445,7 @@
     <w:autoRedefine/>
     <w:uiPriority w:val="39"/>
     <w:unhideWhenUsed/>
-    <w:rsid w:val="00BE2DD2"/>
+    <w:rsid w:val="00522CC6"/>
     <w:pPr>
       <w:ind w:leftChars="200" w:left="420"/>
     </w:pPr>
@@ -16057,7 +15455,7 @@
     <w:basedOn w:val="a2"/>
     <w:uiPriority w:val="99"/>
     <w:unhideWhenUsed/>
-    <w:rsid w:val="00BE2DD2"/>
+    <w:rsid w:val="00522CC6"/>
     <w:rPr>
       <w:color w:val="0000FF" w:themeColor="hyperlink"/>
       <w:u w:val="single"/>

</xml_diff>

<commit_message>
Update work summary with member names and contribution percentages
</commit_message>
<xml_diff>
--- a/课程注册系统工作总结.docx
+++ b/课程注册系统工作总结.docx
@@ -41,7 +41,6 @@
           <w:tab w:val="right" w:leader="dot" w:pos="9628"/>
         </w:tabs>
         <w:rPr>
-          <w:rFonts w:hint="eastAsia"/>
           <w:noProof/>
         </w:rPr>
       </w:pPr>
@@ -147,7 +146,6 @@
           <w:tab w:val="right" w:leader="dot" w:pos="9628"/>
         </w:tabs>
         <w:rPr>
-          <w:rFonts w:hint="eastAsia"/>
           <w:noProof/>
         </w:rPr>
       </w:pPr>
@@ -244,7 +242,6 @@
           <w:tab w:val="right" w:leader="dot" w:pos="9628"/>
         </w:tabs>
         <w:rPr>
-          <w:rFonts w:hint="eastAsia"/>
           <w:noProof/>
         </w:rPr>
       </w:pPr>
@@ -341,7 +338,6 @@
           <w:tab w:val="right" w:leader="dot" w:pos="9628"/>
         </w:tabs>
         <w:rPr>
-          <w:rFonts w:hint="eastAsia"/>
           <w:noProof/>
         </w:rPr>
       </w:pPr>
@@ -438,7 +434,6 @@
           <w:tab w:val="right" w:leader="dot" w:pos="9628"/>
         </w:tabs>
         <w:rPr>
-          <w:rFonts w:hint="eastAsia"/>
           <w:noProof/>
         </w:rPr>
       </w:pPr>
@@ -536,7 +531,6 @@
         </w:tabs>
         <w:ind w:left="440"/>
         <w:rPr>
-          <w:rFonts w:hint="eastAsia"/>
           <w:noProof/>
         </w:rPr>
       </w:pPr>
@@ -553,14 +547,14 @@
             <w:rStyle w:val="aff9"/>
             <w:noProof/>
           </w:rPr>
-          <w:t>成员</w:t>
+          <w:t>姚席诚</w:t>
         </w:r>
         <w:r>
           <w:rPr>
             <w:rStyle w:val="aff9"/>
             <w:noProof/>
           </w:rPr>
-          <w:t xml:space="preserve">1 </w:t>
+          <w:t xml:space="preserve"> </w:t>
         </w:r>
         <w:r>
           <w:rPr>
@@ -648,7 +642,6 @@
         </w:tabs>
         <w:ind w:left="440"/>
         <w:rPr>
-          <w:rFonts w:hint="eastAsia"/>
           <w:noProof/>
         </w:rPr>
       </w:pPr>
@@ -665,14 +658,14 @@
             <w:rStyle w:val="aff9"/>
             <w:noProof/>
           </w:rPr>
-          <w:t>成员</w:t>
+          <w:t>徐康原</w:t>
         </w:r>
         <w:r>
           <w:rPr>
             <w:rStyle w:val="aff9"/>
             <w:noProof/>
           </w:rPr>
-          <w:t xml:space="preserve">2 </w:t>
+          <w:t xml:space="preserve"> </w:t>
         </w:r>
         <w:r>
           <w:rPr>
@@ -760,7 +753,6 @@
         </w:tabs>
         <w:ind w:left="440"/>
         <w:rPr>
-          <w:rFonts w:hint="eastAsia"/>
           <w:noProof/>
         </w:rPr>
       </w:pPr>
@@ -777,14 +769,14 @@
             <w:rStyle w:val="aff9"/>
             <w:noProof/>
           </w:rPr>
-          <w:t>成员</w:t>
+          <w:t>李文龙</w:t>
         </w:r>
         <w:r>
           <w:rPr>
             <w:rStyle w:val="aff9"/>
             <w:noProof/>
           </w:rPr>
-          <w:t xml:space="preserve">3 </w:t>
+          <w:t xml:space="preserve"> </w:t>
         </w:r>
         <w:r>
           <w:rPr>
@@ -872,7 +864,6 @@
         </w:tabs>
         <w:ind w:left="440"/>
         <w:rPr>
-          <w:rFonts w:hint="eastAsia"/>
           <w:noProof/>
         </w:rPr>
       </w:pPr>
@@ -889,14 +880,14 @@
             <w:rStyle w:val="aff9"/>
             <w:noProof/>
           </w:rPr>
-          <w:t>成员</w:t>
+          <w:t>赵科锦</w:t>
         </w:r>
         <w:r>
           <w:rPr>
             <w:rStyle w:val="aff9"/>
             <w:noProof/>
           </w:rPr>
-          <w:t xml:space="preserve">4 </w:t>
+          <w:t xml:space="preserve"> </w:t>
         </w:r>
         <w:r>
           <w:rPr>
@@ -984,7 +975,6 @@
         </w:tabs>
         <w:ind w:left="440"/>
         <w:rPr>
-          <w:rFonts w:hint="eastAsia"/>
           <w:noProof/>
         </w:rPr>
       </w:pPr>
@@ -1001,7 +991,7 @@
             <w:rStyle w:val="aff9"/>
             <w:noProof/>
           </w:rPr>
-          <w:t>分工汇总</w:t>
+          <w:t>分工与贡献度汇总</w:t>
         </w:r>
         <w:r>
           <w:rPr>
@@ -1616,23 +1606,46 @@
       <w:bookmarkEnd w:id="9"/>
     </w:p>
     <w:p>
+      <w:r>
+        <w:t>本组成员贡献度为：姚席诚</w:t>
+      </w:r>
+      <w:r>
+        <w:t>30%</w:t>
+      </w:r>
+      <w:r>
+        <w:t>、徐康原</w:t>
+      </w:r>
+      <w:r>
+        <w:t>20%</w:t>
+      </w:r>
+      <w:r>
+        <w:t>、李文龙</w:t>
+      </w:r>
+      <w:r>
+        <w:t>20%</w:t>
+      </w:r>
+      <w:r>
+        <w:t>、赵科锦</w:t>
+      </w:r>
+      <w:r>
+        <w:t>30%</w:t>
+      </w:r>
+      <w:r>
+        <w:t>，合计</w:t>
+      </w:r>
+      <w:r>
+        <w:t>100%</w:t>
+      </w:r>
+      <w:r>
+        <w:t>。贡献度包括模块开发、问题修复、测试验证、联调和文档整理。</w:t>
+      </w:r>
+    </w:p>
+    <w:p>
       <w:pPr>
         <w:keepNext/>
       </w:pPr>
       <w:r>
-        <w:t>成员</w:t>
-      </w:r>
-      <w:r>
-        <w:t>1—</w:t>
-      </w:r>
-      <w:r>
-        <w:t>成员</w:t>
-      </w:r>
-      <w:r>
-        <w:t>4</w:t>
-      </w:r>
-      <w:r>
-        <w:t>分别负责学生、教师、教务和公共模块。以下记录按模块说明实现、问题处理和测试依据，程序路径以</w:t>
+        <w:t>姚席诚、徐康原、李文龙、赵科锦分别负责学生、教师、教务和公共模块。以下记录按模块说明实现、问题处理和测试依据，程序路径以</w:t>
       </w:r>
       <w:r>
         <w:rPr>
@@ -1677,9 +1690,10 @@
         <w:tblLook w:val="04A0" w:firstRow="1" w:lastRow="0" w:firstColumn="1" w:lastColumn="0" w:noHBand="0" w:noVBand="1"/>
       </w:tblPr>
       <w:tblGrid>
-        <w:gridCol w:w="2120"/>
-        <w:gridCol w:w="3180"/>
-        <w:gridCol w:w="4337"/>
+        <w:gridCol w:w="1134"/>
+        <w:gridCol w:w="1701"/>
+        <w:gridCol w:w="5896"/>
+        <w:gridCol w:w="907"/>
       </w:tblGrid>
       <w:tr>
         <w:trPr>
@@ -1689,7 +1703,7 @@
         </w:trPr>
         <w:tc>
           <w:tcPr>
-            <w:tcW w:w="2120" w:type="dxa"/>
+            <w:tcW w:w="1134" w:type="dxa"/>
             <w:shd w:val="clear" w:color="auto" w:fill="E6EEF5"/>
             <w:vAlign w:val="center"/>
           </w:tcPr>
@@ -1709,7 +1723,7 @@
         </w:tc>
         <w:tc>
           <w:tcPr>
-            <w:tcW w:w="3180" w:type="dxa"/>
+            <w:tcW w:w="1701" w:type="dxa"/>
             <w:shd w:val="clear" w:color="auto" w:fill="E6EEF5"/>
             <w:vAlign w:val="center"/>
           </w:tcPr>
@@ -1728,7 +1742,7 @@
         </w:tc>
         <w:tc>
           <w:tcPr>
-            <w:tcW w:w="4337" w:type="dxa"/>
+            <w:tcW w:w="5896" w:type="dxa"/>
             <w:shd w:val="clear" w:color="auto" w:fill="E6EEF5"/>
             <w:vAlign w:val="center"/>
           </w:tcPr>
@@ -1742,6 +1756,26 @@
                 <w:b/>
               </w:rPr>
               <w:t>工作范围</w:t>
+            </w:r>
+          </w:p>
+        </w:tc>
+        <w:tc>
+          <w:tcPr>
+            <w:tcW w:w="907" w:type="dxa"/>
+            <w:shd w:val="clear" w:color="auto" w:fill="E6EEF5"/>
+            <w:vAlign w:val="center"/>
+          </w:tcPr>
+          <w:p>
+            <w:pPr>
+              <w:pStyle w:val="TableText"/>
+              <w:keepNext/>
+              <w:jc w:val="center"/>
+            </w:pPr>
+            <w:r>
+              <w:rPr>
+                <w:b/>
+              </w:rPr>
+              <w:t>贡献度</w:t>
             </w:r>
           </w:p>
         </w:tc>
@@ -1753,7 +1787,7 @@
         </w:trPr>
         <w:tc>
           <w:tcPr>
-            <w:tcW w:w="2120" w:type="dxa"/>
+            <w:tcW w:w="1134" w:type="dxa"/>
             <w:vAlign w:val="center"/>
           </w:tcPr>
           <w:p>
@@ -1762,16 +1796,13 @@
               <w:jc w:val="center"/>
             </w:pPr>
             <w:r>
-              <w:t>成员</w:t>
-            </w:r>
-            <w:r>
-              <w:t>1</w:t>
+              <w:t>姚席诚</w:t>
             </w:r>
           </w:p>
         </w:tc>
         <w:tc>
           <w:tcPr>
-            <w:tcW w:w="3180" w:type="dxa"/>
+            <w:tcW w:w="1701" w:type="dxa"/>
             <w:vAlign w:val="center"/>
           </w:tcPr>
           <w:p>
@@ -1785,7 +1816,7 @@
         </w:tc>
         <w:tc>
           <w:tcPr>
-            <w:tcW w:w="4337" w:type="dxa"/>
+            <w:tcW w:w="5896" w:type="dxa"/>
             <w:vAlign w:val="center"/>
           </w:tcPr>
           <w:p>
@@ -1794,6 +1825,21 @@
             </w:pPr>
             <w:r>
               <w:t>选课、退课、课表、成绩查询、草稿和整份删除；完成学生端测试</w:t>
+            </w:r>
+          </w:p>
+        </w:tc>
+        <w:tc>
+          <w:tcPr>
+            <w:tcW w:w="907" w:type="dxa"/>
+            <w:vAlign w:val="center"/>
+          </w:tcPr>
+          <w:p>
+            <w:pPr>
+              <w:pStyle w:val="TableText"/>
+              <w:jc w:val="center"/>
+            </w:pPr>
+            <w:r>
+              <w:t>30%</w:t>
             </w:r>
           </w:p>
         </w:tc>
@@ -1805,7 +1851,7 @@
         </w:trPr>
         <w:tc>
           <w:tcPr>
-            <w:tcW w:w="2120" w:type="dxa"/>
+            <w:tcW w:w="1134" w:type="dxa"/>
             <w:vAlign w:val="center"/>
           </w:tcPr>
           <w:p>
@@ -1814,16 +1860,13 @@
               <w:jc w:val="center"/>
             </w:pPr>
             <w:r>
-              <w:t>成员</w:t>
-            </w:r>
-            <w:r>
-              <w:t>2</w:t>
+              <w:t>徐康原</w:t>
             </w:r>
           </w:p>
         </w:tc>
         <w:tc>
           <w:tcPr>
-            <w:tcW w:w="3180" w:type="dxa"/>
+            <w:tcW w:w="1701" w:type="dxa"/>
             <w:vAlign w:val="center"/>
           </w:tcPr>
           <w:p>
@@ -1837,7 +1880,7 @@
         </w:tc>
         <w:tc>
           <w:tcPr>
-            <w:tcW w:w="4337" w:type="dxa"/>
+            <w:tcW w:w="5896" w:type="dxa"/>
             <w:vAlign w:val="center"/>
           </w:tcPr>
           <w:p>
@@ -1846,6 +1889,21 @@
             </w:pPr>
             <w:r>
               <w:t>教学班认领、取消认领、学生名单和成绩录入；完成教师端测试</w:t>
+            </w:r>
+          </w:p>
+        </w:tc>
+        <w:tc>
+          <w:tcPr>
+            <w:tcW w:w="907" w:type="dxa"/>
+            <w:vAlign w:val="center"/>
+          </w:tcPr>
+          <w:p>
+            <w:pPr>
+              <w:pStyle w:val="TableText"/>
+              <w:jc w:val="center"/>
+            </w:pPr>
+            <w:r>
+              <w:t>20%</w:t>
             </w:r>
           </w:p>
         </w:tc>
@@ -1857,7 +1915,7 @@
         </w:trPr>
         <w:tc>
           <w:tcPr>
-            <w:tcW w:w="2120" w:type="dxa"/>
+            <w:tcW w:w="1134" w:type="dxa"/>
             <w:vAlign w:val="center"/>
           </w:tcPr>
           <w:p>
@@ -1866,16 +1924,13 @@
               <w:jc w:val="center"/>
             </w:pPr>
             <w:r>
-              <w:t>成员</w:t>
-            </w:r>
-            <w:r>
-              <w:t>3</w:t>
+              <w:t>李文龙</w:t>
             </w:r>
           </w:p>
         </w:tc>
         <w:tc>
           <w:tcPr>
-            <w:tcW w:w="3180" w:type="dxa"/>
+            <w:tcW w:w="1701" w:type="dxa"/>
             <w:vAlign w:val="center"/>
           </w:tcPr>
           <w:p>
@@ -1889,7 +1944,7 @@
         </w:tc>
         <w:tc>
           <w:tcPr>
-            <w:tcW w:w="4337" w:type="dxa"/>
+            <w:tcW w:w="5896" w:type="dxa"/>
             <w:vAlign w:val="center"/>
           </w:tcPr>
           <w:p>
@@ -1898,6 +1953,21 @@
             </w:pPr>
             <w:r>
               <w:t>关闭选课、停开和备选补位，人员资料、任教资格及模拟计费；完成管理端测试与结果核对</w:t>
+            </w:r>
+          </w:p>
+        </w:tc>
+        <w:tc>
+          <w:tcPr>
+            <w:tcW w:w="907" w:type="dxa"/>
+            <w:vAlign w:val="center"/>
+          </w:tcPr>
+          <w:p>
+            <w:pPr>
+              <w:pStyle w:val="TableText"/>
+              <w:jc w:val="center"/>
+            </w:pPr>
+            <w:r>
+              <w:t>20%</w:t>
             </w:r>
           </w:p>
         </w:tc>
@@ -1909,7 +1979,7 @@
         </w:trPr>
         <w:tc>
           <w:tcPr>
-            <w:tcW w:w="2120" w:type="dxa"/>
+            <w:tcW w:w="1134" w:type="dxa"/>
             <w:vAlign w:val="center"/>
           </w:tcPr>
           <w:p>
@@ -1918,16 +1988,13 @@
               <w:jc w:val="center"/>
             </w:pPr>
             <w:r>
-              <w:t>成员</w:t>
-            </w:r>
-            <w:r>
-              <w:t>4</w:t>
+              <w:t>赵科锦</w:t>
             </w:r>
           </w:p>
         </w:tc>
         <w:tc>
           <w:tcPr>
-            <w:tcW w:w="3180" w:type="dxa"/>
+            <w:tcW w:w="1701" w:type="dxa"/>
             <w:vAlign w:val="center"/>
           </w:tcPr>
           <w:p>
@@ -1941,7 +2008,7 @@
         </w:tc>
         <w:tc>
           <w:tcPr>
-            <w:tcW w:w="4337" w:type="dxa"/>
+            <w:tcW w:w="5896" w:type="dxa"/>
             <w:vAlign w:val="center"/>
           </w:tcPr>
           <w:p>
@@ -1950,6 +2017,21 @@
             </w:pPr>
             <w:r>
               <w:t>登录退出、首页、课程查询与详情、共用样式和只读目录；整理数据库样例与启动说明</w:t>
+            </w:r>
+          </w:p>
+        </w:tc>
+        <w:tc>
+          <w:tcPr>
+            <w:tcW w:w="907" w:type="dxa"/>
+            <w:vAlign w:val="center"/>
+          </w:tcPr>
+          <w:p>
+            <w:pPr>
+              <w:pStyle w:val="TableText"/>
+              <w:jc w:val="center"/>
+            </w:pPr>
+            <w:r>
+              <w:t>30%</w:t>
             </w:r>
           </w:p>
         </w:tc>
@@ -1970,10 +2052,10 @@
         <w:t xml:space="preserve">5.1 </w:t>
       </w:r>
       <w:r>
-        <w:t>成员</w:t>
+        <w:t>姚席诚</w:t>
       </w:r>
       <w:r>
-        <w:t xml:space="preserve">1 </w:t>
+        <w:t xml:space="preserve"> </w:t>
       </w:r>
       <w:r>
         <w:t>学生模块</w:t>
@@ -2249,19 +2331,7 @@
               <w:t>selection_ui.test.cjs</w:t>
             </w:r>
             <w:r>
-              <w:t>检查选课提示。成绩和关课结果分别与成员</w:t>
-            </w:r>
-            <w:r>
-              <w:t>2</w:t>
-            </w:r>
-            <w:r>
-              <w:t>、成员</w:t>
-            </w:r>
-            <w:r>
-              <w:t>3</w:t>
-            </w:r>
-            <w:r>
-              <w:t>联调。</w:t>
+              <w:t>检查选课提示。成绩和关课结果分别与徐康原、李文龙联调。</w:t>
             </w:r>
           </w:p>
         </w:tc>
@@ -2318,10 +2388,10 @@
         <w:t xml:space="preserve">5.2 </w:t>
       </w:r>
       <w:r>
-        <w:t>成员</w:t>
+        <w:t>徐康原</w:t>
       </w:r>
       <w:r>
-        <w:t xml:space="preserve">2 </w:t>
+        <w:t xml:space="preserve"> </w:t>
       </w:r>
       <w:r>
         <w:t>教师模块</w:t>
@@ -2597,19 +2667,7 @@
               <w:t>http_db_grades.ps1</w:t>
             </w:r>
             <w:r>
-              <w:t>检查页面流程。与成员</w:t>
-            </w:r>
-            <w:r>
-              <w:t>3</w:t>
-            </w:r>
-            <w:r>
-              <w:t>核对资格，与成员</w:t>
-            </w:r>
-            <w:r>
-              <w:t>1</w:t>
-            </w:r>
-            <w:r>
-              <w:t>核对成绩显示。</w:t>
+              <w:t>检查页面流程。与李文龙核对资格，与姚席诚核对成绩显示。</w:t>
             </w:r>
           </w:p>
         </w:tc>
@@ -2665,10 +2723,10 @@
         <w:t xml:space="preserve">5.3 </w:t>
       </w:r>
       <w:r>
-        <w:t>成员</w:t>
+        <w:t>李文龙</w:t>
       </w:r>
       <w:r>
-        <w:t xml:space="preserve">3 </w:t>
+        <w:t xml:space="preserve"> </w:t>
       </w:r>
       <w:r>
         <w:t>教务员模块</w:t>
@@ -2861,13 +2919,7 @@
               <w:t>D02</w:t>
             </w:r>
             <w:r>
-              <w:t>。人员有关联记录时拒绝删除，资料编辑比较版本；账号停用和密码重置与成员</w:t>
-            </w:r>
-            <w:r>
-              <w:t>4</w:t>
-            </w:r>
-            <w:r>
-              <w:t>共同核对，关联</w:t>
+              <w:t>。人员有关联记录时拒绝删除，资料编辑比较版本；账号停用和密码重置与赵科锦共同核对，关联</w:t>
             </w:r>
             <w:r>
               <w:t>D04</w:t>
@@ -3015,10 +3067,10 @@
         <w:t xml:space="preserve">5.4 </w:t>
       </w:r>
       <w:r>
-        <w:t>成员</w:t>
+        <w:t>赵科锦</w:t>
       </w:r>
       <w:r>
-        <w:t xml:space="preserve">4 </w:t>
+        <w:t xml:space="preserve"> </w:t>
       </w:r>
       <w:r>
         <w:t>登录与首页模块</w:t>
@@ -3386,7 +3438,7 @@
         <w:t xml:space="preserve">5.5 </w:t>
       </w:r>
       <w:r>
-        <w:t>分工汇总</w:t>
+        <w:t>分工与贡献度汇总</w:t>
       </w:r>
       <w:bookmarkEnd w:id="18"/>
       <w:bookmarkEnd w:id="19"/>
@@ -3413,9 +3465,10 @@
         <w:tblLook w:val="04A0" w:firstRow="1" w:lastRow="0" w:firstColumn="1" w:lastColumn="0" w:noHBand="0" w:noVBand="1"/>
       </w:tblPr>
       <w:tblGrid>
-        <w:gridCol w:w="2120"/>
-        <w:gridCol w:w="3180"/>
-        <w:gridCol w:w="4337"/>
+        <w:gridCol w:w="1134"/>
+        <w:gridCol w:w="3628"/>
+        <w:gridCol w:w="3969"/>
+        <w:gridCol w:w="907"/>
       </w:tblGrid>
       <w:tr>
         <w:trPr>
@@ -3425,7 +3478,7 @@
         </w:trPr>
         <w:tc>
           <w:tcPr>
-            <w:tcW w:w="2120" w:type="dxa"/>
+            <w:tcW w:w="1134" w:type="dxa"/>
             <w:shd w:val="clear" w:color="auto" w:fill="E6EEF5"/>
             <w:vAlign w:val="center"/>
           </w:tcPr>
@@ -3445,7 +3498,7 @@
         </w:tc>
         <w:tc>
           <w:tcPr>
-            <w:tcW w:w="3180" w:type="dxa"/>
+            <w:tcW w:w="3628" w:type="dxa"/>
             <w:shd w:val="clear" w:color="auto" w:fill="E6EEF5"/>
             <w:vAlign w:val="center"/>
           </w:tcPr>
@@ -3464,7 +3517,7 @@
         </w:tc>
         <w:tc>
           <w:tcPr>
-            <w:tcW w:w="4337" w:type="dxa"/>
+            <w:tcW w:w="3969" w:type="dxa"/>
             <w:shd w:val="clear" w:color="auto" w:fill="E6EEF5"/>
             <w:vAlign w:val="center"/>
           </w:tcPr>
@@ -3478,6 +3531,26 @@
                 <w:b/>
               </w:rPr>
               <w:t>联调内容</w:t>
+            </w:r>
+          </w:p>
+        </w:tc>
+        <w:tc>
+          <w:tcPr>
+            <w:tcW w:w="907" w:type="dxa"/>
+            <w:shd w:val="clear" w:color="auto" w:fill="E6EEF5"/>
+            <w:vAlign w:val="center"/>
+          </w:tcPr>
+          <w:p>
+            <w:pPr>
+              <w:pStyle w:val="TableText"/>
+              <w:keepNext/>
+              <w:jc w:val="center"/>
+            </w:pPr>
+            <w:r>
+              <w:rPr>
+                <w:b/>
+              </w:rPr>
+              <w:t>贡献度</w:t>
             </w:r>
           </w:p>
         </w:tc>
@@ -3489,7 +3562,7 @@
         </w:trPr>
         <w:tc>
           <w:tcPr>
-            <w:tcW w:w="2120" w:type="dxa"/>
+            <w:tcW w:w="1134" w:type="dxa"/>
             <w:vAlign w:val="center"/>
           </w:tcPr>
           <w:p>
@@ -3498,16 +3571,13 @@
               <w:jc w:val="center"/>
             </w:pPr>
             <w:r>
-              <w:t>成员</w:t>
-            </w:r>
-            <w:r>
-              <w:t>1</w:t>
+              <w:t>姚席诚</w:t>
             </w:r>
           </w:p>
         </w:tc>
         <w:tc>
           <w:tcPr>
-            <w:tcW w:w="3180" w:type="dxa"/>
+            <w:tcW w:w="3628" w:type="dxa"/>
             <w:vAlign w:val="center"/>
           </w:tcPr>
           <w:p>
@@ -3521,7 +3591,7 @@
         </w:tc>
         <w:tc>
           <w:tcPr>
-            <w:tcW w:w="4337" w:type="dxa"/>
+            <w:tcW w:w="3969" w:type="dxa"/>
             <w:vAlign w:val="center"/>
           </w:tcPr>
           <w:p>
@@ -3530,6 +3600,21 @@
             </w:pPr>
             <w:r>
               <w:t>与教师模块核对成绩显示，与教务模块核对关课补位</w:t>
+            </w:r>
+          </w:p>
+        </w:tc>
+        <w:tc>
+          <w:tcPr>
+            <w:tcW w:w="907" w:type="dxa"/>
+            <w:vAlign w:val="center"/>
+          </w:tcPr>
+          <w:p>
+            <w:pPr>
+              <w:pStyle w:val="TableText"/>
+              <w:jc w:val="center"/>
+            </w:pPr>
+            <w:r>
+              <w:t>30%</w:t>
             </w:r>
           </w:p>
         </w:tc>
@@ -3541,7 +3626,7 @@
         </w:trPr>
         <w:tc>
           <w:tcPr>
-            <w:tcW w:w="2120" w:type="dxa"/>
+            <w:tcW w:w="1134" w:type="dxa"/>
             <w:vAlign w:val="center"/>
           </w:tcPr>
           <w:p>
@@ -3550,16 +3635,13 @@
               <w:jc w:val="center"/>
             </w:pPr>
             <w:r>
-              <w:t>成员</w:t>
-            </w:r>
-            <w:r>
-              <w:t>2</w:t>
+              <w:t>徐康原</w:t>
             </w:r>
           </w:p>
         </w:tc>
         <w:tc>
           <w:tcPr>
-            <w:tcW w:w="3180" w:type="dxa"/>
+            <w:tcW w:w="3628" w:type="dxa"/>
             <w:vAlign w:val="center"/>
           </w:tcPr>
           <w:p>
@@ -3573,7 +3655,7 @@
         </w:tc>
         <w:tc>
           <w:tcPr>
-            <w:tcW w:w="4337" w:type="dxa"/>
+            <w:tcW w:w="3969" w:type="dxa"/>
             <w:vAlign w:val="center"/>
           </w:tcPr>
           <w:p>
@@ -3582,6 +3664,21 @@
             </w:pPr>
             <w:r>
               <w:t>与教务模块核对资格，与学生模块核对查询结果</w:t>
+            </w:r>
+          </w:p>
+        </w:tc>
+        <w:tc>
+          <w:tcPr>
+            <w:tcW w:w="907" w:type="dxa"/>
+            <w:vAlign w:val="center"/>
+          </w:tcPr>
+          <w:p>
+            <w:pPr>
+              <w:pStyle w:val="TableText"/>
+              <w:jc w:val="center"/>
+            </w:pPr>
+            <w:r>
+              <w:t>20%</w:t>
             </w:r>
           </w:p>
         </w:tc>
@@ -3593,7 +3690,7 @@
         </w:trPr>
         <w:tc>
           <w:tcPr>
-            <w:tcW w:w="2120" w:type="dxa"/>
+            <w:tcW w:w="1134" w:type="dxa"/>
             <w:vAlign w:val="center"/>
           </w:tcPr>
           <w:p>
@@ -3602,16 +3699,13 @@
               <w:jc w:val="center"/>
             </w:pPr>
             <w:r>
-              <w:t>成员</w:t>
-            </w:r>
-            <w:r>
-              <w:t>3</w:t>
+              <w:t>李文龙</w:t>
             </w:r>
           </w:p>
         </w:tc>
         <w:tc>
           <w:tcPr>
-            <w:tcW w:w="3180" w:type="dxa"/>
+            <w:tcW w:w="3628" w:type="dxa"/>
             <w:vAlign w:val="center"/>
           </w:tcPr>
           <w:p>
@@ -3625,7 +3719,7 @@
         </w:tc>
         <w:tc>
           <w:tcPr>
-            <w:tcW w:w="4337" w:type="dxa"/>
+            <w:tcW w:w="3969" w:type="dxa"/>
             <w:vAlign w:val="center"/>
           </w:tcPr>
           <w:p>
@@ -3634,6 +3728,21 @@
             </w:pPr>
             <w:r>
               <w:t>与学生模块核对人数与课表，与公共模块核对账号状态</w:t>
+            </w:r>
+          </w:p>
+        </w:tc>
+        <w:tc>
+          <w:tcPr>
+            <w:tcW w:w="907" w:type="dxa"/>
+            <w:vAlign w:val="center"/>
+          </w:tcPr>
+          <w:p>
+            <w:pPr>
+              <w:pStyle w:val="TableText"/>
+              <w:jc w:val="center"/>
+            </w:pPr>
+            <w:r>
+              <w:t>20%</w:t>
             </w:r>
           </w:p>
         </w:tc>
@@ -3645,7 +3754,7 @@
         </w:trPr>
         <w:tc>
           <w:tcPr>
-            <w:tcW w:w="2120" w:type="dxa"/>
+            <w:tcW w:w="1134" w:type="dxa"/>
             <w:vAlign w:val="center"/>
           </w:tcPr>
           <w:p>
@@ -3654,16 +3763,13 @@
               <w:jc w:val="center"/>
             </w:pPr>
             <w:r>
-              <w:t>成员</w:t>
-            </w:r>
-            <w:r>
-              <w:t>4</w:t>
+              <w:t>赵科锦</w:t>
             </w:r>
           </w:p>
         </w:tc>
         <w:tc>
           <w:tcPr>
-            <w:tcW w:w="3180" w:type="dxa"/>
+            <w:tcW w:w="3628" w:type="dxa"/>
             <w:vAlign w:val="center"/>
           </w:tcPr>
           <w:p>
@@ -3677,7 +3783,7 @@
         </w:tc>
         <w:tc>
           <w:tcPr>
-            <w:tcW w:w="4337" w:type="dxa"/>
+            <w:tcW w:w="3969" w:type="dxa"/>
             <w:vAlign w:val="center"/>
           </w:tcPr>
           <w:p>
@@ -3686,6 +3792,21 @@
             </w:pPr>
             <w:r>
               <w:t>汇总数据样例，统一权限、页面样式和运行配置</w:t>
+            </w:r>
+          </w:p>
+        </w:tc>
+        <w:tc>
+          <w:tcPr>
+            <w:tcW w:w="907" w:type="dxa"/>
+            <w:vAlign w:val="center"/>
+          </w:tcPr>
+          <w:p>
+            <w:pPr>
+              <w:pStyle w:val="TableText"/>
+              <w:jc w:val="center"/>
+            </w:pPr>
+            <w:r>
+              <w:t>30%</w:t>
             </w:r>
           </w:p>
         </w:tc>

</xml_diff>